<commit_message>
Week 6 - Assignment and Report
</commit_message>
<xml_diff>
--- a/COMP607 - Portfolio.docx
+++ b/COMP607 - Portfolio.docx
@@ -590,6 +590,1486 @@
       </w:r>
     </w:p>
     <w:p>
+      <w:r>
+        <w:rPr>
+          <w:b/>
+          <w:bCs/>
+        </w:rPr>
+        <w:t>Case:</w:t>
+      </w:r>
+      <w:r>
+        <w:t xml:space="preserve"> </w:t>
+      </w:r>
+      <w:r>
+        <w:t>For this exercise I have chosen: Recentive Analytics vs Fox Corporation (2025)</w:t>
+      </w:r>
+    </w:p>
+    <w:p>
+      <w:r>
+        <w:t>This case involved machine learning algorithms used to optimize television broadcasting schedules.</w:t>
+      </w:r>
+    </w:p>
+    <w:p>
+      <w:r>
+        <w:t>Recentive argued that its patented use of machine learning was innovative. Fox challenged the patents, arguing that they covered abstract ideas rather than patentable inventions.</w:t>
+      </w:r>
+    </w:p>
+    <w:p>
+      <w:r>
+        <w:t>In April 2025, the Federal Circuit ruled in Fox's favour. The court concluded that applying conventional machine learning techniques to a particular problem was insufficient to establish patent eligibility.</w:t>
+      </w:r>
+    </w:p>
+    <w:p>
+      <w:r>
+        <w:rPr>
+          <w:b/>
+          <w:bCs/>
+        </w:rPr>
+        <w:t>Reference:</w:t>
+      </w:r>
+      <w:r>
+        <w:t xml:space="preserve"> </w:t>
+      </w:r>
+      <w:hyperlink r:id="rId8" w:history="1">
+        <w:r>
+          <w:rPr>
+            <w:rStyle w:val="Hyperlink"/>
+          </w:rPr>
+          <w:t>https://www.cafc.uscourts.gov/opinions-orders/23-2437.OPINION.4-18-2025_2500790.pdf</w:t>
+        </w:r>
+      </w:hyperlink>
+    </w:p>
+    <w:p>
+      <w:pPr>
+        <w:rPr>
+          <w:b/>
+          <w:bCs/>
+          <w:u w:val="single"/>
+        </w:rPr>
+      </w:pPr>
+    </w:p>
+    <w:p>
+      <w:pPr>
+        <w:rPr>
+          <w:b/>
+          <w:bCs/>
+        </w:rPr>
+      </w:pPr>
+      <w:r>
+        <w:rPr>
+          <w:b/>
+          <w:bCs/>
+        </w:rPr>
+        <w:t xml:space="preserve">WEEK 6 - </w:t>
+      </w:r>
+      <w:r>
+        <w:rPr>
+          <w:b/>
+          <w:bCs/>
+        </w:rPr>
+        <w:t>REPORT</w:t>
+      </w:r>
+    </w:p>
+    <w:p>
+      <w:pPr>
+        <w:rPr>
+          <w:b/>
+          <w:bCs/>
+        </w:rPr>
+      </w:pPr>
+      <w:r>
+        <w:rPr>
+          <w:b/>
+          <w:bCs/>
+        </w:rPr>
+        <w:t>COMP607 – Week 6: Software Patents</w:t>
+      </w:r>
+    </w:p>
+    <w:p>
+      <w:pPr>
+        <w:rPr>
+          <w:b/>
+          <w:bCs/>
+        </w:rPr>
+      </w:pPr>
+      <w:r>
+        <w:rPr>
+          <w:b/>
+          <w:bCs/>
+        </w:rPr>
+        <w:t>Case Study: Recentive Analytics, Inc. v. Fox Corp. (2025)</w:t>
+      </w:r>
+    </w:p>
+    <w:p>
+      <w:r>
+        <w:rPr>
+          <w:b/>
+          <w:bCs/>
+        </w:rPr>
+        <w:t>Topic: Patent Eligibility of Machine Learning Applications</w:t>
+      </w:r>
+    </w:p>
+    <w:p>
+      <w:r>
+        <w:rPr>
+          <w:b/>
+          <w:bCs/>
+        </w:rPr>
+        <w:t>Student:</w:t>
+      </w:r>
+      <w:r>
+        <w:t xml:space="preserve"> Edenilson Lopes de Meira</w:t>
+      </w:r>
+      <w:r>
+        <w:br/>
+      </w:r>
+      <w:r>
+        <w:rPr>
+          <w:b/>
+          <w:bCs/>
+        </w:rPr>
+        <w:t>Course:</w:t>
+      </w:r>
+      <w:r>
+        <w:t xml:space="preserve"> COMP607 – Ethical, Legal, and Social Issues in Information Technology</w:t>
+      </w:r>
+      <w:r>
+        <w:br/>
+      </w:r>
+      <w:r>
+        <w:rPr>
+          <w:b/>
+          <w:bCs/>
+        </w:rPr>
+        <w:t>Institution:</w:t>
+      </w:r>
+      <w:r>
+        <w:t xml:space="preserve"> Athabasca University</w:t>
+      </w:r>
+    </w:p>
+    <w:p>
+      <w:pPr>
+        <w:rPr>
+          <w:b/>
+          <w:bCs/>
+        </w:rPr>
+      </w:pPr>
+      <w:r>
+        <w:rPr>
+          <w:b/>
+          <w:bCs/>
+        </w:rPr>
+        <w:t>1. Introduction</w:t>
+      </w:r>
+    </w:p>
+    <w:p>
+      <w:r>
+        <w:t>The rapid development of artificial intelligence (AI) and machine learning (ML) has introduced significant challenges to intellectual property law, particularly concerning the patentability of software-based innovations. While patents traditionally protect inventions that introduce new technological processes, machines, or methods, determining whether an AI-based application constitutes a patentable invention remains a complex legal issue.</w:t>
+      </w:r>
+    </w:p>
+    <w:p>
+      <w:r>
+        <w:lastRenderedPageBreak/>
+        <w:t xml:space="preserve">The case of </w:t>
+      </w:r>
+      <w:r>
+        <w:rPr>
+          <w:i/>
+          <w:iCs/>
+        </w:rPr>
+        <w:t>Recentive Analytics, Inc. v. Fox Corp.</w:t>
+      </w:r>
+      <w:r>
+        <w:t xml:space="preserve"> (2025) illustrates this challenge. The dispute concerned four patents involving the application of machine learning algorithms to optimize television broadcasting schedules and network programming. Recentive Analytics argued that its patented systems introduced innovative methods for generating and dynamically updating schedules using machine learning. Fox Corporation challenged the validity of these patents, arguing that they merely applied conventional machine learning techniques to an existing scheduling problem.</w:t>
+      </w:r>
+    </w:p>
+    <w:p>
+      <w:r>
+        <w:t>On April 18, 2025, the United States Court of Appeals for the Federal Circuit affirmed a lower court's decision that Recentive's patent claims were ineligible under Section 101 of the U.S. Patent Act (Recentive Analytics, Inc. v. Fox Corp., 2025).</w:t>
+      </w:r>
+    </w:p>
+    <w:p>
+      <w:r>
+        <w:t xml:space="preserve">The case raises an important question for software engineers and AI researchers: </w:t>
+      </w:r>
+      <w:r>
+        <w:rPr>
+          <w:b/>
+          <w:bCs/>
+        </w:rPr>
+        <w:t>Should applying established machine learning algorithms to a new problem qualify as a patentable invention, or must the underlying technology itself demonstrate a meaningful improvement?</w:t>
+      </w:r>
+    </w:p>
+    <w:p>
+      <w:pPr>
+        <w:rPr>
+          <w:b/>
+          <w:bCs/>
+        </w:rPr>
+      </w:pPr>
+      <w:r>
+        <w:rPr>
+          <w:b/>
+          <w:bCs/>
+        </w:rPr>
+        <w:t>2. Background of the Dispute</w:t>
+      </w:r>
+    </w:p>
+    <w:p>
+      <w:pPr>
+        <w:rPr>
+          <w:b/>
+          <w:bCs/>
+        </w:rPr>
+      </w:pPr>
+      <w:r>
+        <w:rPr>
+          <w:b/>
+          <w:bCs/>
+        </w:rPr>
+        <w:t>2.1 Parties Involved</w:t>
+      </w:r>
+    </w:p>
+    <w:p>
+      <w:r>
+        <w:t>The plaintiff, Recentive Analytics, Inc., was the owner of four U.S. patents involving machine learning applications designed to improve scheduling and broadcasting operations.</w:t>
+      </w:r>
+    </w:p>
+    <w:p>
+      <w:r>
+        <w:t>The defendants were Fox Corporation, Fox Broadcasting Company, LLC, and Fox Sports Productions, LLC, collectively referred to as Fox.</w:t>
+      </w:r>
+    </w:p>
+    <w:p>
+      <w:r>
+        <w:t>Recentive alleged that Fox infringed its patents through the use of technologies associated with television broadcasting and scheduling operations.</w:t>
+      </w:r>
+    </w:p>
+    <w:p>
+      <w:r>
+        <w:t>Fox challenged the patent eligibility of the asserted claims under 35 U.S.C. § 101.</w:t>
+      </w:r>
+    </w:p>
+    <w:p>
+      <w:pPr>
+        <w:rPr>
+          <w:b/>
+          <w:bCs/>
+        </w:rPr>
+      </w:pPr>
+      <w:r>
+        <w:rPr>
+          <w:b/>
+          <w:bCs/>
+        </w:rPr>
+        <w:t>2.2 Patents Involved</w:t>
+      </w:r>
+    </w:p>
+    <w:p>
+      <w:r>
+        <w:t>The dispute involved four U.S. patents:</w:t>
+      </w:r>
+    </w:p>
+    <w:tbl>
+      <w:tblPr>
+        <w:tblW w:w="0" w:type="auto"/>
+        <w:tblCellSpacing w:w="15" w:type="dxa"/>
+        <w:tblCellMar>
+          <w:top w:w="15" w:type="dxa"/>
+          <w:left w:w="15" w:type="dxa"/>
+          <w:bottom w:w="15" w:type="dxa"/>
+          <w:right w:w="15" w:type="dxa"/>
+        </w:tblCellMar>
+        <w:tblLook w:val="04A0" w:firstRow="1" w:lastRow="0" w:firstColumn="1" w:lastColumn="0" w:noHBand="0" w:noVBand="1"/>
+      </w:tblPr>
+      <w:tblGrid>
+        <w:gridCol w:w="1596"/>
+        <w:gridCol w:w="5686"/>
+      </w:tblGrid>
+      <w:tr>
+        <w:trPr>
+          <w:tblHeader/>
+          <w:tblCellSpacing w:w="15" w:type="dxa"/>
+        </w:trPr>
+        <w:tc>
+          <w:tcPr>
+            <w:tcW w:w="0" w:type="auto"/>
+            <w:vAlign w:val="center"/>
+            <w:hideMark/>
+          </w:tcPr>
+          <w:p>
+            <w:pPr>
+              <w:rPr>
+                <w:b/>
+                <w:bCs/>
+              </w:rPr>
+            </w:pPr>
+            <w:r>
+              <w:rPr>
+                <w:b/>
+                <w:bCs/>
+              </w:rPr>
+              <w:t>Patent Number</w:t>
+            </w:r>
+          </w:p>
+        </w:tc>
+        <w:tc>
+          <w:tcPr>
+            <w:tcW w:w="0" w:type="auto"/>
+            <w:vAlign w:val="center"/>
+            <w:hideMark/>
+          </w:tcPr>
+          <w:p>
+            <w:pPr>
+              <w:rPr>
+                <w:b/>
+                <w:bCs/>
+              </w:rPr>
+            </w:pPr>
+            <w:r>
+              <w:rPr>
+                <w:b/>
+                <w:bCs/>
+              </w:rPr>
+              <w:t>Technology</w:t>
+            </w:r>
+          </w:p>
+        </w:tc>
+      </w:tr>
+      <w:tr>
+        <w:trPr>
+          <w:tblCellSpacing w:w="15" w:type="dxa"/>
+        </w:trPr>
+        <w:tc>
+          <w:tcPr>
+            <w:tcW w:w="0" w:type="auto"/>
+            <w:vAlign w:val="center"/>
+            <w:hideMark/>
+          </w:tcPr>
+          <w:p>
+            <w:r>
+              <w:t>US 10,911,811</w:t>
+            </w:r>
+          </w:p>
+        </w:tc>
+        <w:tc>
+          <w:tcPr>
+            <w:tcW w:w="0" w:type="auto"/>
+            <w:vAlign w:val="center"/>
+            <w:hideMark/>
+          </w:tcPr>
+          <w:p>
+            <w:r>
+              <w:t>Machine learning applications for generating network maps</w:t>
+            </w:r>
+          </w:p>
+        </w:tc>
+      </w:tr>
+      <w:tr>
+        <w:trPr>
+          <w:tblCellSpacing w:w="15" w:type="dxa"/>
+        </w:trPr>
+        <w:tc>
+          <w:tcPr>
+            <w:tcW w:w="0" w:type="auto"/>
+            <w:vAlign w:val="center"/>
+            <w:hideMark/>
+          </w:tcPr>
+          <w:p>
+            <w:r>
+              <w:t>US 10,958,957</w:t>
+            </w:r>
+          </w:p>
+        </w:tc>
+        <w:tc>
+          <w:tcPr>
+            <w:tcW w:w="0" w:type="auto"/>
+            <w:vAlign w:val="center"/>
+            <w:hideMark/>
+          </w:tcPr>
+          <w:p>
+            <w:r>
+              <w:t>Machine learning applications for generating network maps</w:t>
+            </w:r>
+          </w:p>
+        </w:tc>
+      </w:tr>
+      <w:tr>
+        <w:trPr>
+          <w:tblCellSpacing w:w="15" w:type="dxa"/>
+        </w:trPr>
+        <w:tc>
+          <w:tcPr>
+            <w:tcW w:w="0" w:type="auto"/>
+            <w:vAlign w:val="center"/>
+            <w:hideMark/>
+          </w:tcPr>
+          <w:p>
+            <w:r>
+              <w:t>US 11,386,367</w:t>
+            </w:r>
+          </w:p>
+        </w:tc>
+        <w:tc>
+          <w:tcPr>
+            <w:tcW w:w="0" w:type="auto"/>
+            <w:vAlign w:val="center"/>
+            <w:hideMark/>
+          </w:tcPr>
+          <w:p>
+            <w:r>
+              <w:t>Machine learning methods for determining event schedules</w:t>
+            </w:r>
+          </w:p>
+        </w:tc>
+      </w:tr>
+      <w:tr>
+        <w:trPr>
+          <w:tblCellSpacing w:w="15" w:type="dxa"/>
+        </w:trPr>
+        <w:tc>
+          <w:tcPr>
+            <w:tcW w:w="0" w:type="auto"/>
+            <w:vAlign w:val="center"/>
+            <w:hideMark/>
+          </w:tcPr>
+          <w:p>
+            <w:r>
+              <w:t>US 11,537,960</w:t>
+            </w:r>
+          </w:p>
+        </w:tc>
+        <w:tc>
+          <w:tcPr>
+            <w:tcW w:w="0" w:type="auto"/>
+            <w:vAlign w:val="center"/>
+            <w:hideMark/>
+          </w:tcPr>
+          <w:p>
+            <w:r>
+              <w:t>Machine learning methods for determining event schedules</w:t>
+            </w:r>
+          </w:p>
+        </w:tc>
+      </w:tr>
+    </w:tbl>
+    <w:p>
+      <w:r>
+        <w:t>The patents were organized into two categories.</w:t>
+      </w:r>
+    </w:p>
+    <w:p>
+      <w:r>
+        <w:rPr>
+          <w:b/>
+          <w:bCs/>
+        </w:rPr>
+        <w:t>Machine Learning Training Patents</w:t>
+      </w:r>
+    </w:p>
+    <w:p>
+      <w:r>
+        <w:t>These patents concerned systems capable of generating optimized event schedules using machine learning models.</w:t>
+      </w:r>
+    </w:p>
+    <w:p>
+      <w:r>
+        <w:lastRenderedPageBreak/>
+        <w:t>The proposed methods involved collecting event-related information, identifying relationships within the data, generating schedules, and updating those schedules when conditions changed.</w:t>
+      </w:r>
+    </w:p>
+    <w:p>
+      <w:r>
+        <w:rPr>
+          <w:b/>
+          <w:bCs/>
+        </w:rPr>
+        <w:t>Network Map Patents</w:t>
+      </w:r>
+    </w:p>
+    <w:p>
+      <w:r>
+        <w:t>These patents concerned generating network maps used by broadcasters to determine which programming should appear on particular channels, in specific geographic regions, and at designated times.</w:t>
+      </w:r>
+    </w:p>
+    <w:p>
+      <w:r>
+        <w:t>The systems employed machine learning to generate and update network configurations according to changing conditions.</w:t>
+      </w:r>
+    </w:p>
+    <w:p>
+      <w:r>
+        <w:t>Although these applications addressed practical broadcasting challenges, the central legal question was whether their technical implementations represented patent-eligible inventions.</w:t>
+      </w:r>
+    </w:p>
+    <w:p>
+      <w:r>
+        <w:t>The Federal Circuit examined these patents as two related groups because they shared similar approaches to applying machine learning to scheduling and network optimization problems (Recentive Analytics, Inc. v. Fox Corp., 2025). (</w:t>
+      </w:r>
+      <w:hyperlink r:id="rId9" w:tooltip="Case: 23-2437  Document: 51  Page: 2  Filed: 04/18/2025" w:history="1">
+        <w:r>
+          <w:rPr>
+            <w:rStyle w:val="Hyperlink"/>
+          </w:rPr>
+          <w:t>Federal Circui</w:t>
+        </w:r>
+        <w:r>
+          <w:rPr>
+            <w:rStyle w:val="Hyperlink"/>
+          </w:rPr>
+          <w:t>t</w:t>
+        </w:r>
+        <w:r>
+          <w:rPr>
+            <w:rStyle w:val="Hyperlink"/>
+          </w:rPr>
+          <w:t xml:space="preserve"> Court</w:t>
+        </w:r>
+      </w:hyperlink>
+      <w:r>
+        <w:t>)</w:t>
+      </w:r>
+    </w:p>
+    <w:p>
+      <w:pPr>
+        <w:rPr>
+          <w:b/>
+          <w:bCs/>
+        </w:rPr>
+      </w:pPr>
+      <w:r>
+        <w:rPr>
+          <w:b/>
+          <w:bCs/>
+        </w:rPr>
+        <w:t>3. Technical Analysis</w:t>
+      </w:r>
+    </w:p>
+    <w:p>
+      <w:r>
+        <w:t>From a software engineering perspective, the technologies described in Recentive's patents involved familiar concepts in machine learning and optimization.</w:t>
+      </w:r>
+    </w:p>
+    <w:p>
+      <w:r>
+        <w:t>A typical machine learning scheduling system can be represented by four primary operations:</w:t>
+      </w:r>
+    </w:p>
+    <w:p>
+      <w:pPr>
+        <w:numPr>
+          <w:ilvl w:val="0"/>
+          <w:numId w:val="14"/>
+        </w:numPr>
+      </w:pPr>
+      <w:r>
+        <w:rPr>
+          <w:b/>
+          <w:bCs/>
+        </w:rPr>
+        <w:t>Data collection:</w:t>
+      </w:r>
+      <w:r>
+        <w:t xml:space="preserve"> Gather historical scheduling information, event characteristics, operational constraints, and other relevant variables.</w:t>
+      </w:r>
+    </w:p>
+    <w:p>
+      <w:pPr>
+        <w:numPr>
+          <w:ilvl w:val="0"/>
+          <w:numId w:val="14"/>
+        </w:numPr>
+      </w:pPr>
+      <w:r>
+        <w:rPr>
+          <w:b/>
+          <w:bCs/>
+        </w:rPr>
+        <w:t>Model training:</w:t>
+      </w:r>
+      <w:r>
+        <w:t xml:space="preserve"> Apply machine learning algorithms to identify patterns and relationships within the collected data.</w:t>
+      </w:r>
+    </w:p>
+    <w:p>
+      <w:pPr>
+        <w:numPr>
+          <w:ilvl w:val="0"/>
+          <w:numId w:val="14"/>
+        </w:numPr>
+      </w:pPr>
+      <w:r>
+        <w:rPr>
+          <w:b/>
+          <w:bCs/>
+        </w:rPr>
+        <w:t>Schedule optimization:</w:t>
+      </w:r>
+      <w:r>
+        <w:t xml:space="preserve"> Generate schedules based on the model's predictions and specified constraints.</w:t>
+      </w:r>
+    </w:p>
+    <w:p>
+      <w:pPr>
+        <w:numPr>
+          <w:ilvl w:val="0"/>
+          <w:numId w:val="14"/>
+        </w:numPr>
+      </w:pPr>
+      <w:r>
+        <w:rPr>
+          <w:b/>
+          <w:bCs/>
+        </w:rPr>
+        <w:t>Dynamic updates:</w:t>
+      </w:r>
+      <w:r>
+        <w:t xml:space="preserve"> Recalculate schedules when new information becomes available or operating conditions change.</w:t>
+      </w:r>
+    </w:p>
+    <w:p>
+      <w:r>
+        <w:t>For example, consider a broadcasting company responsible for scheduling multiple sporting events across different television networks.</w:t>
+      </w:r>
+    </w:p>
+    <w:p>
+      <w:r>
+        <w:t>The company must consider event durations, geographic broadcasting restrictions, available channels, and potentially competing programming requirements.</w:t>
+      </w:r>
+    </w:p>
+    <w:p>
+      <w:r>
+        <w:t>A machine learning system could analyze these variables and recommend an optimized broadcasting schedule.</w:t>
+      </w:r>
+    </w:p>
+    <w:p>
+      <w:r>
+        <w:t>When an event is delayed or another scheduling constraint changes, the system could update its recommendations automatically.</w:t>
+      </w:r>
+    </w:p>
+    <w:p>
+      <w:r>
+        <w:t>Such functionality can offer substantial operational advantages over manually generated schedules.</w:t>
+      </w:r>
+    </w:p>
+    <w:p>
+      <w:r>
+        <w:lastRenderedPageBreak/>
+        <w:t>However, an important distinction exists between the usefulness of a software application and its eligibility for patent protection.</w:t>
+      </w:r>
+    </w:p>
+    <w:p>
+      <w:r>
+        <w:t>A system may produce valuable results without introducing a new machine learning algorithm, training technique, or technological improvement.</w:t>
+      </w:r>
+    </w:p>
+    <w:p>
+      <w:r>
+        <w:t>In this dispute, the court found that the asserted patent claims relied on generic machine learning techniques rather than disclosing a qualifying improvement to the underlying technology.</w:t>
+      </w:r>
+    </w:p>
+    <w:p>
+      <w:r>
+        <w:t>This distinction became central to the legal arguments presented by both parties.</w:t>
+      </w:r>
+    </w:p>
+    <w:p>
+      <w:pPr>
+        <w:rPr>
+          <w:b/>
+          <w:bCs/>
+        </w:rPr>
+      </w:pPr>
+      <w:r>
+        <w:rPr>
+          <w:b/>
+          <w:bCs/>
+        </w:rPr>
+        <w:t>4. Legal Issues and Arguments</w:t>
+      </w:r>
+    </w:p>
+    <w:p>
+      <w:pPr>
+        <w:rPr>
+          <w:b/>
+          <w:bCs/>
+        </w:rPr>
+      </w:pPr>
+      <w:r>
+        <w:rPr>
+          <w:b/>
+          <w:bCs/>
+        </w:rPr>
+        <w:t>4.1 Applicable Patent Law</w:t>
+      </w:r>
+    </w:p>
+    <w:p>
+      <w:r>
+        <w:t xml:space="preserve">The principal legal issue involved </w:t>
+      </w:r>
+      <w:r>
+        <w:rPr>
+          <w:b/>
+          <w:bCs/>
+        </w:rPr>
+        <w:t>35 U.S.C. § 101</w:t>
+      </w:r>
+      <w:r>
+        <w:t>, which establishes categories of patent-eligible subject matter in the United States.</w:t>
+      </w:r>
+    </w:p>
+    <w:p>
+      <w:r>
+        <w:t>Although the statute broadly recognizes processes, machines, manufactures, and compositions of matter as potentially patentable, U.S. courts have established exceptions for abstract ideas, laws of nature, and natural phenomena.</w:t>
+      </w:r>
+    </w:p>
+    <w:p>
+      <w:r>
+        <w:t>Software patents frequently encounter challenges under the abstract-idea exception because computer programs may implement mathematical operations or conventional business processes.</w:t>
+      </w:r>
+    </w:p>
+    <w:p>
+      <w:r>
+        <w:t xml:space="preserve">The Supreme Court's decision in </w:t>
+      </w:r>
+      <w:r>
+        <w:rPr>
+          <w:i/>
+          <w:iCs/>
+        </w:rPr>
+        <w:t>Alice Corp. v. CLS Bank International</w:t>
+      </w:r>
+      <w:r>
+        <w:t xml:space="preserve"> (2014) established a two-step framework for evaluating patent eligibility.</w:t>
+      </w:r>
+    </w:p>
+    <w:p>
+      <w:r>
+        <w:rPr>
+          <w:b/>
+          <w:bCs/>
+        </w:rPr>
+        <w:t>Step One: Determine whether the patent claims are directed to a patent-ineligible concept.</w:t>
+      </w:r>
+    </w:p>
+    <w:p>
+      <w:r>
+        <w:t>If the claims concern an abstract idea, the analysis proceeds to the second step.</w:t>
+      </w:r>
+    </w:p>
+    <w:p>
+      <w:r>
+        <w:rPr>
+          <w:b/>
+          <w:bCs/>
+        </w:rPr>
+        <w:t>Step Two: Determine whether the claims contain an inventive concept sufficient to transform the abstract idea into a patent-eligible application.</w:t>
+      </w:r>
+    </w:p>
+    <w:p>
+      <w:r>
+        <w:t>Merely implementing an abstract idea using conventional computer technology is generally insufficient.</w:t>
+      </w:r>
+    </w:p>
+    <w:p>
+      <w:r>
+        <w:t>This framework was central to the Federal Circuit's evaluation of Recentive's patents.</w:t>
+      </w:r>
+    </w:p>
+    <w:p>
+      <w:pPr>
+        <w:rPr>
+          <w:b/>
+          <w:bCs/>
+        </w:rPr>
+      </w:pPr>
+      <w:r>
+        <w:rPr>
+          <w:b/>
+          <w:bCs/>
+        </w:rPr>
+        <w:t>4.2 Recentive Analytics' Position</w:t>
+      </w:r>
+    </w:p>
+    <w:p>
+      <w:r>
+        <w:t>Recentive argued that its patents represented innovative applications of machine learning capable of solving practical scheduling problems.</w:t>
+      </w:r>
+    </w:p>
+    <w:p>
+      <w:r>
+        <w:t>Its arguments emphasized that the claimed systems could dynamically generate optimized schedules and network maps using continuously updated information.</w:t>
+      </w:r>
+    </w:p>
+    <w:p>
+      <w:r>
+        <w:t>Recentive maintained that applying machine learning to these particular environments provided technological and operational benefits beyond conventional scheduling approaches.</w:t>
+      </w:r>
+    </w:p>
+    <w:p>
+      <w:r>
+        <w:lastRenderedPageBreak/>
+        <w:t>The company also argued that the lower court had improperly dismissed its claims without allowing sufficient opportunity to establish the inventive nature of the patented systems.</w:t>
+      </w:r>
+    </w:p>
+    <w:p>
+      <w:r>
+        <w:t>From Recentive's perspective, the fact that machine learning techniques were already known did not necessarily mean that their application to a new technical problem lacked patentable innovation.</w:t>
+      </w:r>
+    </w:p>
+    <w:p>
+      <w:r>
+        <w:t>This position raises a broader question about whether innovation should be evaluated primarily through improvements to underlying algorithms or through novel and useful applications of existing technologies.</w:t>
+      </w:r>
+    </w:p>
+    <w:p>
+      <w:pPr>
+        <w:rPr>
+          <w:b/>
+          <w:bCs/>
+        </w:rPr>
+      </w:pPr>
+      <w:r>
+        <w:rPr>
+          <w:b/>
+          <w:bCs/>
+        </w:rPr>
+        <w:t>4.3 Fox Corporation's Position</w:t>
+      </w:r>
+    </w:p>
+    <w:p>
+      <w:r>
+        <w:t>Fox argued that Recentive's patents were directed to abstract ideas implemented using conventional machine learning techniques.</w:t>
+      </w:r>
+    </w:p>
+    <w:p>
+      <w:r>
+        <w:t>According to this position, generating schedules and network maps involved established organizational and mathematical processes.</w:t>
+      </w:r>
+    </w:p>
+    <w:p>
+      <w:r>
+        <w:t>Using machine learning to automate these processes did not necessarily transform them into patent-eligible inventions.</w:t>
+      </w:r>
+    </w:p>
+    <w:p>
+      <w:r>
+        <w:t>Fox maintained that the patent claims failed to identify a specific technological improvement to machine learning itself or to computer functionality.</w:t>
+      </w:r>
+    </w:p>
+    <w:p>
+      <w:r>
+        <w:t>Instead, they described the use of generic computational techniques to achieve desirable scheduling outcomes.</w:t>
+      </w:r>
+    </w:p>
+    <w:p>
+      <w:r>
+        <w:t xml:space="preserve">Fox therefore argued that the patents failed both steps of the </w:t>
+      </w:r>
+      <w:r>
+        <w:rPr>
+          <w:i/>
+          <w:iCs/>
+        </w:rPr>
+        <w:t>Alice</w:t>
+      </w:r>
+      <w:r>
+        <w:t xml:space="preserve"> framework.</w:t>
+      </w:r>
+    </w:p>
+    <w:p>
+      <w:r>
+        <w:t>The Federal Circuit ultimately agreed that the asserted claims did not contain the necessary inventive concept to qualify for patent protection (Recentive Analytics, Inc. v. Fox Corp., 2025).</w:t>
+      </w:r>
+    </w:p>
+    <w:p>
+      <w:pPr>
+        <w:rPr>
+          <w:b/>
+          <w:bCs/>
+        </w:rPr>
+      </w:pPr>
+      <w:r>
+        <w:rPr>
+          <w:b/>
+          <w:bCs/>
+        </w:rPr>
+        <w:t>5. Court Decision and Legal Reasoning</w:t>
+      </w:r>
+    </w:p>
+    <w:p>
+      <w:pPr>
+        <w:rPr>
+          <w:b/>
+          <w:bCs/>
+        </w:rPr>
+      </w:pPr>
+      <w:r>
+        <w:rPr>
+          <w:b/>
+          <w:bCs/>
+        </w:rPr>
+        <w:t>5.1 District Court Decision</w:t>
+      </w:r>
+    </w:p>
+    <w:p>
+      <w:r>
+        <w:t>The United States District Court for the District of Delaware dismissed Recentive's infringement action after determining that the asserted patent claims were ineligible under Section 101.</w:t>
+      </w:r>
+    </w:p>
+    <w:p>
+      <w:r>
+        <w:t>The court concluded that the patents were directed to the abstract ideas of producing event schedules and network maps using known mathematical and computational techniques.</w:t>
+      </w:r>
+    </w:p>
+    <w:p>
+      <w:r>
+        <w:t xml:space="preserve">Furthermore, the court determined that the claimed machine learning implementations did not introduce an inventive concept sufficient to satisfy the second step of the </w:t>
+      </w:r>
+      <w:r>
+        <w:rPr>
+          <w:i/>
+          <w:iCs/>
+        </w:rPr>
+        <w:t>Alice</w:t>
+      </w:r>
+      <w:r>
+        <w:t xml:space="preserve"> framework.</w:t>
+      </w:r>
+    </w:p>
+    <w:p>
+      <w:r>
+        <w:t>Recentive appealed the decision.</w:t>
+      </w:r>
+    </w:p>
+    <w:p>
+      <w:pPr>
+        <w:rPr>
+          <w:b/>
+          <w:bCs/>
+        </w:rPr>
+      </w:pPr>
+      <w:r>
+        <w:rPr>
+          <w:b/>
+          <w:bCs/>
+        </w:rPr>
+        <w:t>5.2 Federal Circuit Decision</w:t>
+      </w:r>
+    </w:p>
+    <w:p>
+      <w:r>
+        <w:t>On April 18, 2025, the United States Court of Appeals for the Federal Circuit affirmed the district court's ruling.</w:t>
+      </w:r>
+    </w:p>
+    <w:p>
+      <w:r>
+        <w:lastRenderedPageBreak/>
+        <w:t>The appellate court concluded that applying generic machine learning techniques to a new data environment did not automatically create patent-eligible subject matter.</w:t>
+      </w:r>
+    </w:p>
+    <w:p>
+      <w:r>
+        <w:t>The court emphasized that the patent claims did not disclose specific improvements to the machine learning models themselves.</w:t>
+      </w:r>
+    </w:p>
+    <w:p>
+      <w:r>
+        <w:t>Although the systems generated optimized schedules and dynamically updated their outputs, these capabilities were not sufficient to establish patent eligibility.</w:t>
+      </w:r>
+    </w:p>
+    <w:p>
+      <w:r>
+        <w:t>The decision did not establish that machine learning inventions are categorically unpatentable.</w:t>
+      </w:r>
+    </w:p>
+    <w:p>
+      <w:r>
+        <w:t>Instead, the court distinguished between inventions that improve technological functionality and claims that merely apply existing computational techniques to particular problems.</w:t>
+      </w:r>
+    </w:p>
+    <w:p>
+      <w:r>
+        <w:t>The Federal Circuit also rejected Recentive's argument that it should have been allowed to amend its complaint, concluding that Recentive had not identified proposed amendments or factual issues that would change the patent-eligibility analysis.</w:t>
+      </w:r>
+    </w:p>
+    <w:p>
+      <w:r>
+        <w:t>The decision was therefore affirmed.</w:t>
+      </w:r>
+    </w:p>
+    <w:p>
+      <w:pPr>
+        <w:rPr>
+          <w:b/>
+          <w:bCs/>
+        </w:rPr>
+      </w:pPr>
+      <w:r>
+        <w:rPr>
+          <w:b/>
+          <w:bCs/>
+        </w:rPr>
+        <w:t>5.3 Subsequent Supreme Court Proceedings</w:t>
+      </w:r>
+    </w:p>
+    <w:p>
+      <w:r>
+        <w:t>Following the Federal Circuit decision, Recentive sought further review.</w:t>
+      </w:r>
+    </w:p>
+    <w:p>
+      <w:r>
+        <w:t>The company petitioned the United States Supreme Court, arguing that the Federal Circuit's approach could impose excessive restrictions on patent protection for machine learning innovations.</w:t>
+      </w:r>
+    </w:p>
+    <w:p>
+      <w:r>
+        <w:t>On December 8, 2025, the Supreme Court denied Recentive's petition for a writ of certiorari.</w:t>
+      </w:r>
+    </w:p>
+    <w:p>
+      <w:r>
+        <w:t>Consequently, the Federal Circuit's judgment remained in effect.</w:t>
+      </w:r>
+    </w:p>
+    <w:p>
+      <w:r>
+        <w:t>Importantly, denial of certiorari does not constitute an endorsement of the lower court's legal reasoning. It means that the Supreme Court declined to review the case. (</w:t>
+      </w:r>
+      <w:hyperlink r:id="rId10" w:tooltip="Docket for 25-505" w:history="1">
+        <w:r>
+          <w:rPr>
+            <w:rStyle w:val="Hyperlink"/>
+          </w:rPr>
+          <w:t>Supreme</w:t>
+        </w:r>
+        <w:r>
+          <w:rPr>
+            <w:rStyle w:val="Hyperlink"/>
+          </w:rPr>
+          <w:t xml:space="preserve"> </w:t>
+        </w:r>
+        <w:r>
+          <w:rPr>
+            <w:rStyle w:val="Hyperlink"/>
+          </w:rPr>
+          <w:t>Court</w:t>
+        </w:r>
+      </w:hyperlink>
+      <w:r>
+        <w:t>)</w:t>
+      </w:r>
+    </w:p>
+    <w:p>
+      <w:pPr>
+        <w:rPr>
+          <w:b/>
+          <w:bCs/>
+        </w:rPr>
+      </w:pPr>
+      <w:r>
+        <w:rPr>
+          <w:b/>
+          <w:bCs/>
+        </w:rPr>
+        <w:t>6. Ethical, Technical, and Economic Implications</w:t>
+      </w:r>
+    </w:p>
+    <w:p>
+      <w:pPr>
+        <w:rPr>
+          <w:b/>
+          <w:bCs/>
+        </w:rPr>
+      </w:pPr>
+      <w:r>
+        <w:rPr>
+          <w:b/>
+          <w:bCs/>
+        </w:rPr>
+        <w:t>6.1 Implications for Artificial Intelligence Innovation</w:t>
+      </w:r>
+    </w:p>
+    <w:p>
+      <w:r>
+        <w:t>The decision has important implications for organizations developing AI-based software.</w:t>
+      </w:r>
+    </w:p>
+    <w:p>
+      <w:r>
+        <w:t>Many contemporary AI applications rely on established machine learning algorithms, including neural networks, decision trees, and other statistical learning methods.</w:t>
+      </w:r>
+    </w:p>
+    <w:p>
+      <w:r>
+        <w:t>Innovation frequently occurs through the application of these techniques to previously unexplored problems rather than through the invention of entirely new algorithms.</w:t>
+      </w:r>
+    </w:p>
+    <w:p>
+      <w:r>
+        <w:t>For example, a software engineer might apply an existing neural network architecture to optimize satellite operations, detect equipment failures, or improve energy consumption.</w:t>
+      </w:r>
+    </w:p>
+    <w:p>
+      <w:r>
+        <w:t>These applications may provide substantial commercial and technical value.</w:t>
+      </w:r>
+    </w:p>
+    <w:p>
+      <w:r>
+        <w:lastRenderedPageBreak/>
+        <w:t>However, the Recentive decision demonstrates that practical usefulness alone does not establish patent eligibility under U.S. law.</w:t>
+      </w:r>
+    </w:p>
+    <w:p>
+      <w:r>
+        <w:t>Patent applicants must carefully distinguish the claimed technological invention from the abstract computational concepts underlying it.</w:t>
+      </w:r>
+    </w:p>
+    <w:p>
+      <w:pPr>
+        <w:rPr>
+          <w:b/>
+          <w:bCs/>
+        </w:rPr>
+      </w:pPr>
+      <w:r>
+        <w:rPr>
+          <w:b/>
+          <w:bCs/>
+        </w:rPr>
+        <w:t>6.2 Ethical Considerations</w:t>
+      </w:r>
+    </w:p>
+    <w:p>
+      <w:r>
+        <w:t>From an ethical perspective, software patents create a tension between protecting innovation and preserving access to fundamental computational techniques.</w:t>
+      </w:r>
+    </w:p>
+    <w:p>
+      <w:r>
+        <w:t>Patent protection can encourage research and development by allowing inventors to obtain exclusive rights to qualifying inventions for a limited period.</w:t>
+      </w:r>
+    </w:p>
+    <w:p>
+      <w:r>
+        <w:t>However, overly broad patents may restrict competition by preventing other developers from implementing conventional algorithms in particular industries.</w:t>
+      </w:r>
+    </w:p>
+    <w:p>
+      <w:r>
+        <w:t>For instance, granting exclusive rights over the general application of machine learning to scheduling could potentially limit the ability of other organizations to develop similar optimization systems.</w:t>
+      </w:r>
+    </w:p>
+    <w:p>
+      <w:r>
+        <w:t>Conversely, denying patent protection to genuinely innovative applications could reduce incentives for organizations to invest in specialized AI development.</w:t>
+      </w:r>
+    </w:p>
+    <w:p>
+      <w:r>
+        <w:t>The ethical challenge involves determining where legitimate intellectual property protection ends and unjustified restrictions on technological development begin.</w:t>
+      </w:r>
+    </w:p>
+    <w:p>
+      <w:pPr>
+        <w:rPr>
+          <w:b/>
+          <w:bCs/>
+        </w:rPr>
+      </w:pPr>
+      <w:r>
+        <w:rPr>
+          <w:b/>
+          <w:bCs/>
+        </w:rPr>
+        <w:t>6.3 Economic Implications</w:t>
+      </w:r>
+    </w:p>
+    <w:p>
+      <w:r>
+        <w:t>Software patents can represent valuable commercial assets, particularly for organizations investing substantial resources in research and development.</w:t>
+      </w:r>
+    </w:p>
+    <w:p>
+      <w:r>
+        <w:t>Patent protection may support licensing arrangements, investment opportunities, and competitive differentiation.</w:t>
+      </w:r>
+    </w:p>
+    <w:p>
+      <w:r>
+        <w:t>Nevertheless, patent disputes also introduce litigation expenses, legal uncertainty, and potential barriers to market entry.</w:t>
+      </w:r>
+    </w:p>
+    <w:p>
+      <w:r>
+        <w:t>The Recentive decision may encourage AI developers to place greater emphasis on documenting specific technological improvements rather than relying exclusively on descriptions of improved business outcomes.</w:t>
+      </w:r>
+    </w:p>
+    <w:p>
+      <w:r>
+        <w:t>It may also influence decisions about whether innovations should be protected through patents, trade secrets, contractual agreements, or other intellectual property mechanisms.</w:t>
+      </w:r>
+    </w:p>
+    <w:p>
+      <w:pPr>
+        <w:rPr>
+          <w:b/>
+          <w:bCs/>
+        </w:rPr>
+      </w:pPr>
+      <w:r>
+        <w:rPr>
+          <w:b/>
+          <w:bCs/>
+        </w:rPr>
+        <w:t>7. Personal Assessment</w:t>
+      </w:r>
+    </w:p>
+    <w:p>
+      <w:r>
+        <w:t>In my opinion, the Federal Circuit reached a reasonable conclusion based on the patent claims presented in this case.</w:t>
+      </w:r>
+    </w:p>
+    <w:p>
+      <w:r>
+        <w:t>As a software engineer, I recognize that applying existing algorithms to new problems can require considerable technical expertise, experimentation, and creativity.</w:t>
+      </w:r>
+    </w:p>
+    <w:p>
+      <w:r>
+        <w:lastRenderedPageBreak/>
+        <w:t>Developing a machine learning application involves much more than simply selecting an algorithm. Engineers must consider data preparation, model selection, computational efficiency, system integration, testing, and operational constraints.</w:t>
+      </w:r>
+    </w:p>
+    <w:p>
+      <w:r>
+        <w:t>However, I believe there is an important distinction between developing a sophisticated software application and inventing a patentable technological process.</w:t>
+      </w:r>
+    </w:p>
+    <w:p>
+      <w:r>
+        <w:t>If patent protection were granted simply because an established machine learning technique was applied to a different industry, companies could potentially obtain overly broad rights over common computational methods.</w:t>
+      </w:r>
+    </w:p>
+    <w:p>
+      <w:r>
+        <w:t>For example, applying a conventional neural network to satellite scheduling, financial forecasting, or transportation optimization should not automatically provide exclusive rights over those applications.</w:t>
+      </w:r>
+    </w:p>
+    <w:p>
+      <w:r>
+        <w:t>Otherwise, software patents could become obstacles to innovation rather than mechanisms for encouraging it.</w:t>
+      </w:r>
+    </w:p>
+    <w:p>
+      <w:r>
+        <w:t>At the same time, I would not argue that patent eligibility should depend exclusively on inventing new machine learning algorithms.</w:t>
+      </w:r>
+    </w:p>
+    <w:p>
+      <w:r>
+        <w:t>A genuinely novel technical architecture, training mechanism, data-processing method, or system-level improvement could represent a meaningful invention even when it incorporates established algorithms.</w:t>
+      </w:r>
+    </w:p>
+    <w:p>
+      <w:r>
+        <w:t>Therefore, the appropriate distinction should be based on whether the claimed invention provides a specific, technically substantiated improvement rather than merely describing a desirable outcome.</w:t>
+      </w:r>
+    </w:p>
+    <w:p>
+      <w:r>
+        <w:t xml:space="preserve">One aspect of this case that I find particularly important is the relationship between </w:t>
+      </w:r>
+      <w:r>
+        <w:rPr>
+          <w:b/>
+          <w:bCs/>
+        </w:rPr>
+        <w:t>technical innovation and legal interpretation</w:t>
+      </w:r>
+      <w:r>
+        <w:t>.</w:t>
+      </w:r>
+    </w:p>
+    <w:p>
+      <w:r>
+        <w:t>An engineering solution may be innovative from a practical perspective without satisfying the legal requirements for patent protection.</w:t>
+      </w:r>
+    </w:p>
+    <w:p>
+      <w:r>
+        <w:t>This distinction highlights the importance of understanding intellectual property law during software design and development.</w:t>
+      </w:r>
+    </w:p>
+    <w:p>
+      <w:r>
+        <w:t>Overall, I agree with the Federal Circuit's decision concerning Recentive's specific patent claims. However, I also believe that patent law must continue evolving to recognize legitimate technological innovations involving artificial intelligence.</w:t>
+      </w:r>
+    </w:p>
+    <w:p>
+      <w:r>
+        <w:t>A balanced legal framework should protect genuinely inventive implementations without allowing organizations to monopolize established mathematical techniques or general computational concepts.</w:t>
+      </w:r>
+    </w:p>
+    <w:p>
+      <w:pPr>
+        <w:rPr>
+          <w:b/>
+          <w:bCs/>
+        </w:rPr>
+      </w:pPr>
+      <w:r>
+        <w:rPr>
+          <w:b/>
+          <w:bCs/>
+        </w:rPr>
+        <w:t>8. Conclusion</w:t>
+      </w:r>
+    </w:p>
+    <w:p>
+      <w:r>
+        <w:rPr>
+          <w:i/>
+          <w:iCs/>
+        </w:rPr>
+        <w:t>Recentive Analytics, Inc. v. Fox Corp.</w:t>
+      </w:r>
+      <w:r>
+        <w:t xml:space="preserve"> (2025) represents an important decision concerning the patent eligibility of machine learning applications.</w:t>
+      </w:r>
+    </w:p>
+    <w:p>
+      <w:r>
+        <w:lastRenderedPageBreak/>
+        <w:t>The dispute illustrates the legal challenges associated with distinguishing technological inventions from conventional computational techniques applied to new environments.</w:t>
+      </w:r>
+    </w:p>
+    <w:p>
+      <w:r>
+        <w:t>The Federal Circuit concluded that Recentive's patents did not satisfy the requirements of 35 U.S.C. § 101 because they relied on generic machine learning techniques without identifying a qualifying inventive concept.</w:t>
+      </w:r>
+    </w:p>
+    <w:p>
+      <w:r>
+        <w:t>The subsequent denial of Supreme Court review left the Federal Circuit's judgment in place.</w:t>
+      </w:r>
+    </w:p>
+    <w:p>
+      <w:r>
+        <w:t>For software engineers and AI researchers, the case emphasizes the importance of identifying and documenting specific technological contributions when developing patentable innovations.</w:t>
+      </w:r>
+    </w:p>
+    <w:p>
+      <w:r>
+        <w:t>More broadly, it demonstrates the continuing need to balance intellectual property protection with competition, accessibility, and technological progress.</w:t>
+      </w:r>
+    </w:p>
+    <w:p>
+      <w:r>
+        <w:t>As artificial intelligence becomes increasingly integrated into commercial and industrial systems, disputes of this nature will likely continue influencing how patent law distinguishes genuine technological inventions from applications of established computational methods.</w:t>
+      </w:r>
+    </w:p>
+    <w:p>
+      <w:pPr>
+        <w:rPr>
+          <w:b/>
+          <w:bCs/>
+        </w:rPr>
+      </w:pPr>
+      <w:r>
+        <w:rPr>
+          <w:b/>
+          <w:bCs/>
+        </w:rPr>
+        <w:t>9. References (APA 7th Edition)</w:t>
+      </w:r>
+    </w:p>
+    <w:p>
+      <w:r>
+        <w:rPr>
+          <w:i/>
+          <w:iCs/>
+        </w:rPr>
+        <w:t>Alice Corp. Pty. Ltd. v. CLS Bank International</w:t>
+      </w:r>
+      <w:r>
+        <w:t>, 573 U.S. 208 (2014).</w:t>
+      </w:r>
+    </w:p>
+    <w:p>
+      <w:r>
+        <w:rPr>
+          <w:i/>
+          <w:iCs/>
+        </w:rPr>
+        <w:t>Recentive Analytics, Inc. v. Fox Corp.</w:t>
+      </w:r>
+      <w:r>
+        <w:t>, 692 F. Supp. 3d 438 (D. Del. 2023).</w:t>
+      </w:r>
+    </w:p>
+    <w:p>
+      <w:r>
+        <w:rPr>
+          <w:i/>
+          <w:iCs/>
+        </w:rPr>
+        <w:t>Recentive Analytics, Inc. v. Fox Corp.</w:t>
+      </w:r>
+      <w:r>
+        <w:t>, No. 2023-2437 (Fed. Cir. Apr. 18, 2025).</w:t>
+      </w:r>
+    </w:p>
+    <w:p>
+      <w:r>
+        <w:t xml:space="preserve">United States Court of Appeals for the Federal Circuit. (2025, April 18). </w:t>
+      </w:r>
+      <w:r>
+        <w:rPr>
+          <w:i/>
+          <w:iCs/>
+        </w:rPr>
+        <w:t>Recentive Analytics, Inc. v. Fox Corp., No. 2023-2437</w:t>
+      </w:r>
+      <w:r>
+        <w:t xml:space="preserve"> [Court opinion]. </w:t>
+      </w:r>
+      <w:hyperlink r:id="rId11" w:history="1">
+        <w:r>
+          <w:rPr>
+            <w:rStyle w:val="Hyperlink"/>
+          </w:rPr>
+          <w:t xml:space="preserve">Official court </w:t>
+        </w:r>
+        <w:r>
+          <w:rPr>
+            <w:rStyle w:val="Hyperlink"/>
+          </w:rPr>
+          <w:t>d</w:t>
+        </w:r>
+        <w:r>
+          <w:rPr>
+            <w:rStyle w:val="Hyperlink"/>
+          </w:rPr>
+          <w:t>e</w:t>
+        </w:r>
+        <w:r>
+          <w:rPr>
+            <w:rStyle w:val="Hyperlink"/>
+          </w:rPr>
+          <w:t>c</w:t>
+        </w:r>
+        <w:r>
+          <w:rPr>
+            <w:rStyle w:val="Hyperlink"/>
+          </w:rPr>
+          <w:t>ision (PDF)</w:t>
+        </w:r>
+      </w:hyperlink>
+    </w:p>
+    <w:p>
       <w:pPr>
         <w:pStyle w:val="Heading2"/>
       </w:pPr>
@@ -606,6 +2086,7 @@
         <w:t>sk</w:t>
       </w:r>
     </w:p>
+    <w:p/>
     <w:p>
       <w:pPr>
         <w:pStyle w:val="Heading1"/>
@@ -665,7 +2146,17 @@
           <w:sz w:val="22"/>
           <w:szCs w:val="22"/>
         </w:rPr>
-        <w:t>One principle that guides many of my decisions is responsibility. As a software professional, I believe that being technically capable of doing something does not automatically mean that I should do it. For example, someone with administrative privileges may technically have access to information belonging to other users, but that access should only be exercised when it is necessary for a legitimate purpose. The same principle applies to software development. A system should not simply work; I also have a responsibility to consider security, privacy, reliability, maintainability, and the consequences of failure. This becomes increasingly important when working with artificial intelligence because an algorithm can make decisions or recommendations at a scale that an individual person cannot.</w:t>
+        <w:t xml:space="preserve">One principle that guides many of my decisions is responsibility. As a software professional, I believe that being technically capable of doing something does not automatically mean that I should do it. For example, someone with administrative privileges may technically have access to information belonging to other users, but that access should only be exercised when it is necessary for a legitimate purpose. The same principle applies to software development. A system should not </w:t>
+      </w:r>
+      <w:r>
+        <w:rPr>
+          <w:rFonts w:ascii="Aptos" w:hAnsi="Aptos"/>
+          <w:color w:val="333333"/>
+          <w:sz w:val="22"/>
+          <w:szCs w:val="22"/>
+        </w:rPr>
+        <w:lastRenderedPageBreak/>
+        <w:t>simply work; I also have a responsibility to consider security, privacy, reliability, maintainability, and the consequences of failure. This becomes increasingly important when working with artificial intelligence because an algorithm can make decisions or recommendations at a scale that an individual person cannot.</w:t>
       </w:r>
     </w:p>
     <w:p>
@@ -711,7 +2202,6 @@
           <w:sz w:val="22"/>
           <w:szCs w:val="22"/>
         </w:rPr>
-        <w:lastRenderedPageBreak/>
         <w:t>There are also many smaller compromises in everyday life. I drive regularly even though I know that driving consumes fuel, produces emissions, and contributes to environmental impacts. I justify this partly because transportation provides significant practical benefits and allows me to meet work, family, and other responsibilities. However, describing those benefits does not eliminate the negative consequences. Instead, I see the decision as balancing costs and benefits while attempting to reduce unnecessary harm. The same reasoning applies to computing. Computers, cloud services, AI systems, and data centres consume electricity and physical resources. I nevertheless use them because they provide substantial educational, professional, and social benefits. The ethical question therefore becomes not whether I can eliminate every negative consequence, which is probably impossible, but whether the benefit reasonably justifies the cost and whether I can reduce that cost.</w:t>
       </w:r>
     </w:p>
@@ -772,7 +2262,11 @@
     </w:p>
     <w:p>
       <w:r>
-        <w:t>My personal interest in ethics is closely connected to my background in technology, software development, artificial intelligence, and engineering-related systems. As technology becomes increasingly integrated into society, I believe technical professionals have responsibilities that extend beyond simply making systems function correctly. We also need to consider how our decisions affect other people, organizations, society, and the environment.</w:t>
+        <w:t xml:space="preserve">My personal interest in ethics is closely connected to my background in technology, software development, artificial intelligence, and engineering-related systems. As technology becomes increasingly integrated into society, I believe technical professionals have responsibilities that </w:t>
+      </w:r>
+      <w:r>
+        <w:lastRenderedPageBreak/>
+        <w:t>extend beyond simply making systems function correctly. We also need to consider how our decisions affect other people, organizations, society, and the environment.</w:t>
       </w:r>
     </w:p>
     <w:p>
@@ -782,74 +2276,65 @@
     </w:p>
     <w:p>
       <w:r>
-        <w:t xml:space="preserve">At the same time, I recognize the practical value of the utilitarian perspective associated with John Stuart Mill. Decisions often involve competing interests, and it is not always possible to produce an outcome that benefits everyone equally. In those situations, I tend to consider the consequences </w:t>
+        <w:t>At the same time, I recognize the practical value of the utilitarian perspective associated with John Stuart Mill. Decisions often involve competing interests, and it is not always possible to produce an outcome that benefits everyone equally. In those situations, I tend to consider the consequences of the available alternatives and ask which course of action provides the greatest overall benefit while minimizing potential harm. I do not see this as replacing principles with convenience; rather, consequences are another important dimension of responsible decision-making.</w:t>
+      </w:r>
+    </w:p>
+    <w:p>
+      <w:r>
+        <w:t>J. L. Austin's distinction between doing something by mistake and doing something by accident also interests me because intention matters when evaluating responsibility. In software and complex technical systems, failures will occur even when people act responsibly. An unforeseen software defect is ethically different from knowingly ignoring a serious vulnerability or deliberately releasing a system that has not been adequately tested. The outcome might be similar, but the knowledge, intentions, precautions, and decisions leading to that outcome are different. For this reason, I believe ethical responsibility requires examining both consequences and the process by which decisions were made.</w:t>
+      </w:r>
+    </w:p>
+    <w:p>
+      <w:r>
+        <w:t>Artificial intelligence makes these questions particularly important to me. AI systems can influence decisions, automate processes, process enormous quantities of information, and increasingly operate with limited human intervention. As someone interested in AI and reinforcement learning, I believe developers should consider issues such as transparency, privacy, accountability, safety, bias, and unintended consequences throughout the development process rather than treating ethics as something to consider only after a system has been completed.</w:t>
+      </w:r>
+    </w:p>
+    <w:p>
+      <w:r>
+        <w:t>Overall, I would describe my ethical position as principle-based but pragmatic. I believe some fundamental obligations should guide professional conduct, while the consequences of decisions must also be carefully evaluated. Technology inevitably involves trade-offs, uncertainty, and competing priorities. Ethical behaviour, therefore, is not simply about following rules. It requires understanding the principles behind those rules, considering the consequences of our actions, recognizing uncertainty, and being prepared to take responsibility for the decisions we make.</w:t>
+      </w:r>
+    </w:p>
+    <w:p/>
+    <w:p>
+      <w:pPr>
+        <w:pStyle w:val="Heading2"/>
+      </w:pPr>
+      <w:r>
+        <w:t>Week 3 – Reflection</w:t>
+      </w:r>
+    </w:p>
+    <w:p>
+      <w:r>
+        <w:t xml:space="preserve">This week’s examination of privacy and data protection made me reconsider what privacy actually means in a society increasingly dependent on digital technology. Before examining the issue more closely, I tended to think about privacy primarily in terms of keeping personal information secret. </w:t>
       </w:r>
       <w:r>
         <w:lastRenderedPageBreak/>
-        <w:t>of the available alternatives and ask which course of action provides the greatest overall benefit while minimizing potential harm. I do not see this as replacing principles with convenience; rather, consequences are another important dimension of responsible decision-making.</w:t>
-      </w:r>
-    </w:p>
-    <w:p>
-      <w:r>
-        <w:t>J. L. Austin's distinction between doing something by mistake and doing something by accident also interests me because intention matters when evaluating responsibility. In software and complex technical systems, failures will occur even when people act responsibly. An unforeseen software defect is ethically different from knowingly ignoring a serious vulnerability or deliberately releasing a system that has not been adequately tested. The outcome might be similar, but the knowledge, intentions, precautions, and decisions leading to that outcome are different. For this reason, I believe ethical responsibility requires examining both consequences and the process by which decisions were made.</w:t>
-      </w:r>
-    </w:p>
-    <w:p>
-      <w:r>
-        <w:t>Artificial intelligence makes these questions particularly important to me. AI systems can influence decisions, automate processes, process enormous quantities of information, and increasingly operate with limited human intervention. As someone interested in AI and reinforcement learning, I believe developers should consider issues such as transparency, privacy, accountability, safety, bias, and unintended consequences throughout the development process rather than treating ethics as something to consider only after a system has been completed.</w:t>
-      </w:r>
-    </w:p>
-    <w:p>
-      <w:r>
-        <w:t>Overall, I would describe my ethical position as principle-based but pragmatic. I believe some fundamental obligations should guide professional conduct, while the consequences of decisions must also be carefully evaluated. Technology inevitably involves trade-offs, uncertainty, and competing priorities. Ethical behaviour, therefore, is not simply about following rules. It requires understanding the principles behind those rules, considering the consequences of our actions, recognizing uncertainty, and being prepared to take responsibility for the decisions we make.</w:t>
-      </w:r>
-    </w:p>
-    <w:p/>
-    <w:p>
-      <w:pPr>
-        <w:pStyle w:val="Heading2"/>
-      </w:pPr>
-      <w:r>
-        <w:t>Week 3 – Reflection</w:t>
-      </w:r>
-    </w:p>
-    <w:p>
-      <w:r>
-        <w:t>This week’s examination of privacy and data protection made me reconsider what privacy actually means in a society increasingly dependent on digital technology. Before examining the issue more closely, I tended to think about privacy primarily in terms of keeping personal information secret. After reviewing privacy legislation and recent developments involving data breaches, artificial intelligence, and wearable technology, I now see privacy more broadly as an individual’s ability to maintain reasonable control over how personal information is collected, used, retained, and disclosed.</w:t>
-      </w:r>
-    </w:p>
-    <w:p>
-      <w:r>
-        <w:t xml:space="preserve">The Canadian and Ontario privacy frameworks demonstrate that privacy continues to be treated as an important right and responsibility. At the federal level, the Personal Information Protection and Electronic Documents Act (PIPEDA) establishes requirements governing how private-sector organizations handle personal information during commercial activities. In Ontario, the Freedom of Information and Protection of Privacy Act (FIPPA) provides protections involving personal information held by provincial public-sector institutions. Recent amendments to FIPPA are particularly interesting because they include requirements involving privacy impact assessments, privacy breach reporting, safeguards, and increased oversight by the Information and Privacy </w:t>
-      </w:r>
+        <w:t>After reviewing privacy legislation and recent developments involving data breaches, artificial intelligence, and wearable technology, I now see privacy more broadly as an individual’s ability to maintain reasonable control over how personal information is collected, used, retained, and disclosed.</w:t>
+      </w:r>
+    </w:p>
+    <w:p>
+      <w:r>
+        <w:t>The Canadian and Ontario privacy frameworks demonstrate that privacy continues to be treated as an important right and responsibility. At the federal level, the Personal Information Protection and Electronic Documents Act (PIPEDA) establishes requirements governing how private-sector organizations handle personal information during commercial activities. In Ontario, the Freedom of Information and Protection of Privacy Act (FIPPA) provides protections involving personal information held by provincial public-sector institutions. Recent amendments to FIPPA are particularly interesting because they include requirements involving privacy impact assessments, privacy breach reporting, safeguards, and increased oversight by the Information and Privacy Commissioner of Ontario. These developments suggest to me that privacy is not becoming legally irrelevant. Instead, governments are attempting to adapt privacy protections to an environment in which enormous amounts of personal information can be collected and processed.</w:t>
+      </w:r>
+    </w:p>
+    <w:p>
+      <w:r>
+        <w:t>One recent case that particularly influenced my thinking was the September 2026 announcement by the Office of the Privacy Commissioner of Canada concerning a data breach involving IDScan.net. According to the Privacy Commissioner, an unauthorized third party obtained personal information that included digital scans of driver’s licences and other identification documents. This case illustrates a problem that extends beyond whether collecting information is initially justified. A company may have a legitimate reason to verify someone’s identity, but retaining that information creates an ongoing risk. This made me question how much information organizations should retain once its original purpose has been fulfilled. From my perspective, organizations should follow the principle of data minimization: if personal information is no longer necessary, retaining it creates risk without providing a corresponding benefit to the individual.</w:t>
+      </w:r>
+    </w:p>
+    <w:p>
+      <w:r>
+        <w:t>I was also interested in the growing controversy surrounding AI-enabled smart glasses. Recent reports describe governments, courts, businesses, and regulators considering restrictions on devices capable of recording images, video, and audio while appearing similar to ordinary glasses. This technology challenges traditional assumptions about privacy in public spaces. I accept that when I enter a public place, other people can see me. However, I do not believe that being visible in public should automatically constitute consent to being digitally recorded, identified, analyzed by artificial intelligence, stored indefinitely, or distributed to others. There is an important ethical difference between being observed by another person and becoming part of a permanent and searchable digital record.</w:t>
+      </w:r>
+    </w:p>
+    <w:p>
+      <w:r>
+        <w:t>This distinction becomes increasingly important as artificial intelligence develops. Individual pieces of information may appear harmless when considered separately, but modern systems can combine location information, photographs, purchasing behaviour, online activity, biometric information, and other data to infer things about individuals that they never explicitly disclosed. Consequently, protecting privacy can no longer mean simply protecting information that a person intentionally keeps secret. It must also address what organizations, and intelligent systems can infer from the information they collect.</w:t>
+      </w:r>
+    </w:p>
+    <w:p>
       <w:r>
         <w:lastRenderedPageBreak/>
-        <w:t>Commissioner of Ontario. These developments suggest to me that privacy is not becoming legally irrelevant. Instead, governments are attempting to adapt privacy protections to an environment in which enormous amounts of personal information can be collected and processed.</w:t>
-      </w:r>
-    </w:p>
-    <w:p>
-      <w:r>
-        <w:t>One recent case that particularly influenced my thinking was the September 2026 announcement by the Office of the Privacy Commissioner of Canada concerning a data breach involving IDScan.net. According to the Privacy Commissioner, an unauthorized third party obtained personal information that included digital scans of driver’s licences and other identification documents. This case illustrates a problem that extends beyond whether collecting information is initially justified. A company may have a legitimate reason to verify someone’s identity, but retaining that information creates an ongoing risk. This made me question how much information organizations should retain once its original purpose has been fulfilled. From my perspective, organizations should follow the principle of data minimization: if personal information is no longer necessary, retaining it creates risk without providing a corresponding benefit to the individual.</w:t>
-      </w:r>
-    </w:p>
-    <w:p>
-      <w:r>
-        <w:t>I was also interested in the growing controversy surrounding AI-enabled smart glasses. Recent reports describe governments, courts, businesses, and regulators considering restrictions on devices capable of recording images, video, and audio while appearing similar to ordinary glasses. This technology challenges traditional assumptions about privacy in public spaces. I accept that when I enter a public place, other people can see me. However, I do not believe that being visible in public should automatically constitute consent to being digitally recorded, identified, analyzed by artificial intelligence, stored indefinitely, or distributed to others. There is an important ethical difference between being observed by another person and becoming part of a permanent and searchable digital record.</w:t>
-      </w:r>
-    </w:p>
-    <w:p>
-      <w:r>
-        <w:t xml:space="preserve">This distinction becomes increasingly important as artificial intelligence develops. Individual pieces of information may appear harmless when considered separately, but modern systems can combine location information, photographs, purchasing behaviour, online activity, biometric information, and other data to infer things about individuals that they never explicitly disclosed. Consequently, protecting privacy can no longer mean simply protecting information that a person intentionally keeps secret. It must also address what </w:t>
-      </w:r>
-      <w:r>
-        <w:t>organizations,</w:t>
-      </w:r>
-      <w:r>
-        <w:t xml:space="preserve"> and intelligent systems can infer from the information they collect.</w:t>
-      </w:r>
-    </w:p>
-    <w:p>
-      <w:r>
         <w:t>The debate statement, “Privacy is dead and it’s a good thing,” therefore contains two very different claims. I can see some truth in the first. Complete anonymity is becoming increasingly difficult to maintain. Smartphones, social networks, surveillance cameras, connected devices, biometric systems, and AI all make individuals easier to identify and track. In that sense, traditional expectations of privacy are undoubtedly under pressure.</w:t>
       </w:r>
     </w:p>
@@ -860,7 +2345,6 @@
     </w:p>
     <w:p>
       <w:r>
-        <w:lastRenderedPageBreak/>
         <w:t>The idea that people who have “nothing to hide” should not be concerned about privacy is also unconvincing to me. Privacy is not simply about concealing wrongdoing. People routinely protect passwords, financial information, private conversations, personal documents, and other information without having done anything wrong. Organizations and governments similarly protect confidential information. Privacy therefore seems more closely related to autonomy, dignity, security, and control than to secrecy. This is consistent with Article 12 of the Universal Declaration of Human Rights, which recognizes protection against arbitrary interference with privacy, family, home, and correspondence.</w:t>
       </w:r>
     </w:p>
@@ -910,7 +2394,7 @@
       <w:r>
         <w:br/>
       </w:r>
-      <w:hyperlink r:id="rId8" w:tgtFrame="_blank" w:history="1">
+      <w:hyperlink r:id="rId12" w:tgtFrame="_blank" w:history="1">
         <w:r>
           <w:rPr>
             <w:rStyle w:val="Hyperlink"/>
@@ -946,7 +2430,7 @@
       <w:r>
         <w:br/>
       </w:r>
-      <w:hyperlink r:id="rId9" w:tgtFrame="_blank" w:history="1">
+      <w:hyperlink r:id="rId13" w:tgtFrame="_blank" w:history="1">
         <w:r>
           <w:rPr>
             <w:rStyle w:val="Hyperlink"/>
@@ -977,12 +2461,16 @@
         <w:t>Countries weigh banning smart glasses over privacy concerns</w:t>
       </w:r>
       <w:r>
-        <w:t>. The article documents international concern about camera-equipped smart glasses and restrictions being considered or implemented in several jurisdictions.</w:t>
+        <w:t xml:space="preserve">. The article documents international concern about camera-equipped smart glasses and restrictions being </w:t>
+      </w:r>
+      <w:r>
+        <w:lastRenderedPageBreak/>
+        <w:t>considered or implemented in several jurisdictions.</w:t>
       </w:r>
       <w:r>
         <w:br/>
       </w:r>
-      <w:hyperlink r:id="rId10" w:tgtFrame="_blank" w:history="1">
+      <w:hyperlink r:id="rId14" w:tgtFrame="_blank" w:history="1">
         <w:r>
           <w:rPr>
             <w:rStyle w:val="Hyperlink"/>
@@ -1018,7 +2506,7 @@
       <w:r>
         <w:br/>
       </w:r>
-      <w:hyperlink r:id="rId11" w:tgtFrame="_blank" w:history="1">
+      <w:hyperlink r:id="rId15" w:tgtFrame="_blank" w:history="1">
         <w:r>
           <w:rPr>
             <w:rStyle w:val="Hyperlink"/>
@@ -1044,31 +2532,31 @@
     </w:p>
     <w:p>
       <w:r>
-        <w:t xml:space="preserve">This week's discussion about restricting strong encryption to licensed users made me reflect on the relationship between privacy, security, and government authority. As a software developer, I recognize encryption as an essential component of modern information systems. It protects </w:t>
+        <w:t>This week's discussion about restricting strong encryption to licensed users made me reflect on the relationship between privacy, security, and government authority. As a software developer, I recognize encryption as an essential component of modern information systems. It protects sensitive information, secures communications, and establishes trust between individuals and organizations. However, the debate also demonstrated that encryption presents ethical challenges, particularly when the same technology that protects legitimate users can also be exploited to conceal criminal activities.</w:t>
+      </w:r>
+    </w:p>
+    <w:p>
+      <w:r>
+        <w:t>One of the most important aspects of the discussion was understanding that encryption is not simply a mechanism for keeping information secret. It is fundamental to protecting financial transactions, intellectual property, personal communications, and confidential business information. I regularly interact with systems that depend on encryption, including development environments, cloud services, and remote connections. Without strong encryption, these systems would become vulnerable to unauthorized access, interception, and data theft.</w:t>
+      </w:r>
+    </w:p>
+    <w:p>
+      <w:r>
+        <w:t>The argument supporting government regulation raises legitimate concerns about public safety and law enforcement. Criminal organizations can use encrypted communication platforms to conceal illegal activities, making investigations more difficult. I understand why governments might seek mechanisms to obtain access to encrypted information under appropriate legal authorization. Nevertheless, I question whether restricting encryption to licensed users would effectively address these challenges. Encryption algorithms are widely documented, and implementations are available through open-source software. Consequently, individuals intending to misuse encryption could potentially circumvent licensing requirements, while legitimate users would face additional restrictions.</w:t>
+      </w:r>
+    </w:p>
+    <w:p>
+      <w:r>
+        <w:t>Another concern involves the possibility of introducing government-access mechanisms, commonly described as backdoors. From a technical perspective, creating exceptional access for authorized authorities introduces additional security risks. Abelson et al. (2015) explain that mechanisms designed to provide exceptional access to encrypted communications can introduce vulnerabilities and increase the complexity of securing information systems. Even when access is intended exclusively for legitimate investigations, there is no absolute guarantee that such mechanisms could not be exploited by unauthorized parties.</w:t>
+      </w:r>
+    </w:p>
+    <w:p>
+      <w:r>
+        <w:t xml:space="preserve">Personally, I would be uncomfortable knowing that a government or commercial organization could access my encrypted information without my knowledge. Although I recognize that lawful investigations may justify access to certain information, I believe such access should be subject to judicial oversight and appropriate legal safeguards. More importantly, I do not believe that </w:t>
       </w:r>
       <w:r>
         <w:lastRenderedPageBreak/>
-        <w:t>sensitive information, secures communications, and establishes trust between individuals and organizations. However, the debate also demonstrated that encryption presents ethical challenges, particularly when the same technology that protects legitimate users can also be exploited to conceal criminal activities.</w:t>
-      </w:r>
-    </w:p>
-    <w:p>
-      <w:r>
-        <w:t>One of the most important aspects of the discussion was understanding that encryption is not simply a mechanism for keeping information secret. It is fundamental to protecting financial transactions, intellectual property, personal communications, and confidential business information. I regularly interact with systems that depend on encryption, including development environments, cloud services, and remote connections. Without strong encryption, these systems would become vulnerable to unauthorized access, interception, and data theft.</w:t>
-      </w:r>
-    </w:p>
-    <w:p>
-      <w:r>
-        <w:t>The argument supporting government regulation raises legitimate concerns about public safety and law enforcement. Criminal organizations can use encrypted communication platforms to conceal illegal activities, making investigations more difficult. I understand why governments might seek mechanisms to obtain access to encrypted information under appropriate legal authorization. Nevertheless, I question whether restricting encryption to licensed users would effectively address these challenges. Encryption algorithms are widely documented, and implementations are available through open-source software. Consequently, individuals intending to misuse encryption could potentially circumvent licensing requirements, while legitimate users would face additional restrictions.</w:t>
-      </w:r>
-    </w:p>
-    <w:p>
-      <w:r>
-        <w:t>Another concern involves the possibility of introducing government-access mechanisms, commonly described as backdoors. From a technical perspective, creating exceptional access for authorized authorities introduces additional security risks. Abelson et al. (2015) explain that mechanisms designed to provide exceptional access to encrypted communications can introduce vulnerabilities and increase the complexity of securing information systems. Even when access is intended exclusively for legitimate investigations, there is no absolute guarantee that such mechanisms could not be exploited by unauthorized parties.</w:t>
-      </w:r>
-    </w:p>
-    <w:p>
-      <w:r>
-        <w:t>Personally, I would be uncomfortable knowing that a government or commercial organization could access my encrypted information without my knowledge. Although I recognize that lawful investigations may justify access to certain information, I believe such access should be subject to judicial oversight and appropriate legal safeguards. More importantly, I do not believe that weakening encryption for everyone is an acceptable solution to the challenges faced by law enforcement.</w:t>
+        <w:t>weakening encryption for everyone is an acceptable solution to the challenges faced by law enforcement.</w:t>
       </w:r>
     </w:p>
     <w:p>
@@ -1078,7 +2566,6 @@
     </w:p>
     <w:p>
       <w:r>
-        <w:lastRenderedPageBreak/>
         <w:t>Another interesting ethical consideration involves the use of encryption in digital rights management (DRM). Entertainment companies use technological protection measures to restrict unauthorized copying and distribution of copyrighted material. While I recognize the importance of protecting intellectual property, I also believe consumers should have reasonable flexibility to access legitimately purchased content across different devices. This creates a distinction between encryption used to protect confidentiality and encryption used to enforce commercial restrictions. Although both rely on cryptographic techniques, their ethical implications can be substantially different.</w:t>
       </w:r>
     </w:p>
@@ -1126,7 +2613,7 @@
       <w:r>
         <w:t xml:space="preserve">. Massachusetts Institute of Technology. </w:t>
       </w:r>
-      <w:hyperlink r:id="rId12" w:history="1">
+      <w:hyperlink r:id="rId16" w:history="1">
         <w:r>
           <w:rPr>
             <w:rStyle w:val="Hyperlink"/>
@@ -1143,6 +2630,7 @@
     </w:p>
     <w:p>
       <w:r>
+        <w:lastRenderedPageBreak/>
         <w:t xml:space="preserve">Canadian Centre for Cyber Security. (2026). </w:t>
       </w:r>
       <w:r>
@@ -1159,7 +2647,7 @@
       <w:r>
         <w:t xml:space="preserve">. Government of Canada. </w:t>
       </w:r>
-      <w:hyperlink r:id="rId13" w:history="1">
+      <w:hyperlink r:id="rId17" w:history="1">
         <w:r>
           <w:rPr>
             <w:rStyle w:val="Hyperlink"/>
@@ -1192,7 +2680,7 @@
       <w:r>
         <w:t xml:space="preserve"> (FIPS Publication 197). U.S. Department of Commerce. </w:t>
       </w:r>
-      <w:hyperlink r:id="rId14" w:history="1">
+      <w:hyperlink r:id="rId18" w:history="1">
         <w:r>
           <w:rPr>
             <w:rStyle w:val="Hyperlink"/>
@@ -1233,16 +2721,7 @@
           <w:sz w:val="22"/>
           <w:szCs w:val="22"/>
         </w:rPr>
-        <w:t xml:space="preserve">This week's discussion made me reflect on how intellectual property rights influence both my responsibilities as a software developer and my rights as a software user. As someone who develops software, I understand the time, effort, and technical knowledge required to create a </w:t>
-      </w:r>
-      <w:r>
-        <w:rPr>
-          <w:rFonts w:asciiTheme="minorHAnsi" w:hAnsiTheme="minorHAnsi"/>
-          <w:sz w:val="22"/>
-          <w:szCs w:val="22"/>
-        </w:rPr>
-        <w:lastRenderedPageBreak/>
-        <w:t>functional product. I would certainly be concerned if someone copied my work, distributed it without permission, or used it commercially without acknowledging my contribution. However, I also believe that intellectual property protection should not create unreasonable restrictions that prevent legitimate users from accessing products or information they have already paid for.</w:t>
+        <w:t>This week's discussion made me reflect on how intellectual property rights influence both my responsibilities as a software developer and my rights as a software user. As someone who develops software, I understand the time, effort, and technical knowledge required to create a functional product. I would certainly be concerned if someone copied my work, distributed it without permission, or used it commercially without acknowledging my contribution. However, I also believe that intellectual property protection should not create unreasonable restrictions that prevent legitimate users from accessing products or information they have already paid for.</w:t>
       </w:r>
       <w:r>
         <w:rPr>
@@ -1360,7 +2839,7 @@
           <w:sz w:val="22"/>
           <w:szCs w:val="22"/>
         </w:rPr>
-        <w:t>I also found the scenario involving GPL-licensed code particularly relevant. As a developer, I regularly encounter open-source libraries and frameworks. Their availability does not mean they can be incorporated into commercial applications without considering licensing obligations. The GNU General Public License establishes conditions for copying, modifying, and distributing covered software (Free Software Foundation, 2007). This reinforces the importance of understanding the licenses associated with third-party code before integrating it into a project. Discovering a licensing conflict after releasing a commercial product could create significant ethical and legal consequences.</w:t>
+        <w:t xml:space="preserve">I also found the scenario involving GPL-licensed code particularly relevant. As a developer, I regularly encounter open-source libraries and frameworks. Their availability does not mean they can be incorporated into </w:t>
       </w:r>
       <w:r>
         <w:rPr>
@@ -1368,7 +2847,8 @@
           <w:sz w:val="22"/>
           <w:szCs w:val="22"/>
         </w:rPr>
-        <w:t xml:space="preserve"> </w:t>
+        <w:lastRenderedPageBreak/>
+        <w:t>commercial applications without considering licensing obligations. The GNU General Public License establishes conditions for copying, modifying, and distributing covered software (Free Software Foundation, 2007). This reinforces the importance of understanding the licenses associated with third-party code before integrating it into a project. Discovering a licensing conflict after releasing a commercial product could create significant ethical and legal consequences.</w:t>
       </w:r>
       <w:r>
         <w:rPr>
@@ -1376,7 +2856,7 @@
           <w:sz w:val="22"/>
           <w:szCs w:val="22"/>
         </w:rPr>
-        <w:t>From a professional perspective, the ACM Code of Ethics emphasizes respecting intellectual property, avoiding harm, and acting in the public interest (Association for Computing Machinery, 2018). I believe</w:t>
+        <w:t xml:space="preserve"> </w:t>
       </w:r>
       <w:r>
         <w:rPr>
@@ -1384,7 +2864,7 @@
           <w:sz w:val="22"/>
           <w:szCs w:val="22"/>
         </w:rPr>
-        <w:t xml:space="preserve"> </w:t>
+        <w:t>From a professional perspective, the ACM Code of Ethics emphasizes respecting intellectual property, avoiding harm, and acting in the public interest (Association for Computing Machinery, 2018). I believe</w:t>
       </w:r>
       <w:r>
         <w:rPr>
@@ -1392,7 +2872,7 @@
           <w:sz w:val="22"/>
           <w:szCs w:val="22"/>
         </w:rPr>
-        <w:t xml:space="preserve">these principles provide a useful framework for evaluating situations </w:t>
+        <w:t xml:space="preserve"> </w:t>
       </w:r>
       <w:r>
         <w:rPr>
@@ -1400,24 +2880,7 @@
           <w:sz w:val="22"/>
           <w:szCs w:val="22"/>
         </w:rPr>
-        <w:t>were</w:t>
-      </w:r>
-      <w:r>
-        <w:rPr>
-          <w:rFonts w:asciiTheme="minorHAnsi" w:hAnsiTheme="minorHAnsi"/>
-          <w:sz w:val="22"/>
-          <w:szCs w:val="22"/>
-        </w:rPr>
-        <w:t xml:space="preserve"> contractual obligations conflict with other ethical responsibilities. Rather than focusing exclusively on whether an agreement has been violated, we should also consider the intention behind the action, its consequences, and whether reasonable </w:t>
-      </w:r>
-      <w:r>
-        <w:rPr>
-          <w:rFonts w:asciiTheme="minorHAnsi" w:hAnsiTheme="minorHAnsi"/>
-          <w:sz w:val="22"/>
-          <w:szCs w:val="22"/>
-        </w:rPr>
-        <w:lastRenderedPageBreak/>
-        <w:t>alternatives are available.</w:t>
+        <w:t>these principles provide a useful framework for evaluating situations were contractual obligations conflict with other ethical responsibilities. Rather than focusing exclusively on whether an agreement has been violated, we should also consider the intention behind the action, its consequences, and whether reasonable alternatives are available.</w:t>
       </w:r>
       <w:r>
         <w:rPr>
@@ -1518,7 +2981,7 @@
       <w:r>
         <w:t xml:space="preserve">. </w:t>
       </w:r>
-      <w:hyperlink r:id="rId15">
+      <w:hyperlink r:id="rId19">
         <w:r>
           <w:rPr>
             <w:color w:val="0000CC"/>
@@ -1546,7 +3009,7 @@
         </w:rPr>
         <w:t xml:space="preserve">Copyright Act, R.S.C. 1985, c. C-42 (Canada). </w:t>
       </w:r>
-      <w:hyperlink r:id="rId16">
+      <w:hyperlink r:id="rId20">
         <w:r>
           <w:rPr>
             <w:rFonts w:asciiTheme="minorHAnsi" w:hAnsiTheme="minorHAnsi"/>
@@ -1587,7 +3050,7 @@
       <w:r>
         <w:t xml:space="preserve">. </w:t>
       </w:r>
-      <w:hyperlink r:id="rId17">
+      <w:hyperlink r:id="rId21">
         <w:r>
           <w:rPr>
             <w:color w:val="0000CC"/>
@@ -1602,7 +3065,7 @@
         </w:rPr>
         <w:t xml:space="preserve"> </w:t>
       </w:r>
-      <w:hyperlink r:id="rId18">
+      <w:hyperlink r:id="rId22">
         <w:r>
           <w:rPr>
             <w:color w:val="0000CC"/>
@@ -1617,6 +3080,7 @@
         <w:pStyle w:val="Heading2"/>
       </w:pPr>
       <w:r>
+        <w:lastRenderedPageBreak/>
         <w:t>Week 6 – Reflection</w:t>
       </w:r>
     </w:p>
@@ -1644,13 +3108,7 @@
         <w:pStyle w:val="Heading2"/>
       </w:pPr>
       <w:r>
-        <w:t xml:space="preserve">Week </w:t>
-      </w:r>
-      <w:r>
-        <w:t>2</w:t>
-      </w:r>
-      <w:r>
-        <w:t xml:space="preserve"> – Debates &amp; Discussions</w:t>
+        <w:t>Week 2 – Debates &amp; Discussions</w:t>
       </w:r>
       <w:r>
         <w:t xml:space="preserve"> – N/A</w:t>
@@ -1661,13 +3119,7 @@
         <w:pStyle w:val="Heading2"/>
       </w:pPr>
       <w:r>
-        <w:t xml:space="preserve">Week </w:t>
-      </w:r>
-      <w:r>
-        <w:t>3</w:t>
-      </w:r>
-      <w:r>
-        <w:t xml:space="preserve"> – Debates &amp; Discussions</w:t>
+        <w:t>Week 3 – Debates &amp; Discussions</w:t>
       </w:r>
     </w:p>
     <w:p>
@@ -1795,6 +3247,7 @@
     </w:p>
     <w:p>
       <w:r>
+        <w:lastRenderedPageBreak/>
         <w:t>On the utilitarian balance: I'll admit that this can't be calculated precisely, and that's a real limitation of applying Mill (1863) to a policy question. What we can do is make the system measurable. Licensed providers could be required to publish transparency reports on how many lawful requests they receive and fulfil, independent reviewers could track breaches and misuse, and the law could include a sunset clause. If the evidence showed the privacy and security harms outweighed the benefit to investigations, the policy would have to be changed or ended. To me, a policy that can be tested and corrected is better than having no rules and no way to measure the harm at all</w:t>
       </w:r>
     </w:p>
@@ -1864,63 +3317,57 @@
     </w:p>
     <w:p>
       <w:r>
+        <w:t xml:space="preserve">Hi Edenilson, Thank you for your comment, I would say those are fair questions, and I think they highlight an important distinction in my argument. </w:t>
+      </w:r>
+    </w:p>
+    <w:p>
+      <w:r>
+        <w:t xml:space="preserve">I agree that licensing alone would not allow investigators to decrypt encrypted messages, and I am not arguing for a technical backdoor. My point is that licensing could create an accountability framework for access to the strongest forms of encryption while maintaining the security of the encryption itself. </w:t>
+      </w:r>
+    </w:p>
+    <w:p>
+      <w:r>
+        <w:t xml:space="preserve">Regarding the technical boundary, I agree that AES-256 is already extremely strong and is widely used for legitimate purposes. Therefore, the distinction should not simply be based on key length. It could instead consider the capabilities, intended use, and level of anonymity provided by specialized encryption systems. </w:t>
+      </w:r>
+    </w:p>
+    <w:p>
+      <w:r>
+        <w:t>I recognize that licensing would not solve every lawful-access problem. However, I believe it could provide a balance between protecting legitimate privacy and maintaining accountability for exceptionally powerful encryption technologies.</w:t>
+      </w:r>
+    </w:p>
+    <w:p>
+      <w:r>
+        <w:t>Sincerely,</w:t>
+      </w:r>
+    </w:p>
+    <w:p>
+      <w:r>
+        <w:t>Wadee.</w:t>
+      </w:r>
+    </w:p>
+    <w:p>
+      <w:pPr>
+        <w:shd w:val="clear" w:color="auto" w:fill="D1D1D1" w:themeFill="background2" w:themeFillShade="E6"/>
+      </w:pPr>
+    </w:p>
+    <w:p>
+      <w:pPr>
+        <w:rPr>
+          <w:b/>
+          <w:bCs/>
+        </w:rPr>
+      </w:pPr>
+      <w:r>
+        <w:rPr>
+          <w:b/>
+          <w:bCs/>
+        </w:rPr>
+        <w:t>Question to Robert Schimidt</w:t>
+      </w:r>
+    </w:p>
+    <w:p>
+      <w:r>
         <w:lastRenderedPageBreak/>
-        <w:t>Hi Edenilson, Thank you for your comment,</w:t>
-      </w:r>
-      <w:r>
-        <w:t xml:space="preserve"> </w:t>
-      </w:r>
-      <w:r>
-        <w:t xml:space="preserve">I would say those are fair questions, and I think they highlight an important distinction in my argument. </w:t>
-      </w:r>
-    </w:p>
-    <w:p>
-      <w:r>
-        <w:t xml:space="preserve">I agree that licensing alone would not allow investigators to decrypt encrypted messages, and I am not arguing for a technical backdoor. My point is that licensing could create an accountability framework for access to the strongest forms of encryption while maintaining the security of the encryption itself. </w:t>
-      </w:r>
-    </w:p>
-    <w:p>
-      <w:r>
-        <w:t xml:space="preserve">Regarding the technical boundary, I agree that AES-256 is already extremely strong and is widely used for legitimate purposes. Therefore, the distinction should not simply be based on key length. It could instead consider the capabilities, intended use, and level of anonymity provided by specialized encryption systems. </w:t>
-      </w:r>
-    </w:p>
-    <w:p>
-      <w:r>
-        <w:t>I recognize that licensing would not solve every lawful-access problem. However, I believe it could provide a balance between protecting legitimate privacy and maintaining accountability for exceptionally powerful encryption technologies.</w:t>
-      </w:r>
-    </w:p>
-    <w:p>
-      <w:r>
-        <w:t>Sincerely,</w:t>
-      </w:r>
-    </w:p>
-    <w:p>
-      <w:r>
-        <w:t>Wadee.</w:t>
-      </w:r>
-    </w:p>
-    <w:p>
-      <w:pPr>
-        <w:shd w:val="clear" w:color="auto" w:fill="D1D1D1" w:themeFill="background2" w:themeFillShade="E6"/>
-      </w:pPr>
-    </w:p>
-    <w:p>
-      <w:pPr>
-        <w:rPr>
-          <w:b/>
-          <w:bCs/>
-        </w:rPr>
-      </w:pPr>
-      <w:r>
-        <w:rPr>
-          <w:b/>
-          <w:bCs/>
-        </w:rPr>
-        <w:t>Question to Robert Schimidt</w:t>
-      </w:r>
-    </w:p>
-    <w:p>
-      <w:r>
         <w:t>Rob, you make an important distinction between weakening encryption itself and regulating the organizations that provide it. My questions are:</w:t>
       </w:r>
     </w:p>
@@ -1980,37 +3427,31 @@
     </w:p>
     <w:p>
       <w:r>
-        <w:t>I think this exposes one of the legitimate weaknesses in the position I am arguing. A licensing system would never eliminate criminal access to strong encryption entirely. Encryption algorithms are already widely known, software can be distributed internationally, and people with enough technical knowledge can build or modify their own implementations.</w:t>
-      </w:r>
-      <w:r>
-        <w:t xml:space="preserve"> </w:t>
-      </w:r>
-      <w:r>
-        <w:t xml:space="preserve">Where I think licensing could still have value is in making the most mature, well-tested and commercially supported encrypted </w:t>
+        <w:t>I think this exposes one of the legitimate weaknesses in the position I am arguing. A licensing system would never eliminate criminal access to strong encryption entirely. Encryption algorithms are already widely known, software can be distributed internationally, and people with enough technical knowledge can build or modify their own implementations. Where I think licensing could still have value is in making the most mature, well-tested and commercially supported encrypted systems operate within some form of regulatory framework. It would increase accountability among legitimate providers and users, even if it could not completely prevent determined criminals from operating outside that system.</w:t>
+      </w:r>
+    </w:p>
+    <w:p>
+      <w:r>
+        <w:t>So, I agree that licensing would probably create some additional burden for law-abiding users. My argument would be that the question becomes whether that burden is reasonable when weighed against the potential benefit of making established encrypted services more accountable and accessible to lawful investigation under very specific circumstances.</w:t>
+      </w:r>
+    </w:p>
+    <w:p>
+      <w:r>
+        <w:t>2. I think your second question presents an even more difficult problem.</w:t>
+      </w:r>
+    </w:p>
+    <w:p>
+      <w:r>
+        <w:t>One possible method would be some form of key escrow or key-recovery system, where access to the necessary key material is controlled by an independent and highly trusted third party rather than being held directly by law enforcement. Key-recovery systems already exist in some organizational environments, and NIST includes key recovery as part of its guidance for managing cryptographic keys (Barker, 2020).</w:t>
+      </w:r>
+    </w:p>
+    <w:p>
+      <w:r>
+        <w:t xml:space="preserve">However, I also recognize that this does not make the security problem disappear. It arguably creates another extremely valuable target. If a third party possesses information capable of recovering encrypted data, then protecting that information becomes absolutely critical. Researchers such as Abelson et al. (2015) have argued that exceptional-access systems can introduce new vulnerabilities and additional complexity into systems that would otherwise be </w:t>
       </w:r>
       <w:r>
         <w:lastRenderedPageBreak/>
-        <w:t>systems operate within some form of regulatory framework. It would increase accountability among legitimate providers and users, even if it could not completely prevent determined criminals from operating outside that system.</w:t>
-      </w:r>
-    </w:p>
-    <w:p>
-      <w:r>
-        <w:t>So, I agree that licensing would probably create some additional burden for law-abiding users. My argument would be that the question becomes whether that burden is reasonable when weighed against the potential benefit of making established encrypted services more accountable and accessible to lawful investigation under very specific circumstances.</w:t>
-      </w:r>
-    </w:p>
-    <w:p>
-      <w:r>
-        <w:t>2. I think your second question presents an even more difficult problem.</w:t>
-      </w:r>
-    </w:p>
-    <w:p>
-      <w:r>
-        <w:t>One possible method would be some form of key escrow or key-recovery system, where access to the necessary key material is controlled by an independent and highly trusted third party rather than being held directly by law enforcement. Key-recovery systems already exist in some organizational environments, and NIST includes key recovery as part of its guidance for managing cryptographic keys (Barker, 2020).</w:t>
-      </w:r>
-    </w:p>
-    <w:p>
-      <w:r>
-        <w:t>However, I also recognize that this does not make the security problem disappear. It arguably creates another extremely valuable target. If a third party possesses information capable of recovering encrypted data, then protecting that information becomes absolutely critical. Researchers such as Abelson et al. (2015) have argued that exceptional-access systems can introduce new vulnerabilities and additional complexity into systems that would otherwise be designed specifically to prevent anyone other than the intended parties from decrypting the information.</w:t>
+        <w:t>designed specifically to prevent anyone other than the intended parties from decrypting the information.</w:t>
       </w:r>
     </w:p>
     <w:p>
@@ -2045,10 +3486,9 @@
     </w:p>
     <w:p>
       <w:r>
-        <w:lastRenderedPageBreak/>
         <w:t xml:space="preserve">Barker, E. (2020). Recommendation for key management: Part 1 – General (NIST Special Publication 800-57 Part 1 Rev. 5). National Institute of Standards and Technology. </w:t>
       </w:r>
-      <w:hyperlink r:id="rId19" w:history="1">
+      <w:hyperlink r:id="rId23" w:history="1">
         <w:r>
           <w:rPr>
             <w:rStyle w:val="Hyperlink"/>
@@ -2164,6 +3604,7 @@
           <w:b/>
           <w:bCs/>
         </w:rPr>
+        <w:lastRenderedPageBreak/>
         <w:t>Question to Hossam Abdelmagid</w:t>
       </w:r>
     </w:p>
@@ -2223,71 +3664,62 @@
     </w:p>
     <w:p>
       <w:r>
-        <w:t>For your first question, I think privacy and public safety are both important. But I don't think restricting encryption is the right solution. Criminals might still find ways to use encryption without a license, while regular people and small businesses would be the ones dealing with the restrictions. For your second question, I think you're right that investigations could become more difficult as encryption improves. Metadata and device investigations might not always be enough. But technology keeps changing on both sides, and I think law enforcement needs to keep improving its methods rather than weakening encryption for everyone.</w:t>
-      </w:r>
-      <w:r>
-        <w:t xml:space="preserve"> </w:t>
-      </w:r>
-      <w:r>
-        <w:t xml:space="preserve">I'm curious what you think. Even if </w:t>
-      </w:r>
-      <w:r>
+        <w:t>For your first question, I think privacy and public safety are both important. But I don't think restricting encryption is the right solution. Criminals might still find ways to use encryption without a license, while regular people and small businesses would be the ones dealing with the restrictions. For your second question, I think you're right that investigations could become more difficult as encryption improves. Metadata and device investigations might not always be enough. But technology keeps changing on both sides, and I think law enforcement needs to keep improving its methods rather than weakening encryption for everyone. I'm curious what you think. Even if encryption required a license, how could governments actually prevent criminals from using unlicensed encryption?</w:t>
+      </w:r>
+    </w:p>
+    <w:p>
+      <w:pPr>
+        <w:rPr>
+          <w:b/>
+          <w:bCs/>
+        </w:rPr>
+      </w:pPr>
+      <w:r>
+        <w:rPr>
+          <w:b/>
+          <w:bCs/>
+        </w:rPr>
+        <w:t>My reply to Hossam</w:t>
+      </w:r>
+    </w:p>
+    <w:p>
+      <w:r>
+        <w:t>Hi Hossam,</w:t>
+      </w:r>
+    </w:p>
+    <w:p>
+      <w:r>
+        <w:t>You raise an excellent question. I believe it would be nearly impossible for governments to prevent criminals from using unlicensed encryption. Encryption algorithms such as AES are publicly available, and their implementations can be developed, modified, and distributed independently. Even if governments restricted commercial encryption products, individuals could still obtain open-source implementations or develop their own encryption tools.</w:t>
+      </w:r>
+    </w:p>
+    <w:p>
+      <w:r>
+        <w:t>Furthermore, encryption operates across international borders, making enforcement particularly challenging without global cooperation. A licensing system would likely impose additional administrative and financial burdens on legitimate users while having limited impact on those deliberately circumventing the law.</w:t>
+      </w:r>
+    </w:p>
+    <w:p>
+      <w:r>
+        <w:t>In my view, the more effective approach would be to strengthen law enforcement's technical capabilities, international cooperation, and targeted investigative methods rather than restrict access to encryption.</w:t>
+      </w:r>
+    </w:p>
+    <w:p>
+      <w:pPr>
+        <w:shd w:val="clear" w:color="auto" w:fill="D1D1D1" w:themeFill="background2" w:themeFillShade="E6"/>
+      </w:pPr>
+    </w:p>
+    <w:p>
+      <w:pPr>
+        <w:rPr>
+          <w:b/>
+          <w:bCs/>
+        </w:rPr>
+      </w:pPr>
+      <w:r>
+        <w:rPr>
+          <w:b/>
+          <w:bCs/>
+        </w:rPr>
         <w:lastRenderedPageBreak/>
-        <w:t>encryption required a license, how could governments actually prevent criminals from using unlicensed encryption?</w:t>
-      </w:r>
-    </w:p>
-    <w:p>
-      <w:pPr>
-        <w:rPr>
-          <w:b/>
-          <w:bCs/>
-        </w:rPr>
-      </w:pPr>
-      <w:r>
-        <w:rPr>
-          <w:b/>
-          <w:bCs/>
-        </w:rPr>
-        <w:t>My reply to Hossam</w:t>
-      </w:r>
-    </w:p>
-    <w:p>
-      <w:r>
-        <w:t>Hi Hossam,</w:t>
-      </w:r>
-    </w:p>
-    <w:p>
-      <w:r>
-        <w:t>You raise an excellent question. I believe it would be nearly impossible for governments to prevent criminals from using unlicensed encryption. Encryption algorithms such as AES are publicly available, and their implementations can be developed, modified, and distributed independently. Even if governments restricted commercial encryption products, individuals could still obtain open-source implementations or develop their own encryption tools.</w:t>
-      </w:r>
-    </w:p>
-    <w:p>
-      <w:r>
-        <w:t>Furthermore, encryption operates across international borders, making enforcement particularly challenging without global cooperation. A licensing system would likely impose additional administrative and financial burdens on legitimate users while having limited impact on those deliberately circumventing the law.</w:t>
-      </w:r>
-    </w:p>
-    <w:p>
-      <w:r>
-        <w:t>In my view, the more effective approach would be to strengthen law enforcement's technical capabilities, international cooperation, and targeted investigative methods rather than restrict access to encryption.</w:t>
-      </w:r>
-    </w:p>
-    <w:p>
-      <w:pPr>
-        <w:shd w:val="clear" w:color="auto" w:fill="D1D1D1" w:themeFill="background2" w:themeFillShade="E6"/>
-      </w:pPr>
-    </w:p>
-    <w:p>
-      <w:pPr>
-        <w:rPr>
-          <w:b/>
-          <w:bCs/>
-        </w:rPr>
-      </w:pPr>
-      <w:r>
-        <w:rPr>
-          <w:b/>
-          <w:bCs/>
-        </w:rPr>
         <w:t>Question to Moohammed Aldhaheri</w:t>
       </w:r>
     </w:p>
@@ -2317,13 +3749,7 @@
         </w:numPr>
       </w:pPr>
       <w:r>
-        <w:t xml:space="preserve">If encryption remains completely unrestricted, what proportionate alternative would you propose when law enforcement has a valid judicial </w:t>
-      </w:r>
-      <w:r>
-        <w:t>authorization,</w:t>
-      </w:r>
-      <w:r>
-        <w:t xml:space="preserve"> but strong encryption makes critical evidence inaccessible?</w:t>
+        <w:t>If encryption remains completely unrestricted, what proportionate alternative would you propose when law enforcement has a valid judicial authorization, but strong encryption makes critical evidence inaccessible?</w:t>
       </w:r>
     </w:p>
     <w:p>
@@ -2348,17 +3774,7 @@
     </w:p>
     <w:p>
       <w:r>
-        <w:t>Your question about inaccessible evidence is harder. I would not promise that investigators can always obtain it. With appropriate legal authority, they might seek relevant material on an available device, from another participant, or in business records. Whether those routes exist and produce useful evidence depends on the particular case. None is a guaranteed substitute for the encrypted content.</w:t>
-      </w:r>
-      <w:r>
-        <w:t xml:space="preserve"> </w:t>
-      </w:r>
-      <w:r>
-        <w:t xml:space="preserve">If all lawful avenues fail, there may be a real loss to the investigation and to victims. That deserves serious weight. My objection is that a user licence does not, by itself, change the </w:t>
-      </w:r>
-      <w:r>
-        <w:lastRenderedPageBreak/>
-        <w:t>technical availability of that evidence. Any proposed access obligation needs a separate explanation of how it would work, what risks it creates and why those costs are proportionate.</w:t>
+        <w:t>Your question about inaccessible evidence is harder. I would not promise that investigators can always obtain it. With appropriate legal authority, they might seek relevant material on an available device, from another participant, or in business records. Whether those routes exist and produce useful evidence depends on the particular case. None is a guaranteed substitute for the encrypted content. If all lawful avenues fail, there may be a real loss to the investigation and to victims. That deserves serious weight. My objection is that a user licence does not, by itself, change the technical availability of that evidence. Any proposed access obligation needs a separate explanation of how it would work, what risks it creates and why those costs are proportionate.</w:t>
       </w:r>
     </w:p>
     <w:p/>
@@ -2428,7 +3844,11 @@
     </w:p>
     <w:p>
       <w:r>
-        <w:t xml:space="preserve">1. For the targeted device tools, If they were in the wrong hands they would be a problem assuming they do not require any authentication to use. If I were to be the one handling such tools they would be required to be stored on an air gapped server and only accessible under court order and with great oversight from the digital forensics division of whatever hypothetical agency this is. </w:t>
+        <w:t xml:space="preserve">1. For the targeted device tools, If they were in the wrong hands they would be a problem assuming they do not require any authentication to use. If I were to be the one handling such tools they would </w:t>
+      </w:r>
+      <w:r>
+        <w:lastRenderedPageBreak/>
+        <w:t xml:space="preserve">be required to be stored on an air gapped server and only accessible under court order and with great oversight from the digital forensics division of whatever hypothetical agency this is. </w:t>
       </w:r>
     </w:p>
     <w:p>
@@ -2451,14 +3871,10 @@
         <w:pStyle w:val="Heading2"/>
       </w:pPr>
       <w:r>
-        <w:lastRenderedPageBreak/>
-        <w:t xml:space="preserve">Week </w:t>
-      </w:r>
-      <w:r>
-        <w:t>5</w:t>
-      </w:r>
-      <w:r>
-        <w:t xml:space="preserve"> – Debates &amp; Discussions</w:t>
+        <w:t>Week 5 – Debates &amp; Discussions</w:t>
+      </w:r>
+      <w:r>
+        <w:t xml:space="preserve"> – N/A</w:t>
       </w:r>
     </w:p>
     <w:p>
@@ -2466,13 +3882,10 @@
         <w:pStyle w:val="Heading2"/>
       </w:pPr>
       <w:r>
-        <w:t xml:space="preserve">Week </w:t>
-      </w:r>
-      <w:r>
-        <w:t>6</w:t>
-      </w:r>
-      <w:r>
-        <w:t xml:space="preserve"> – Debates &amp; Discussions</w:t>
+        <w:t>Week 6 – Debates &amp; Discussions</w:t>
+      </w:r>
+      <w:r>
+        <w:t xml:space="preserve"> – N/A</w:t>
       </w:r>
     </w:p>
     <w:p>
@@ -2502,13 +3915,7 @@
         <w:pStyle w:val="Heading2"/>
       </w:pPr>
       <w:r>
-        <w:t xml:space="preserve">Week </w:t>
-      </w:r>
-      <w:r>
-        <w:t>2</w:t>
-      </w:r>
-      <w:r>
-        <w:t xml:space="preserve"> </w:t>
+        <w:t xml:space="preserve">Week 2 </w:t>
       </w:r>
       <w:r>
         <w:t>–</w:t>
@@ -2522,13 +3929,7 @@
         <w:pStyle w:val="Heading2"/>
       </w:pPr>
       <w:r>
-        <w:t xml:space="preserve">Week </w:t>
-      </w:r>
-      <w:r>
-        <w:t>3</w:t>
-      </w:r>
-      <w:r>
-        <w:t xml:space="preserve"> - Journal</w:t>
+        <w:t>Week 3 - Journal</w:t>
       </w:r>
     </w:p>
     <w:p>
@@ -2536,13 +3937,7 @@
         <w:pStyle w:val="Heading2"/>
       </w:pPr>
       <w:r>
-        <w:t xml:space="preserve">Week </w:t>
-      </w:r>
-      <w:r>
-        <w:t>4</w:t>
-      </w:r>
-      <w:r>
-        <w:t xml:space="preserve"> - Journal</w:t>
+        <w:t>Week 4 - Journal</w:t>
       </w:r>
     </w:p>
     <w:p>
@@ -2550,13 +3945,7 @@
         <w:pStyle w:val="Heading2"/>
       </w:pPr>
       <w:r>
-        <w:t xml:space="preserve">Week </w:t>
-      </w:r>
-      <w:r>
-        <w:t>5</w:t>
-      </w:r>
-      <w:r>
-        <w:t xml:space="preserve"> - Journal</w:t>
+        <w:t>Week 5 - Journal</w:t>
       </w:r>
     </w:p>
     <w:p>
@@ -2572,13 +3961,7 @@
         </w:rPr>
       </w:pPr>
       <w:r>
-        <w:t xml:space="preserve">Week </w:t>
-      </w:r>
-      <w:r>
-        <w:t>6</w:t>
-      </w:r>
-      <w:r>
-        <w:t xml:space="preserve"> - Journal</w:t>
+        <w:t>Week 6 - Journal</w:t>
       </w:r>
     </w:p>
     <w:p>
@@ -2589,7 +3972,7 @@
       </w:pPr>
     </w:p>
     <w:sectPr>
-      <w:headerReference w:type="default" r:id="rId20"/>
+      <w:headerReference w:type="default" r:id="rId24"/>
       <w:pgSz w:w="12240" w:h="15840"/>
       <w:pgMar w:top="1440" w:right="1440" w:bottom="1440" w:left="1440" w:header="708" w:footer="708" w:gutter="0"/>
       <w:cols w:space="708"/>
@@ -2779,6 +4162,119 @@
     </w:lvl>
   </w:abstractNum>
   <w:abstractNum w:abstractNumId="1" w15:restartNumberingAfterBreak="0">
+    <w:nsid w:val="0E8076E4"/>
+    <w:multiLevelType w:val="multilevel"/>
+    <w:tmpl w:val="D8D02882"/>
+    <w:lvl w:ilvl="0">
+      <w:start w:val="1"/>
+      <w:numFmt w:val="decimal"/>
+      <w:lvlText w:val="%1."/>
+      <w:lvlJc w:val="left"/>
+      <w:pPr>
+        <w:tabs>
+          <w:tab w:val="num" w:pos="720"/>
+        </w:tabs>
+        <w:ind w:left="720" w:hanging="360"/>
+      </w:pPr>
+    </w:lvl>
+    <w:lvl w:ilvl="1" w:tentative="1">
+      <w:start w:val="1"/>
+      <w:numFmt w:val="decimal"/>
+      <w:lvlText w:val="%2."/>
+      <w:lvlJc w:val="left"/>
+      <w:pPr>
+        <w:tabs>
+          <w:tab w:val="num" w:pos="1440"/>
+        </w:tabs>
+        <w:ind w:left="1440" w:hanging="360"/>
+      </w:pPr>
+    </w:lvl>
+    <w:lvl w:ilvl="2" w:tentative="1">
+      <w:start w:val="1"/>
+      <w:numFmt w:val="decimal"/>
+      <w:lvlText w:val="%3."/>
+      <w:lvlJc w:val="left"/>
+      <w:pPr>
+        <w:tabs>
+          <w:tab w:val="num" w:pos="2160"/>
+        </w:tabs>
+        <w:ind w:left="2160" w:hanging="360"/>
+      </w:pPr>
+    </w:lvl>
+    <w:lvl w:ilvl="3" w:tentative="1">
+      <w:start w:val="1"/>
+      <w:numFmt w:val="decimal"/>
+      <w:lvlText w:val="%4."/>
+      <w:lvlJc w:val="left"/>
+      <w:pPr>
+        <w:tabs>
+          <w:tab w:val="num" w:pos="2880"/>
+        </w:tabs>
+        <w:ind w:left="2880" w:hanging="360"/>
+      </w:pPr>
+    </w:lvl>
+    <w:lvl w:ilvl="4" w:tentative="1">
+      <w:start w:val="1"/>
+      <w:numFmt w:val="decimal"/>
+      <w:lvlText w:val="%5."/>
+      <w:lvlJc w:val="left"/>
+      <w:pPr>
+        <w:tabs>
+          <w:tab w:val="num" w:pos="3600"/>
+        </w:tabs>
+        <w:ind w:left="3600" w:hanging="360"/>
+      </w:pPr>
+    </w:lvl>
+    <w:lvl w:ilvl="5" w:tentative="1">
+      <w:start w:val="1"/>
+      <w:numFmt w:val="decimal"/>
+      <w:lvlText w:val="%6."/>
+      <w:lvlJc w:val="left"/>
+      <w:pPr>
+        <w:tabs>
+          <w:tab w:val="num" w:pos="4320"/>
+        </w:tabs>
+        <w:ind w:left="4320" w:hanging="360"/>
+      </w:pPr>
+    </w:lvl>
+    <w:lvl w:ilvl="6" w:tentative="1">
+      <w:start w:val="1"/>
+      <w:numFmt w:val="decimal"/>
+      <w:lvlText w:val="%7."/>
+      <w:lvlJc w:val="left"/>
+      <w:pPr>
+        <w:tabs>
+          <w:tab w:val="num" w:pos="5040"/>
+        </w:tabs>
+        <w:ind w:left="5040" w:hanging="360"/>
+      </w:pPr>
+    </w:lvl>
+    <w:lvl w:ilvl="7" w:tentative="1">
+      <w:start w:val="1"/>
+      <w:numFmt w:val="decimal"/>
+      <w:lvlText w:val="%8."/>
+      <w:lvlJc w:val="left"/>
+      <w:pPr>
+        <w:tabs>
+          <w:tab w:val="num" w:pos="5760"/>
+        </w:tabs>
+        <w:ind w:left="5760" w:hanging="360"/>
+      </w:pPr>
+    </w:lvl>
+    <w:lvl w:ilvl="8" w:tentative="1">
+      <w:start w:val="1"/>
+      <w:numFmt w:val="decimal"/>
+      <w:lvlText w:val="%9."/>
+      <w:lvlJc w:val="left"/>
+      <w:pPr>
+        <w:tabs>
+          <w:tab w:val="num" w:pos="6480"/>
+        </w:tabs>
+        <w:ind w:left="6480" w:hanging="360"/>
+      </w:pPr>
+    </w:lvl>
+  </w:abstractNum>
+  <w:abstractNum w:abstractNumId="2" w15:restartNumberingAfterBreak="0">
     <w:nsid w:val="223F114C"/>
     <w:multiLevelType w:val="hybridMultilevel"/>
     <w:tmpl w:val="9C96BCFE"/>
@@ -2891,7 +4387,7 @@
       </w:rPr>
     </w:lvl>
   </w:abstractNum>
-  <w:abstractNum w:abstractNumId="2" w15:restartNumberingAfterBreak="0">
+  <w:abstractNum w:abstractNumId="3" w15:restartNumberingAfterBreak="0">
     <w:nsid w:val="301E1CF1"/>
     <w:multiLevelType w:val="hybridMultilevel"/>
     <w:tmpl w:val="250A740A"/>
@@ -3004,7 +4500,7 @@
       </w:rPr>
     </w:lvl>
   </w:abstractNum>
-  <w:abstractNum w:abstractNumId="3" w15:restartNumberingAfterBreak="0">
+  <w:abstractNum w:abstractNumId="4" w15:restartNumberingAfterBreak="0">
     <w:nsid w:val="44C16498"/>
     <w:multiLevelType w:val="hybridMultilevel"/>
     <w:tmpl w:val="B902F04E"/>
@@ -3117,7 +4613,7 @@
       </w:rPr>
     </w:lvl>
   </w:abstractNum>
-  <w:abstractNum w:abstractNumId="4" w15:restartNumberingAfterBreak="0">
+  <w:abstractNum w:abstractNumId="5" w15:restartNumberingAfterBreak="0">
     <w:nsid w:val="58935272"/>
     <w:multiLevelType w:val="hybridMultilevel"/>
     <w:tmpl w:val="7242EDAE"/>
@@ -3206,7 +4702,7 @@
       </w:pPr>
     </w:lvl>
   </w:abstractNum>
-  <w:abstractNum w:abstractNumId="5" w15:restartNumberingAfterBreak="0">
+  <w:abstractNum w:abstractNumId="6" w15:restartNumberingAfterBreak="0">
     <w:nsid w:val="58ED3D54"/>
     <w:multiLevelType w:val="hybridMultilevel"/>
     <w:tmpl w:val="1402E1B4"/>
@@ -3319,7 +4815,7 @@
       </w:rPr>
     </w:lvl>
   </w:abstractNum>
-  <w:abstractNum w:abstractNumId="6" w15:restartNumberingAfterBreak="0">
+  <w:abstractNum w:abstractNumId="7" w15:restartNumberingAfterBreak="0">
     <w:nsid w:val="5EA2370F"/>
     <w:multiLevelType w:val="hybridMultilevel"/>
     <w:tmpl w:val="DC600B04"/>
@@ -3432,7 +4928,7 @@
       </w:rPr>
     </w:lvl>
   </w:abstractNum>
-  <w:abstractNum w:abstractNumId="7" w15:restartNumberingAfterBreak="0">
+  <w:abstractNum w:abstractNumId="8" w15:restartNumberingAfterBreak="0">
     <w:nsid w:val="62C276B4"/>
     <w:multiLevelType w:val="hybridMultilevel"/>
     <w:tmpl w:val="4FD2B6AC"/>
@@ -3545,7 +5041,7 @@
       </w:rPr>
     </w:lvl>
   </w:abstractNum>
-  <w:abstractNum w:abstractNumId="8" w15:restartNumberingAfterBreak="0">
+  <w:abstractNum w:abstractNumId="9" w15:restartNumberingAfterBreak="0">
     <w:nsid w:val="65763416"/>
     <w:multiLevelType w:val="hybridMultilevel"/>
     <w:tmpl w:val="DA6C1E48"/>
@@ -3658,7 +5154,7 @@
       </w:rPr>
     </w:lvl>
   </w:abstractNum>
-  <w:abstractNum w:abstractNumId="9" w15:restartNumberingAfterBreak="0">
+  <w:abstractNum w:abstractNumId="10" w15:restartNumberingAfterBreak="0">
     <w:nsid w:val="6AF800D6"/>
     <w:multiLevelType w:val="hybridMultilevel"/>
     <w:tmpl w:val="88907234"/>
@@ -3771,7 +5267,7 @@
       </w:rPr>
     </w:lvl>
   </w:abstractNum>
-  <w:abstractNum w:abstractNumId="10" w15:restartNumberingAfterBreak="0">
+  <w:abstractNum w:abstractNumId="11" w15:restartNumberingAfterBreak="0">
     <w:nsid w:val="6D7D1590"/>
     <w:multiLevelType w:val="multilevel"/>
     <w:tmpl w:val="B9881524"/>
@@ -3886,43 +5382,46 @@
     </w:lvl>
   </w:abstractNum>
   <w:num w:numId="1" w16cid:durableId="672493255">
-    <w:abstractNumId w:val="4"/>
+    <w:abstractNumId w:val="5"/>
   </w:num>
   <w:num w:numId="2" w16cid:durableId="1626812309">
-    <w:abstractNumId w:val="4"/>
+    <w:abstractNumId w:val="5"/>
   </w:num>
   <w:num w:numId="3" w16cid:durableId="716785031">
-    <w:abstractNumId w:val="4"/>
+    <w:abstractNumId w:val="5"/>
   </w:num>
   <w:num w:numId="4" w16cid:durableId="951284882">
+    <w:abstractNumId w:val="11"/>
+  </w:num>
+  <w:num w:numId="5" w16cid:durableId="1950164105">
+    <w:abstractNumId w:val="7"/>
+  </w:num>
+  <w:num w:numId="6" w16cid:durableId="163327631">
+    <w:abstractNumId w:val="9"/>
+  </w:num>
+  <w:num w:numId="7" w16cid:durableId="679087502">
+    <w:abstractNumId w:val="2"/>
+  </w:num>
+  <w:num w:numId="8" w16cid:durableId="1471556523">
     <w:abstractNumId w:val="10"/>
   </w:num>
-  <w:num w:numId="5" w16cid:durableId="1950164105">
+  <w:num w:numId="9" w16cid:durableId="1565749884">
     <w:abstractNumId w:val="6"/>
-  </w:num>
-  <w:num w:numId="6" w16cid:durableId="163327631">
-    <w:abstractNumId w:val="8"/>
-  </w:num>
-  <w:num w:numId="7" w16cid:durableId="679087502">
-    <w:abstractNumId w:val="1"/>
-  </w:num>
-  <w:num w:numId="8" w16cid:durableId="1471556523">
-    <w:abstractNumId w:val="9"/>
-  </w:num>
-  <w:num w:numId="9" w16cid:durableId="1565749884">
-    <w:abstractNumId w:val="5"/>
   </w:num>
   <w:num w:numId="10" w16cid:durableId="509219453">
     <w:abstractNumId w:val="0"/>
   </w:num>
   <w:num w:numId="11" w16cid:durableId="1143235534">
-    <w:abstractNumId w:val="2"/>
+    <w:abstractNumId w:val="3"/>
   </w:num>
   <w:num w:numId="12" w16cid:durableId="826750393">
-    <w:abstractNumId w:val="3"/>
+    <w:abstractNumId w:val="4"/>
   </w:num>
   <w:num w:numId="13" w16cid:durableId="374358275">
-    <w:abstractNumId w:val="7"/>
+    <w:abstractNumId w:val="8"/>
+  </w:num>
+  <w:num w:numId="14" w16cid:durableId="744574165">
+    <w:abstractNumId w:val="1"/>
   </w:num>
 </w:numbering>
 </file>
@@ -4999,6 +6498,18 @@
       <w:shd w:val="clear" w:color="auto" w:fill="E1DFDD"/>
     </w:rPr>
   </w:style>
+  <w:style w:type="character" w:styleId="FollowedHyperlink">
+    <w:name w:val="FollowedHyperlink"/>
+    <w:basedOn w:val="DefaultParagraphFont"/>
+    <w:uiPriority w:val="99"/>
+    <w:semiHidden/>
+    <w:unhideWhenUsed/>
+    <w:rsid w:val="00BF5803"/>
+    <w:rPr>
+      <w:color w:val="96607D" w:themeColor="followedHyperlink"/>
+      <w:u w:val="single"/>
+    </w:rPr>
+  </w:style>
 </w:styles>
 </file>
 

</xml_diff>

<commit_message>
Week 6 - Journal and Reflections
</commit_message>
<xml_diff>
--- a/COMP607 - Portfolio.docx
+++ b/COMP607 - Portfolio.docx
@@ -2597,7 +2597,23 @@
     </w:p>
     <w:p>
       <w:r>
-        <w:t xml:space="preserve">Abelson, H., Anderson, R., Bellovin, S. M., Benaloh, J., Blaze, M., Diffie, W., Gilmore, J., Green, M., Landau, S., Neumann, P. G., Rivest, R. L., Schiller, J. I., Schneier, B., Specter, M., &amp; Weitzner, D. (2015). </w:t>
+        <w:t xml:space="preserve">Abelson, H., Anderson, R., </w:t>
+      </w:r>
+      <w:proofErr w:type="spellStart"/>
+      <w:r>
+        <w:t>Bellovin</w:t>
+      </w:r>
+      <w:proofErr w:type="spellEnd"/>
+      <w:r>
+        <w:t xml:space="preserve">, S. M., </w:t>
+      </w:r>
+      <w:proofErr w:type="spellStart"/>
+      <w:r>
+        <w:t>Benaloh</w:t>
+      </w:r>
+      <w:proofErr w:type="spellEnd"/>
+      <w:r>
+        <w:t xml:space="preserve">, J., Blaze, M., Diffie, W., Gilmore, J., Green, M., Landau, S., Neumann, P. G., Rivest, R. L., Schiller, J. I., Schneier, B., Specter, M., &amp; Weitzner, D. (2015). </w:t>
       </w:r>
       <w:r>
         <w:rPr>
@@ -3077,11 +3093,134 @@
     </w:p>
     <w:p>
       <w:pPr>
+        <w:spacing w:before="1" w:line="247" w:lineRule="auto"/>
+        <w:ind w:left="360" w:right="105"/>
+      </w:pPr>
+    </w:p>
+    <w:p>
+      <w:pPr>
         <w:pStyle w:val="Heading2"/>
       </w:pPr>
       <w:r>
+        <w:t>Week 6 – Reflection</w:t>
+      </w:r>
+    </w:p>
+    <w:p>
+      <w:r>
+        <w:rPr>
+          <w:b/>
+          <w:bCs/>
+        </w:rPr>
+        <w:t>Software Patents and Intellectual Property</w:t>
+      </w:r>
+    </w:p>
+    <w:p>
+      <w:r>
+        <w:t>This week's examination of software patents made me reflect on the challenges of protecting technological innovation while ensuring that intellectual property laws do not unnecessarily restrict software development. As a software engineer with a particular interest in artificial intelligence and machine learning, I found this topic especially relevant because modern software development frequently involves combining existing algorithms, frameworks, and technologies to solve new problems. This raises an important question: At what point does applying existing technology in a new way become an invention deserving patent protection?</w:t>
+      </w:r>
+    </w:p>
+    <w:p>
+      <w:r>
         <w:lastRenderedPageBreak/>
-        <w:t>Week 6 – Reflection</w:t>
+        <w:t>For the collaborative wiki activity, I selected Recentive Analytics, Inc. v. Fox Corp. (2025), a legal dispute involving four patents related to the application of machine learning algorithms to television broadcasting schedules and network optimization. Recentive argued that its systems introduced innovative methods for generating and dynamically updating schedules, while Fox maintained that the patents merely applied conventional machine learning techniques to existing scheduling problems. In April 2025, the United States Court of Appeals for the Federal Circuit ruled in favour of Fox, concluding that the patent claims were ineligible under 35 U.S.C. § 101.</w:t>
+      </w:r>
+    </w:p>
+    <w:p>
+      <w:r>
+        <w:t>One of the most interesting aspects of this case was the distinction between developing a useful software application and creating a patentable technological invention. In software engineering, we regularly use established algorithms and programming techniques to develop solutions for different industries. For example, machine learning algorithms can be applied to satellite operations, autonomous systems, predictive maintenance, or industrial automation. Although these applications may require considerable technical expertise and creativity, the underlying algorithms are not necessarily new. The Recentive decision made me reconsider whether the novelty of an application should be sufficient to justify patent protection or whether the invention must demonstrate a more substantial technological contribution.</w:t>
+      </w:r>
+    </w:p>
+    <w:p>
+      <w:r>
+        <w:t>My initial reaction was that applying machine learning to a previously unexplored problem could reasonably qualify as innovation. However, after examining the legal arguments and the court's reasoning, I began to appreciate the potential consequences of granting patents that broadly cover conventional computational techniques. If companies could obtain exclusive rights simply by applying existing algorithms to different industries, software developers might face unnecessary restrictions when implementing commonly understood methods. This could discourage competition, increase development costs, and potentially slow technological progress.</w:t>
+      </w:r>
+    </w:p>
+    <w:p>
+      <w:r>
+        <w:t>At the same time, I do not believe that patent protection should be limited exclusively to the invention of entirely new algorithms. Software innovation often occurs at the architectural or system level. A developer might introduce a novel training mechanism, improve computational efficiency, reduce resource consumption, or design an innovative integration of existing components. These improvements can represent meaningful technological advances even when the underlying mathematical methods are already established. From my perspective, the important consideration should be whether the claimed invention demonstrates a specific and identifiable technological improvement rather than simply automating an existing process.</w:t>
+      </w:r>
+    </w:p>
+    <w:p>
+      <w:r>
+        <w:t>Another important lesson from this week's activities was understanding the difference between patent eligibility and other requirements for obtaining a patent. The Alice Corp. v. CLS Bank International (2014) decision established a framework for determining whether patent claims involve abstract ideas and whether they contain an inventive concept sufficient to qualify for protection. I found this distinction particularly relevant because an application can be technically sophisticated, commercially valuable, and useful without necessarily satisfying the legal requirements for patent eligibility. As engineers, we tend to evaluate innovation according to functionality, performance, efficiency, and practical results. Patent law introduces an additional perspective that requires examining precisely what technological contribution is being claimed.</w:t>
+      </w:r>
+    </w:p>
+    <w:p>
+      <w:r>
+        <w:t xml:space="preserve">The ethical and economic implications of software patents also deserve consideration. On one hand, patents provide inventors and organizations with opportunities to protect investments in </w:t>
+      </w:r>
+      <w:r>
+        <w:lastRenderedPageBreak/>
+        <w:t>research and development. Without appropriate intellectual property protection, companies might be reluctant to invest substantial resources in developing new technologies. On the other hand, overly broad patents can create barriers for smaller organizations, independent developers, and researchers who may lack the financial resources necessary to challenge questionable patent claims. This creates a difficult balance between rewarding innovation and preserving an environment in which technological knowledge can continue to evolve.</w:t>
+      </w:r>
+    </w:p>
+    <w:p>
+      <w:r>
+        <w:t>The case also made me reflect on my own work involving artificial intelligence and intelligent systems. When developing machine learning applications, it is common to rely on established techniques such as neural networks, reinforcement learning, and optimization algorithms. The value of a solution often comes from how these components are designed, integrated, and adapted to a particular problem. However, I now recognize that demonstrating technical value is not equivalent to establishing patent eligibility. If I were developing a technology intended for patent protection, I would need to document the specific technical improvements, explain how they differ from existing approaches, and clearly identify the inventive contribution.</w:t>
+      </w:r>
+    </w:p>
+    <w:p>
+      <w:r>
+        <w:t>Overall, I agree with the Federal Circuit's decision in Recentive Analytics, Inc. v. Fox Corp. based on the patent claims examined. I believe that allowing broad patents over conventional machine learning applications could create unnecessary obstacles to innovation. Nevertheless, I also recognize that the legal framework must remain flexible enough to protect genuinely inventive AI technologies, including innovations that combine existing methods in technically novel ways.</w:t>
+      </w:r>
+    </w:p>
+    <w:p>
+      <w:r>
+        <w:t>My main takeaway from this week's work is that technological innovation and patentable invention are not necessarily the same thing. Software patents should encourage meaningful advances without granting excessive control over fundamental algorithms, mathematical methods, or general computational concepts. As artificial intelligence continues to develop, I believe understanding this distinction will become increasingly important for software engineers, researchers, and organizations seeking to balance intellectual property protection with technological progress.</w:t>
+      </w:r>
+    </w:p>
+    <w:p>
+      <w:pPr>
+        <w:rPr>
+          <w:b/>
+          <w:bCs/>
+        </w:rPr>
+      </w:pPr>
+      <w:r>
+        <w:rPr>
+          <w:b/>
+          <w:bCs/>
+        </w:rPr>
+        <w:t>References</w:t>
+      </w:r>
+    </w:p>
+    <w:p>
+      <w:pPr>
+        <w:pStyle w:val="ListParagraph"/>
+        <w:numPr>
+          <w:ilvl w:val="0"/>
+          <w:numId w:val="21"/>
+        </w:numPr>
+        <w:spacing w:after="0" w:line="360" w:lineRule="auto"/>
+      </w:pPr>
+      <w:r>
+        <w:t>Alice Corp. Pty. Ltd. v. CLS Bank International, 573 U.S. 208 (2014).</w:t>
+      </w:r>
+    </w:p>
+    <w:p>
+      <w:pPr>
+        <w:pStyle w:val="ListParagraph"/>
+        <w:numPr>
+          <w:ilvl w:val="0"/>
+          <w:numId w:val="21"/>
+        </w:numPr>
+        <w:spacing w:after="0" w:line="360" w:lineRule="auto"/>
+      </w:pPr>
+      <w:r>
+        <w:t>Recentive Analytics, Inc. v. Fox Corp., No. 2023-2437 (Fed. Cir. Apr. 18, 2025).</w:t>
+      </w:r>
+    </w:p>
+    <w:p>
+      <w:pPr>
+        <w:pStyle w:val="ListParagraph"/>
+        <w:numPr>
+          <w:ilvl w:val="0"/>
+          <w:numId w:val="21"/>
+        </w:numPr>
+        <w:spacing w:after="0" w:line="360" w:lineRule="auto"/>
+      </w:pPr>
+      <w:r>
+        <w:t>United States Court of Appeals for the Federal Circuit. (2025, April 18). Recentive Analytics, Inc. v. Fox Corp., No. 2023-2437[Court opinion].</w:t>
       </w:r>
     </w:p>
     <w:p>
@@ -3089,6 +3228,7 @@
         <w:pStyle w:val="Heading1"/>
       </w:pPr>
       <w:r>
+        <w:lastRenderedPageBreak/>
         <w:t>Debates &amp; Discussions</w:t>
       </w:r>
     </w:p>
@@ -3247,8 +3387,11 @@
     </w:p>
     <w:p>
       <w:r>
+        <w:t xml:space="preserve">On the utilitarian balance: I'll admit that this can't be calculated precisely, and that's a real limitation of applying Mill (1863) to a policy question. What we can do is make the system measurable. Licensed providers could be required to publish transparency reports on how many lawful requests they receive and fulfil, independent reviewers could track breaches and misuse, </w:t>
+      </w:r>
+      <w:r>
         <w:lastRenderedPageBreak/>
-        <w:t>On the utilitarian balance: I'll admit that this can't be calculated precisely, and that's a real limitation of applying Mill (1863) to a policy question. What we can do is make the system measurable. Licensed providers could be required to publish transparency reports on how many lawful requests they receive and fulfil, independent reviewers could track breaches and misuse, and the law could include a sunset clause. If the evidence showed the privacy and security harms outweighed the benefit to investigations, the policy would have to be changed or ended. To me, a policy that can be tested and corrected is better than having no rules and no way to measure the harm at all</w:t>
+        <w:t>and the law could include a sunset clause. If the evidence showed the privacy and security harms outweighed the benefit to investigations, the policy would have to be changed or ended. To me, a policy that can be tested and corrected is better than having no rules and no way to measure the harm at all</w:t>
       </w:r>
     </w:p>
     <w:p>
@@ -3268,7 +3411,23 @@
           <w:b/>
           <w:bCs/>
         </w:rPr>
-        <w:t>Question to Wadee Arbash:</w:t>
+        <w:t xml:space="preserve">Question to Wadee </w:t>
+      </w:r>
+      <w:proofErr w:type="spellStart"/>
+      <w:r>
+        <w:rPr>
+          <w:b/>
+          <w:bCs/>
+        </w:rPr>
+        <w:t>Arbash</w:t>
+      </w:r>
+      <w:proofErr w:type="spellEnd"/>
+      <w:r>
+        <w:rPr>
+          <w:b/>
+          <w:bCs/>
+        </w:rPr>
+        <w:t>:</w:t>
       </w:r>
     </w:p>
     <w:p>
@@ -3312,7 +3471,23 @@
           <w:b/>
           <w:bCs/>
         </w:rPr>
-        <w:t>Reply from Wadee Arbash:</w:t>
+        <w:t xml:space="preserve">Reply from Wadee </w:t>
+      </w:r>
+      <w:proofErr w:type="spellStart"/>
+      <w:r>
+        <w:rPr>
+          <w:b/>
+          <w:bCs/>
+        </w:rPr>
+        <w:t>Arbash</w:t>
+      </w:r>
+      <w:proofErr w:type="spellEnd"/>
+      <w:r>
+        <w:rPr>
+          <w:b/>
+          <w:bCs/>
+        </w:rPr>
+        <w:t>:</w:t>
       </w:r>
     </w:p>
     <w:p>
@@ -3367,7 +3542,6 @@
     </w:p>
     <w:p>
       <w:r>
-        <w:lastRenderedPageBreak/>
         <w:t>Rob, you make an important distinction between weakening encryption itself and regulating the organizations that provide it. My questions are:</w:t>
       </w:r>
     </w:p>
@@ -3380,6 +3554,7 @@
         </w:numPr>
       </w:pPr>
       <w:r>
+        <w:lastRenderedPageBreak/>
         <w:t>If criminals can obtain or develop strong encryption outside the licensed system, how would licensing legitimate providers meaningfully reduce criminal use without primarily increasing restrictions on law-abiding users?</w:t>
       </w:r>
     </w:p>
@@ -3447,15 +3622,12 @@
     </w:p>
     <w:p>
       <w:r>
-        <w:t xml:space="preserve">However, I also recognize that this does not make the security problem disappear. It arguably creates another extremely valuable target. If a third party possesses information capable of recovering encrypted data, then protecting that information becomes absolutely critical. Researchers such as Abelson et al. (2015) have argued that exceptional-access systems can introduce new vulnerabilities and additional complexity into systems that would otherwise be </w:t>
-      </w:r>
+        <w:t>However, I also recognize that this does not make the security problem disappear. It arguably creates another extremely valuable target. If a third party possesses information capable of recovering encrypted data, then protecting that information becomes absolutely critical. Researchers such as Abelson et al. (2015) have argued that exceptional-access systems can introduce new vulnerabilities and additional complexity into systems that would otherwise be designed specifically to prevent anyone other than the intended parties from decrypting the information.</w:t>
+      </w:r>
+    </w:p>
+    <w:p>
       <w:r>
         <w:lastRenderedPageBreak/>
-        <w:t>designed specifically to prevent anyone other than the intended parties from decrypting the information.</w:t>
-      </w:r>
-    </w:p>
-    <w:p>
-      <w:r>
         <w:t>Perhaps a system could reduce that risk by requiring multiple independent parties to authorize recovery rather than allowing any one organization to possess complete access, but even then the risk could never be completely removed.</w:t>
       </w:r>
     </w:p>
@@ -3481,7 +3653,23 @@
     </w:p>
     <w:p>
       <w:r>
-        <w:t xml:space="preserve">Abelson, H., Anderson, R., Bellovin, S. M., Benaloh, J., Blaze, M., Diffie, W., Gilmore, J., Green, M., Landau, S., Neumann, P. G., Rivest, R. L., Schiller, J. I., Schneier, B., Specter, M. A., &amp; Weitzner, D. J. (2015). Keys under doormats: Mandating insecurity by requiring government access to all data and communications. Journal of Cybersecurity, 1(1), 69–79. </w:t>
+        <w:t xml:space="preserve">Abelson, H., Anderson, R., </w:t>
+      </w:r>
+      <w:proofErr w:type="spellStart"/>
+      <w:r>
+        <w:t>Bellovin</w:t>
+      </w:r>
+      <w:proofErr w:type="spellEnd"/>
+      <w:r>
+        <w:t xml:space="preserve">, S. M., </w:t>
+      </w:r>
+      <w:proofErr w:type="spellStart"/>
+      <w:r>
+        <w:t>Benaloh</w:t>
+      </w:r>
+      <w:proofErr w:type="spellEnd"/>
+      <w:r>
+        <w:t xml:space="preserve">, J., Blaze, M., Diffie, W., Gilmore, J., Green, M., Landau, S., Neumann, P. G., Rivest, R. L., Schiller, J. I., Schneier, B., Specter, M. A., &amp; Weitzner, D. J. (2015). Keys under doormats: Mandating insecurity by requiring government access to all data and communications. Journal of Cybersecurity, 1(1), 69–79. </w:t>
       </w:r>
     </w:p>
     <w:p>
@@ -3514,8 +3702,17 @@
           <w:b/>
           <w:bCs/>
         </w:rPr>
-        <w:t>Question to Oussama Zeaiter</w:t>
-      </w:r>
+        <w:t xml:space="preserve">Question to Oussama </w:t>
+      </w:r>
+      <w:proofErr w:type="spellStart"/>
+      <w:r>
+        <w:rPr>
+          <w:b/>
+          <w:bCs/>
+        </w:rPr>
+        <w:t>Zeaiter</w:t>
+      </w:r>
+      <w:proofErr w:type="spellEnd"/>
     </w:p>
     <w:p>
       <w:r>
@@ -3543,23 +3740,40 @@
         </w:numPr>
       </w:pPr>
       <w:r>
-        <w:t>In the Phantom Secure and EncroChat examples, authorities were ultimately able to investigate and dismantle those networks under existing laws. What additional capability would licensing provide that existing criminal laws and investigative powers did not?</w:t>
-      </w:r>
-    </w:p>
-    <w:p>
-      <w:pPr>
-        <w:rPr>
-          <w:b/>
-          <w:bCs/>
-        </w:rPr>
-      </w:pPr>
-      <w:r>
-        <w:rPr>
-          <w:b/>
-          <w:bCs/>
-        </w:rPr>
-        <w:t>Reply from Oussama Zeaiter</w:t>
-      </w:r>
+        <w:t xml:space="preserve">In the Phantom Secure and </w:t>
+      </w:r>
+      <w:proofErr w:type="spellStart"/>
+      <w:r>
+        <w:t>EncroChat</w:t>
+      </w:r>
+      <w:proofErr w:type="spellEnd"/>
+      <w:r>
+        <w:t xml:space="preserve"> examples, authorities were ultimately able to investigate and dismantle those networks under existing laws. What additional capability would licensing provide that existing criminal laws and investigative powers did not?</w:t>
+      </w:r>
+    </w:p>
+    <w:p>
+      <w:pPr>
+        <w:rPr>
+          <w:b/>
+          <w:bCs/>
+        </w:rPr>
+      </w:pPr>
+      <w:r>
+        <w:rPr>
+          <w:b/>
+          <w:bCs/>
+        </w:rPr>
+        <w:t xml:space="preserve">Reply from Oussama </w:t>
+      </w:r>
+      <w:proofErr w:type="spellStart"/>
+      <w:r>
+        <w:rPr>
+          <w:b/>
+          <w:bCs/>
+        </w:rPr>
+        <w:t>Zeaiter</w:t>
+      </w:r>
+      <w:proofErr w:type="spellEnd"/>
     </w:p>
     <w:p>
       <w:pPr>
@@ -3604,12 +3818,12 @@
           <w:b/>
           <w:bCs/>
         </w:rPr>
+        <w:t>Question to Hossam Abdelmagid</w:t>
+      </w:r>
+    </w:p>
+    <w:p>
+      <w:r>
         <w:lastRenderedPageBreak/>
-        <w:t>Question to Hossam Abdelmagid</w:t>
-      </w:r>
-    </w:p>
-    <w:p>
-      <w:r>
         <w:t>Hossam, you raise an important point about the practical difficulty of licensing a technology whose standards are already publicly available. I have two questions:</w:t>
       </w:r>
     </w:p>
@@ -3719,12 +3933,37 @@
           <w:b/>
           <w:bCs/>
         </w:rPr>
+        <w:t xml:space="preserve">Question to </w:t>
+      </w:r>
+      <w:proofErr w:type="spellStart"/>
+      <w:r>
+        <w:rPr>
+          <w:b/>
+          <w:bCs/>
+        </w:rPr>
+        <w:t>Moohammed</w:t>
+      </w:r>
+      <w:proofErr w:type="spellEnd"/>
+      <w:r>
+        <w:rPr>
+          <w:b/>
+          <w:bCs/>
+        </w:rPr>
+        <w:t xml:space="preserve"> </w:t>
+      </w:r>
+      <w:proofErr w:type="spellStart"/>
+      <w:r>
+        <w:rPr>
+          <w:b/>
+          <w:bCs/>
+        </w:rPr>
+        <w:t>Aldhaheri</w:t>
+      </w:r>
+      <w:proofErr w:type="spellEnd"/>
+    </w:p>
+    <w:p>
+      <w:r>
         <w:lastRenderedPageBreak/>
-        <w:t>Question to Moohammed Aldhaheri</w:t>
-      </w:r>
-    </w:p>
-    <w:p>
-      <w:r>
         <w:t>You raise an important concern about fairness and about who would have the authority to determine access to strong encryption. I have two questions:</w:t>
       </w:r>
     </w:p>
@@ -3764,8 +4003,33 @@
           <w:b/>
           <w:bCs/>
         </w:rPr>
-        <w:t>Reply from Moohammed Aldhaheri</w:t>
-      </w:r>
+        <w:t xml:space="preserve">Reply from </w:t>
+      </w:r>
+      <w:proofErr w:type="spellStart"/>
+      <w:r>
+        <w:rPr>
+          <w:b/>
+          <w:bCs/>
+        </w:rPr>
+        <w:t>Moohammed</w:t>
+      </w:r>
+      <w:proofErr w:type="spellEnd"/>
+      <w:r>
+        <w:rPr>
+          <w:b/>
+          <w:bCs/>
+        </w:rPr>
+        <w:t xml:space="preserve"> </w:t>
+      </w:r>
+      <w:proofErr w:type="spellStart"/>
+      <w:r>
+        <w:rPr>
+          <w:b/>
+          <w:bCs/>
+        </w:rPr>
+        <w:t>Aldhaheri</w:t>
+      </w:r>
+      <w:proofErr w:type="spellEnd"/>
     </w:p>
     <w:p>
       <w:r>
@@ -3853,7 +4117,15 @@
     </w:p>
     <w:p>
       <w:r>
-        <w:t>I feel I should elaborate that these forensic tools do not only focus on getting encrypted data but also focus on getting metadata. For example even if a device is talking to another device encrypted you can glean the information that those two devices were communicating during certain periods. There would be ways around such meta data collection via Tor or VPN services but I see this as always being a cat and mouse scenario.</w:t>
+        <w:t xml:space="preserve">I feel I should elaborate that these forensic tools do not only focus on getting encrypted data but also focus on getting metadata. For example even if a device is talking to another device encrypted you can glean the information that those two devices were communicating during certain periods. There would be ways around such meta data collection via Tor or VPN </w:t>
+      </w:r>
+      <w:proofErr w:type="gramStart"/>
+      <w:r>
+        <w:t>services</w:t>
+      </w:r>
+      <w:proofErr w:type="gramEnd"/>
+      <w:r>
+        <w:t xml:space="preserve"> but I see this as always being a cat and mouse scenario.</w:t>
       </w:r>
     </w:p>
     <w:p>
@@ -3911,6 +4183,71 @@
       </w:r>
     </w:p>
     <w:p>
+      <w:r>
+        <w:t>Week 1 – Journal (September 14–20, 2026)</w:t>
+      </w:r>
+    </w:p>
+    <w:p>
+      <w:pPr>
+        <w:pStyle w:val="ListParagraph"/>
+        <w:numPr>
+          <w:ilvl w:val="0"/>
+          <w:numId w:val="15"/>
+        </w:numPr>
+      </w:pPr>
+      <w:r>
+        <w:t>Reviewed the COMP607 course orientation, objectives, assessment requirements, and learning activities.</w:t>
+      </w:r>
+    </w:p>
+    <w:p>
+      <w:pPr>
+        <w:pStyle w:val="ListParagraph"/>
+        <w:numPr>
+          <w:ilvl w:val="0"/>
+          <w:numId w:val="15"/>
+        </w:numPr>
+      </w:pPr>
+      <w:r>
+        <w:t>Began Unit 1, focusing on ethical principles and their relevance to information technology.</w:t>
+      </w:r>
+    </w:p>
+    <w:p>
+      <w:pPr>
+        <w:pStyle w:val="ListParagraph"/>
+        <w:numPr>
+          <w:ilvl w:val="0"/>
+          <w:numId w:val="15"/>
+        </w:numPr>
+      </w:pPr>
+      <w:r>
+        <w:t>Completed introductory readings on ethics and professional responsibilities.</w:t>
+      </w:r>
+    </w:p>
+    <w:p>
+      <w:pPr>
+        <w:pStyle w:val="ListParagraph"/>
+        <w:numPr>
+          <w:ilvl w:val="0"/>
+          <w:numId w:val="15"/>
+        </w:numPr>
+      </w:pPr>
+      <w:r>
+        <w:t>Updated my course profile and participated in the introductory forum.</w:t>
+      </w:r>
+    </w:p>
+    <w:p>
+      <w:pPr>
+        <w:pStyle w:val="ListParagraph"/>
+        <w:numPr>
+          <w:ilvl w:val="0"/>
+          <w:numId w:val="15"/>
+        </w:numPr>
+      </w:pPr>
+      <w:r>
+        <w:t>Considered how ethical decision-making applies to software engineering, artificial intelligence, and information systems.</w:t>
+      </w:r>
+    </w:p>
+    <w:p>
       <w:pPr>
         <w:pStyle w:val="Heading2"/>
       </w:pPr>
@@ -3925,11 +4262,148 @@
       </w:r>
     </w:p>
     <w:p>
+      <w:r>
+        <w:t>Week 2 – Journal (September 21–27, 2026)</w:t>
+      </w:r>
+    </w:p>
+    <w:p>
+      <w:pPr>
+        <w:pStyle w:val="ListParagraph"/>
+        <w:numPr>
+          <w:ilvl w:val="0"/>
+          <w:numId w:val="16"/>
+        </w:numPr>
+      </w:pPr>
+      <w:r>
+        <w:t>Completed Unit 1 and continued examining ethical theories and their practical applications.</w:t>
+      </w:r>
+    </w:p>
+    <w:p>
+      <w:pPr>
+        <w:pStyle w:val="ListParagraph"/>
+        <w:numPr>
+          <w:ilvl w:val="0"/>
+          <w:numId w:val="16"/>
+        </w:numPr>
+      </w:pPr>
+      <w:r>
+        <w:t>Reviewed philosophical perspectives, including Kantian ethics and utilitarianism.</w:t>
+      </w:r>
+    </w:p>
+    <w:p>
+      <w:pPr>
+        <w:pStyle w:val="ListParagraph"/>
+        <w:numPr>
+          <w:ilvl w:val="0"/>
+          <w:numId w:val="16"/>
+        </w:numPr>
+      </w:pPr>
+      <w:r>
+        <w:t>Prepared and submitted my statement of personal interests and ethical beliefs.</w:t>
+      </w:r>
+    </w:p>
+    <w:p>
+      <w:pPr>
+        <w:pStyle w:val="ListParagraph"/>
+        <w:numPr>
+          <w:ilvl w:val="0"/>
+          <w:numId w:val="16"/>
+        </w:numPr>
+      </w:pPr>
+      <w:r>
+        <w:t>Examined professional responsibilities involving confidentiality, accountability, and technological development.</w:t>
+      </w:r>
+    </w:p>
+    <w:p>
+      <w:pPr>
+        <w:pStyle w:val="ListParagraph"/>
+        <w:numPr>
+          <w:ilvl w:val="0"/>
+          <w:numId w:val="16"/>
+        </w:numPr>
+      </w:pPr>
+      <w:r>
+        <w:t>Began background readings on privacy in preparation for the following week's activities.</w:t>
+      </w:r>
+    </w:p>
+    <w:p>
       <w:pPr>
         <w:pStyle w:val="Heading2"/>
       </w:pPr>
       <w:r>
-        <w:t>Week 3 - Journal</w:t>
+        <w:lastRenderedPageBreak/>
+        <w:t xml:space="preserve">Week 3 </w:t>
+      </w:r>
+      <w:r>
+        <w:t>–</w:t>
+      </w:r>
+      <w:r>
+        <w:t xml:space="preserve"> Journal</w:t>
+      </w:r>
+    </w:p>
+    <w:p>
+      <w:r>
+        <w:t>Week 3 – Journal (September 28 – October 4, 2026)</w:t>
+      </w:r>
+    </w:p>
+    <w:p>
+      <w:pPr>
+        <w:pStyle w:val="ListParagraph"/>
+        <w:numPr>
+          <w:ilvl w:val="0"/>
+          <w:numId w:val="17"/>
+        </w:numPr>
+      </w:pPr>
+      <w:r>
+        <w:t>Began Unit 2, focusing on privacy, data protection, and information security.</w:t>
+      </w:r>
+    </w:p>
+    <w:p>
+      <w:pPr>
+        <w:pStyle w:val="ListParagraph"/>
+        <w:numPr>
+          <w:ilvl w:val="0"/>
+          <w:numId w:val="17"/>
+        </w:numPr>
+      </w:pPr>
+      <w:r>
+        <w:t>Researched Canadian privacy legislation, including PIPEDA and Ontario's FIPPA.</w:t>
+      </w:r>
+    </w:p>
+    <w:p>
+      <w:pPr>
+        <w:pStyle w:val="ListParagraph"/>
+        <w:numPr>
+          <w:ilvl w:val="0"/>
+          <w:numId w:val="17"/>
+        </w:numPr>
+      </w:pPr>
+      <w:r>
+        <w:t>Examined privacy challenges associated with artificial intelligence, surveillance, and personal data collection.</w:t>
+      </w:r>
+    </w:p>
+    <w:p>
+      <w:pPr>
+        <w:pStyle w:val="ListParagraph"/>
+        <w:numPr>
+          <w:ilvl w:val="0"/>
+          <w:numId w:val="17"/>
+        </w:numPr>
+      </w:pPr>
+      <w:r>
+        <w:t>Participated in the team debate concerning the proposition, “Privacy is dead and it's a good thing.”</w:t>
+      </w:r>
+    </w:p>
+    <w:p>
+      <w:pPr>
+        <w:pStyle w:val="ListParagraph"/>
+        <w:numPr>
+          <w:ilvl w:val="0"/>
+          <w:numId w:val="17"/>
+        </w:numPr>
+      </w:pPr>
+      <w:r>
+        <w:t>Reflected on the importance of informed consent, data minimization, and individual control over personal information.</w:t>
       </w:r>
     </w:p>
     <w:p>
@@ -3937,7 +4411,90 @@
         <w:pStyle w:val="Heading2"/>
       </w:pPr>
       <w:r>
-        <w:t>Week 4 - Journal</w:t>
+        <w:t xml:space="preserve">Week 4 </w:t>
+      </w:r>
+      <w:r>
+        <w:t>–</w:t>
+      </w:r>
+      <w:r>
+        <w:t xml:space="preserve"> Journal</w:t>
+      </w:r>
+    </w:p>
+    <w:p>
+      <w:r>
+        <w:t>Week 4 – Journal (October 5–11, 2026)</w:t>
+      </w:r>
+    </w:p>
+    <w:p>
+      <w:pPr>
+        <w:pStyle w:val="ListParagraph"/>
+        <w:numPr>
+          <w:ilvl w:val="0"/>
+          <w:numId w:val="18"/>
+        </w:numPr>
+      </w:pPr>
+      <w:r>
+        <w:t>Completed Unit 2 and examined the relationship between encryption, privacy, and public safety.</w:t>
+      </w:r>
+    </w:p>
+    <w:p>
+      <w:pPr>
+        <w:pStyle w:val="ListParagraph"/>
+        <w:numPr>
+          <w:ilvl w:val="0"/>
+          <w:numId w:val="18"/>
+        </w:numPr>
+      </w:pPr>
+      <w:r>
+        <w:t>Participated as an observer in the Oxford-style debate concerning restrictions on strong encryption.</w:t>
+      </w:r>
+    </w:p>
+    <w:p>
+      <w:pPr>
+        <w:pStyle w:val="ListParagraph"/>
+        <w:numPr>
+          <w:ilvl w:val="0"/>
+          <w:numId w:val="18"/>
+        </w:numPr>
+      </w:pPr>
+      <w:r>
+        <w:t>Submitted questions to participants supporting and opposing encryption licensing.</w:t>
+      </w:r>
+    </w:p>
+    <w:p>
+      <w:pPr>
+        <w:pStyle w:val="ListParagraph"/>
+        <w:numPr>
+          <w:ilvl w:val="0"/>
+          <w:numId w:val="18"/>
+        </w:numPr>
+      </w:pPr>
+      <w:r>
+        <w:t>Examined technical challenges involving encryption backdoors, key escrow, government access, and cybersecurity risks.</w:t>
+      </w:r>
+    </w:p>
+    <w:p>
+      <w:pPr>
+        <w:pStyle w:val="ListParagraph"/>
+        <w:numPr>
+          <w:ilvl w:val="0"/>
+          <w:numId w:val="18"/>
+        </w:numPr>
+      </w:pPr>
+      <w:r>
+        <w:t>Engaged with classmates' responses and evaluated the practical implications of encryption regulation.</w:t>
+      </w:r>
+    </w:p>
+    <w:p>
+      <w:pPr>
+        <w:pStyle w:val="ListParagraph"/>
+        <w:numPr>
+          <w:ilvl w:val="0"/>
+          <w:numId w:val="18"/>
+        </w:numPr>
+      </w:pPr>
+      <w:r>
+        <w:t>Began background readings on intellectual property.</w:t>
       </w:r>
     </w:p>
     <w:p>
@@ -3945,23 +4502,206 @@
         <w:pStyle w:val="Heading2"/>
       </w:pPr>
       <w:r>
-        <w:t>Week 5 - Journal</w:t>
+        <w:t xml:space="preserve">Week 5 </w:t>
+      </w:r>
+      <w:r>
+        <w:t>–</w:t>
+      </w:r>
+      <w:r>
+        <w:t xml:space="preserve"> Journal</w:t>
+      </w:r>
+    </w:p>
+    <w:p>
+      <w:r>
+        <w:t>Week 5 – Journal (October 12–18, 2026)</w:t>
+      </w:r>
+    </w:p>
+    <w:p>
+      <w:pPr>
+        <w:pStyle w:val="ListParagraph"/>
+        <w:numPr>
+          <w:ilvl w:val="0"/>
+          <w:numId w:val="19"/>
+        </w:numPr>
+      </w:pPr>
+      <w:r>
+        <w:t>Began Unit 3, focusing on intellectual property rights and software licensing.</w:t>
+      </w:r>
+    </w:p>
+    <w:p>
+      <w:pPr>
+        <w:pStyle w:val="ListParagraph"/>
+        <w:numPr>
+          <w:ilvl w:val="0"/>
+          <w:numId w:val="19"/>
+        </w:numPr>
+      </w:pPr>
+      <w:r>
+        <w:t>Participated in the pyramid discussion addressing circumstances under which violating a software license agreement might be ethically justified.</w:t>
+      </w:r>
+    </w:p>
+    <w:p>
+      <w:pPr>
+        <w:pStyle w:val="ListParagraph"/>
+        <w:numPr>
+          <w:ilvl w:val="0"/>
+          <w:numId w:val="19"/>
+        </w:numPr>
+      </w:pPr>
+      <w:r>
+        <w:t>Examined End-User License Agreements (EULAs), software ownership, and intellectual property protection.</w:t>
+      </w:r>
+    </w:p>
+    <w:p>
+      <w:pPr>
+        <w:pStyle w:val="ListParagraph"/>
+        <w:numPr>
+          <w:ilvl w:val="0"/>
+          <w:numId w:val="19"/>
+        </w:numPr>
+      </w:pPr>
+      <w:r>
+        <w:t>Reviewed licensing issues involving open-source software, the GNU General Public License, and interoperability.</w:t>
+      </w:r>
+    </w:p>
+    <w:p>
+      <w:pPr>
+        <w:pStyle w:val="ListParagraph"/>
+        <w:numPr>
+          <w:ilvl w:val="0"/>
+          <w:numId w:val="19"/>
+        </w:numPr>
+      </w:pPr>
+      <w:r>
+        <w:t>Considered the balance between protecting software developers' intellectual property and respecting legitimate users' rights.</w:t>
+      </w:r>
+    </w:p>
+    <w:p>
+      <w:pPr>
+        <w:pStyle w:val="ListParagraph"/>
+        <w:numPr>
+          <w:ilvl w:val="0"/>
+          <w:numId w:val="19"/>
+        </w:numPr>
+      </w:pPr>
+      <w:r>
+        <w:t>Continued background readings on intellectual property and software patents.</w:t>
       </w:r>
     </w:p>
     <w:p>
       <w:pPr>
         <w:pStyle w:val="Heading2"/>
-        <w:rPr>
-          <w:rStyle w:val="IntenseReference"/>
-          <w:b w:val="0"/>
-          <w:bCs w:val="0"/>
-          <w:smallCaps w:val="0"/>
-          <w:color w:val="auto"/>
-          <w:spacing w:val="0"/>
-        </w:rPr>
-      </w:pPr>
-      <w:r>
-        <w:t>Week 6 - Journal</w:t>
+      </w:pPr>
+      <w:r>
+        <w:t xml:space="preserve">Week 6 </w:t>
+      </w:r>
+      <w:r>
+        <w:t>–</w:t>
+      </w:r>
+      <w:r>
+        <w:t xml:space="preserve"> Journal</w:t>
+      </w:r>
+    </w:p>
+    <w:p>
+      <w:r>
+        <w:t>Week 6 – Journal (October 19–25, 2026)</w:t>
+      </w:r>
+    </w:p>
+    <w:p>
+      <w:pPr>
+        <w:pStyle w:val="ListParagraph"/>
+        <w:numPr>
+          <w:ilvl w:val="0"/>
+          <w:numId w:val="20"/>
+        </w:numPr>
+      </w:pPr>
+      <w:r>
+        <w:t>Completed Unit 3, focusing on intellectual property and software patent law.</w:t>
+      </w:r>
+    </w:p>
+    <w:p>
+      <w:pPr>
+        <w:pStyle w:val="ListParagraph"/>
+        <w:numPr>
+          <w:ilvl w:val="0"/>
+          <w:numId w:val="20"/>
+        </w:numPr>
+      </w:pPr>
+      <w:r>
+        <w:lastRenderedPageBreak/>
+        <w:t>Participated in the collaborative wiki activity examining the advantages and disadvantages of software patents.</w:t>
+      </w:r>
+    </w:p>
+    <w:p>
+      <w:pPr>
+        <w:pStyle w:val="ListParagraph"/>
+        <w:numPr>
+          <w:ilvl w:val="0"/>
+          <w:numId w:val="20"/>
+        </w:numPr>
+      </w:pPr>
+      <w:r>
+        <w:t>Selected Recentive Analytics, Inc. v. Fox Corp. (2025) as my software patent case study.</w:t>
+      </w:r>
+    </w:p>
+    <w:p>
+      <w:pPr>
+        <w:pStyle w:val="ListParagraph"/>
+        <w:numPr>
+          <w:ilvl w:val="0"/>
+          <w:numId w:val="20"/>
+        </w:numPr>
+      </w:pPr>
+      <w:r>
+        <w:t>Researched the dispute involving machine learning algorithms used to optimize television broadcasting schedules.</w:t>
+      </w:r>
+    </w:p>
+    <w:p>
+      <w:pPr>
+        <w:pStyle w:val="ListParagraph"/>
+        <w:numPr>
+          <w:ilvl w:val="0"/>
+          <w:numId w:val="20"/>
+        </w:numPr>
+      </w:pPr>
+      <w:r>
+        <w:t>Examined the legal arguments concerning patent eligibility under 35 U.S.C. § 101 and the Alice framework.</w:t>
+      </w:r>
+    </w:p>
+    <w:p>
+      <w:pPr>
+        <w:pStyle w:val="ListParagraph"/>
+        <w:numPr>
+          <w:ilvl w:val="0"/>
+          <w:numId w:val="20"/>
+        </w:numPr>
+      </w:pPr>
+      <w:r>
+        <w:t>Analyzed the Federal Circuit's decision and its implications for artificial intelligence innovation and software development.</w:t>
+      </w:r>
+    </w:p>
+    <w:p>
+      <w:pPr>
+        <w:pStyle w:val="ListParagraph"/>
+        <w:numPr>
+          <w:ilvl w:val="0"/>
+          <w:numId w:val="20"/>
+        </w:numPr>
+      </w:pPr>
+      <w:r>
+        <w:t>Prepared my case study and evaluated the balance between protecting technological inventions and preventing overly broad software patents.</w:t>
+      </w:r>
+    </w:p>
+    <w:p>
+      <w:pPr>
+        <w:pStyle w:val="ListParagraph"/>
+        <w:numPr>
+          <w:ilvl w:val="0"/>
+          <w:numId w:val="20"/>
+        </w:numPr>
+      </w:pPr>
+      <w:r>
+        <w:t>Began background readings on computer crime in preparation for Unit 4.</w:t>
       </w:r>
     </w:p>
     <w:p>
@@ -4049,6 +4789,119 @@
 <file path=word/numbering.xml><?xml version="1.0" encoding="utf-8"?>
 <w:numbering xmlns:wpc="http://schemas.microsoft.com/office/word/2010/wordprocessingCanvas" xmlns:cx="http://schemas.microsoft.com/office/drawing/2014/chartex" xmlns:cx1="http://schemas.microsoft.com/office/drawing/2015/9/8/chartex" xmlns:cx2="http://schemas.microsoft.com/office/drawing/2015/10/21/chartex" xmlns:cx3="http://schemas.microsoft.com/office/drawing/2016/5/9/chartex" xmlns:cx4="http://schemas.microsoft.com/office/drawing/2016/5/10/chartex" xmlns:cx5="http://schemas.microsoft.com/office/drawing/2016/5/11/chartex" xmlns:cx6="http://schemas.microsoft.com/office/drawing/2016/5/12/chartex" xmlns:cx7="http://schemas.microsoft.com/office/drawing/2016/5/13/chartex" xmlns:cx8="http://schemas.microsoft.com/office/drawing/2016/5/14/chartex" xmlns:mc="http://schemas.openxmlformats.org/markup-compatibility/2006" xmlns:aink="http://schemas.microsoft.com/office/drawing/2016/ink" xmlns:am3d="http://schemas.microsoft.com/office/drawing/2017/model3d" xmlns:o="urn:schemas-microsoft-com:office:office" xmlns:oel="http://schemas.microsoft.com/office/2019/extlst" xmlns:r="http://schemas.openxmlformats.org/officeDocument/2006/relationships" xmlns:m="http://schemas.openxmlformats.org/officeDocument/2006/math" xmlns:v="urn:schemas-microsoft-com:vml" xmlns:wp14="http://schemas.microsoft.com/office/word/2010/wordprocessingDrawing" xmlns:wp="http://schemas.openxmlformats.org/drawingml/2006/wordprocessingDrawing" xmlns:w10="urn:schemas-microsoft-com:office:word" xmlns:w="http://schemas.openxmlformats.org/wordprocessingml/2006/main" xmlns:w14="http://schemas.microsoft.com/office/word/2010/wordml" xmlns:w15="http://schemas.microsoft.com/office/word/2012/wordml" xmlns:w16cex="http://schemas.microsoft.com/office/word/2018/wordml/cex" xmlns:w16cid="http://schemas.microsoft.com/office/word/2016/wordml/cid" xmlns:w16="http://schemas.microsoft.com/office/word/2018/wordml" xmlns:w16du="http://schemas.microsoft.com/office/word/2023/wordml/word16du" xmlns:w16sdtdh="http://schemas.microsoft.com/office/word/2020/wordml/sdtdatahash" xmlns:w16sdtfl="http://schemas.microsoft.com/office/word/2024/wordml/sdtformatlock" xmlns:w16se="http://schemas.microsoft.com/office/word/2015/wordml/symex" xmlns:wpg="http://schemas.microsoft.com/office/word/2010/wordprocessingGroup" xmlns:wpi="http://schemas.microsoft.com/office/word/2010/wordprocessingInk" xmlns:wne="http://schemas.microsoft.com/office/word/2006/wordml" xmlns:wps="http://schemas.microsoft.com/office/word/2010/wordprocessingShape" mc:Ignorable="w14 w15 w16se w16cid w16 w16cex w16sdtdh w16sdtfl w16du wp14">
   <w:abstractNum w:abstractNumId="0" w15:restartNumberingAfterBreak="0">
+    <w:nsid w:val="0422480B"/>
+    <w:multiLevelType w:val="hybridMultilevel"/>
+    <w:tmpl w:val="1674B58E"/>
+    <w:lvl w:ilvl="0" w:tplc="10090001">
+      <w:start w:val="1"/>
+      <w:numFmt w:val="bullet"/>
+      <w:lvlText w:val=""/>
+      <w:lvlJc w:val="left"/>
+      <w:pPr>
+        <w:ind w:left="720" w:hanging="360"/>
+      </w:pPr>
+      <w:rPr>
+        <w:rFonts w:ascii="Symbol" w:hAnsi="Symbol" w:hint="default"/>
+      </w:rPr>
+    </w:lvl>
+    <w:lvl w:ilvl="1" w:tplc="10090003" w:tentative="1">
+      <w:start w:val="1"/>
+      <w:numFmt w:val="bullet"/>
+      <w:lvlText w:val="o"/>
+      <w:lvlJc w:val="left"/>
+      <w:pPr>
+        <w:ind w:left="1440" w:hanging="360"/>
+      </w:pPr>
+      <w:rPr>
+        <w:rFonts w:ascii="Courier New" w:hAnsi="Courier New" w:cs="Courier New" w:hint="default"/>
+      </w:rPr>
+    </w:lvl>
+    <w:lvl w:ilvl="2" w:tplc="10090005" w:tentative="1">
+      <w:start w:val="1"/>
+      <w:numFmt w:val="bullet"/>
+      <w:lvlText w:val=""/>
+      <w:lvlJc w:val="left"/>
+      <w:pPr>
+        <w:ind w:left="2160" w:hanging="360"/>
+      </w:pPr>
+      <w:rPr>
+        <w:rFonts w:ascii="Wingdings" w:hAnsi="Wingdings" w:hint="default"/>
+      </w:rPr>
+    </w:lvl>
+    <w:lvl w:ilvl="3" w:tplc="10090001" w:tentative="1">
+      <w:start w:val="1"/>
+      <w:numFmt w:val="bullet"/>
+      <w:lvlText w:val=""/>
+      <w:lvlJc w:val="left"/>
+      <w:pPr>
+        <w:ind w:left="2880" w:hanging="360"/>
+      </w:pPr>
+      <w:rPr>
+        <w:rFonts w:ascii="Symbol" w:hAnsi="Symbol" w:hint="default"/>
+      </w:rPr>
+    </w:lvl>
+    <w:lvl w:ilvl="4" w:tplc="10090003" w:tentative="1">
+      <w:start w:val="1"/>
+      <w:numFmt w:val="bullet"/>
+      <w:lvlText w:val="o"/>
+      <w:lvlJc w:val="left"/>
+      <w:pPr>
+        <w:ind w:left="3600" w:hanging="360"/>
+      </w:pPr>
+      <w:rPr>
+        <w:rFonts w:ascii="Courier New" w:hAnsi="Courier New" w:cs="Courier New" w:hint="default"/>
+      </w:rPr>
+    </w:lvl>
+    <w:lvl w:ilvl="5" w:tplc="10090005" w:tentative="1">
+      <w:start w:val="1"/>
+      <w:numFmt w:val="bullet"/>
+      <w:lvlText w:val=""/>
+      <w:lvlJc w:val="left"/>
+      <w:pPr>
+        <w:ind w:left="4320" w:hanging="360"/>
+      </w:pPr>
+      <w:rPr>
+        <w:rFonts w:ascii="Wingdings" w:hAnsi="Wingdings" w:hint="default"/>
+      </w:rPr>
+    </w:lvl>
+    <w:lvl w:ilvl="6" w:tplc="10090001" w:tentative="1">
+      <w:start w:val="1"/>
+      <w:numFmt w:val="bullet"/>
+      <w:lvlText w:val=""/>
+      <w:lvlJc w:val="left"/>
+      <w:pPr>
+        <w:ind w:left="5040" w:hanging="360"/>
+      </w:pPr>
+      <w:rPr>
+        <w:rFonts w:ascii="Symbol" w:hAnsi="Symbol" w:hint="default"/>
+      </w:rPr>
+    </w:lvl>
+    <w:lvl w:ilvl="7" w:tplc="10090003" w:tentative="1">
+      <w:start w:val="1"/>
+      <w:numFmt w:val="bullet"/>
+      <w:lvlText w:val="o"/>
+      <w:lvlJc w:val="left"/>
+      <w:pPr>
+        <w:ind w:left="5760" w:hanging="360"/>
+      </w:pPr>
+      <w:rPr>
+        <w:rFonts w:ascii="Courier New" w:hAnsi="Courier New" w:cs="Courier New" w:hint="default"/>
+      </w:rPr>
+    </w:lvl>
+    <w:lvl w:ilvl="8" w:tplc="10090005" w:tentative="1">
+      <w:start w:val="1"/>
+      <w:numFmt w:val="bullet"/>
+      <w:lvlText w:val=""/>
+      <w:lvlJc w:val="left"/>
+      <w:pPr>
+        <w:ind w:left="6480" w:hanging="360"/>
+      </w:pPr>
+      <w:rPr>
+        <w:rFonts w:ascii="Wingdings" w:hAnsi="Wingdings" w:hint="default"/>
+      </w:rPr>
+    </w:lvl>
+  </w:abstractNum>
+  <w:abstractNum w:abstractNumId="1" w15:restartNumberingAfterBreak="0">
     <w:nsid w:val="05553433"/>
     <w:multiLevelType w:val="hybridMultilevel"/>
     <w:tmpl w:val="8EF6D97E"/>
@@ -4161,7 +5014,7 @@
       </w:rPr>
     </w:lvl>
   </w:abstractNum>
-  <w:abstractNum w:abstractNumId="1" w15:restartNumberingAfterBreak="0">
+  <w:abstractNum w:abstractNumId="2" w15:restartNumberingAfterBreak="0">
     <w:nsid w:val="0E8076E4"/>
     <w:multiLevelType w:val="multilevel"/>
     <w:tmpl w:val="D8D02882"/>
@@ -4274,7 +5127,7 @@
       </w:pPr>
     </w:lvl>
   </w:abstractNum>
-  <w:abstractNum w:abstractNumId="2" w15:restartNumberingAfterBreak="0">
+  <w:abstractNum w:abstractNumId="3" w15:restartNumberingAfterBreak="0">
     <w:nsid w:val="223F114C"/>
     <w:multiLevelType w:val="hybridMultilevel"/>
     <w:tmpl w:val="9C96BCFE"/>
@@ -4387,7 +5240,233 @@
       </w:rPr>
     </w:lvl>
   </w:abstractNum>
-  <w:abstractNum w:abstractNumId="3" w15:restartNumberingAfterBreak="0">
+  <w:abstractNum w:abstractNumId="4" w15:restartNumberingAfterBreak="0">
+    <w:nsid w:val="24ED4514"/>
+    <w:multiLevelType w:val="hybridMultilevel"/>
+    <w:tmpl w:val="BBA2EA50"/>
+    <w:lvl w:ilvl="0" w:tplc="10090001">
+      <w:start w:val="1"/>
+      <w:numFmt w:val="bullet"/>
+      <w:lvlText w:val=""/>
+      <w:lvlJc w:val="left"/>
+      <w:pPr>
+        <w:ind w:left="720" w:hanging="360"/>
+      </w:pPr>
+      <w:rPr>
+        <w:rFonts w:ascii="Symbol" w:hAnsi="Symbol" w:hint="default"/>
+      </w:rPr>
+    </w:lvl>
+    <w:lvl w:ilvl="1" w:tplc="10090003" w:tentative="1">
+      <w:start w:val="1"/>
+      <w:numFmt w:val="bullet"/>
+      <w:lvlText w:val="o"/>
+      <w:lvlJc w:val="left"/>
+      <w:pPr>
+        <w:ind w:left="1440" w:hanging="360"/>
+      </w:pPr>
+      <w:rPr>
+        <w:rFonts w:ascii="Courier New" w:hAnsi="Courier New" w:cs="Courier New" w:hint="default"/>
+      </w:rPr>
+    </w:lvl>
+    <w:lvl w:ilvl="2" w:tplc="10090005" w:tentative="1">
+      <w:start w:val="1"/>
+      <w:numFmt w:val="bullet"/>
+      <w:lvlText w:val=""/>
+      <w:lvlJc w:val="left"/>
+      <w:pPr>
+        <w:ind w:left="2160" w:hanging="360"/>
+      </w:pPr>
+      <w:rPr>
+        <w:rFonts w:ascii="Wingdings" w:hAnsi="Wingdings" w:hint="default"/>
+      </w:rPr>
+    </w:lvl>
+    <w:lvl w:ilvl="3" w:tplc="10090001" w:tentative="1">
+      <w:start w:val="1"/>
+      <w:numFmt w:val="bullet"/>
+      <w:lvlText w:val=""/>
+      <w:lvlJc w:val="left"/>
+      <w:pPr>
+        <w:ind w:left="2880" w:hanging="360"/>
+      </w:pPr>
+      <w:rPr>
+        <w:rFonts w:ascii="Symbol" w:hAnsi="Symbol" w:hint="default"/>
+      </w:rPr>
+    </w:lvl>
+    <w:lvl w:ilvl="4" w:tplc="10090003" w:tentative="1">
+      <w:start w:val="1"/>
+      <w:numFmt w:val="bullet"/>
+      <w:lvlText w:val="o"/>
+      <w:lvlJc w:val="left"/>
+      <w:pPr>
+        <w:ind w:left="3600" w:hanging="360"/>
+      </w:pPr>
+      <w:rPr>
+        <w:rFonts w:ascii="Courier New" w:hAnsi="Courier New" w:cs="Courier New" w:hint="default"/>
+      </w:rPr>
+    </w:lvl>
+    <w:lvl w:ilvl="5" w:tplc="10090005" w:tentative="1">
+      <w:start w:val="1"/>
+      <w:numFmt w:val="bullet"/>
+      <w:lvlText w:val=""/>
+      <w:lvlJc w:val="left"/>
+      <w:pPr>
+        <w:ind w:left="4320" w:hanging="360"/>
+      </w:pPr>
+      <w:rPr>
+        <w:rFonts w:ascii="Wingdings" w:hAnsi="Wingdings" w:hint="default"/>
+      </w:rPr>
+    </w:lvl>
+    <w:lvl w:ilvl="6" w:tplc="10090001" w:tentative="1">
+      <w:start w:val="1"/>
+      <w:numFmt w:val="bullet"/>
+      <w:lvlText w:val=""/>
+      <w:lvlJc w:val="left"/>
+      <w:pPr>
+        <w:ind w:left="5040" w:hanging="360"/>
+      </w:pPr>
+      <w:rPr>
+        <w:rFonts w:ascii="Symbol" w:hAnsi="Symbol" w:hint="default"/>
+      </w:rPr>
+    </w:lvl>
+    <w:lvl w:ilvl="7" w:tplc="10090003" w:tentative="1">
+      <w:start w:val="1"/>
+      <w:numFmt w:val="bullet"/>
+      <w:lvlText w:val="o"/>
+      <w:lvlJc w:val="left"/>
+      <w:pPr>
+        <w:ind w:left="5760" w:hanging="360"/>
+      </w:pPr>
+      <w:rPr>
+        <w:rFonts w:ascii="Courier New" w:hAnsi="Courier New" w:cs="Courier New" w:hint="default"/>
+      </w:rPr>
+    </w:lvl>
+    <w:lvl w:ilvl="8" w:tplc="10090005" w:tentative="1">
+      <w:start w:val="1"/>
+      <w:numFmt w:val="bullet"/>
+      <w:lvlText w:val=""/>
+      <w:lvlJc w:val="left"/>
+      <w:pPr>
+        <w:ind w:left="6480" w:hanging="360"/>
+      </w:pPr>
+      <w:rPr>
+        <w:rFonts w:ascii="Wingdings" w:hAnsi="Wingdings" w:hint="default"/>
+      </w:rPr>
+    </w:lvl>
+  </w:abstractNum>
+  <w:abstractNum w:abstractNumId="5" w15:restartNumberingAfterBreak="0">
+    <w:nsid w:val="25AF5F4A"/>
+    <w:multiLevelType w:val="hybridMultilevel"/>
+    <w:tmpl w:val="CB26112C"/>
+    <w:lvl w:ilvl="0" w:tplc="10090001">
+      <w:start w:val="1"/>
+      <w:numFmt w:val="bullet"/>
+      <w:lvlText w:val=""/>
+      <w:lvlJc w:val="left"/>
+      <w:pPr>
+        <w:ind w:left="720" w:hanging="360"/>
+      </w:pPr>
+      <w:rPr>
+        <w:rFonts w:ascii="Symbol" w:hAnsi="Symbol" w:hint="default"/>
+      </w:rPr>
+    </w:lvl>
+    <w:lvl w:ilvl="1" w:tplc="10090003" w:tentative="1">
+      <w:start w:val="1"/>
+      <w:numFmt w:val="bullet"/>
+      <w:lvlText w:val="o"/>
+      <w:lvlJc w:val="left"/>
+      <w:pPr>
+        <w:ind w:left="1440" w:hanging="360"/>
+      </w:pPr>
+      <w:rPr>
+        <w:rFonts w:ascii="Courier New" w:hAnsi="Courier New" w:cs="Courier New" w:hint="default"/>
+      </w:rPr>
+    </w:lvl>
+    <w:lvl w:ilvl="2" w:tplc="10090005" w:tentative="1">
+      <w:start w:val="1"/>
+      <w:numFmt w:val="bullet"/>
+      <w:lvlText w:val=""/>
+      <w:lvlJc w:val="left"/>
+      <w:pPr>
+        <w:ind w:left="2160" w:hanging="360"/>
+      </w:pPr>
+      <w:rPr>
+        <w:rFonts w:ascii="Wingdings" w:hAnsi="Wingdings" w:hint="default"/>
+      </w:rPr>
+    </w:lvl>
+    <w:lvl w:ilvl="3" w:tplc="10090001" w:tentative="1">
+      <w:start w:val="1"/>
+      <w:numFmt w:val="bullet"/>
+      <w:lvlText w:val=""/>
+      <w:lvlJc w:val="left"/>
+      <w:pPr>
+        <w:ind w:left="2880" w:hanging="360"/>
+      </w:pPr>
+      <w:rPr>
+        <w:rFonts w:ascii="Symbol" w:hAnsi="Symbol" w:hint="default"/>
+      </w:rPr>
+    </w:lvl>
+    <w:lvl w:ilvl="4" w:tplc="10090003" w:tentative="1">
+      <w:start w:val="1"/>
+      <w:numFmt w:val="bullet"/>
+      <w:lvlText w:val="o"/>
+      <w:lvlJc w:val="left"/>
+      <w:pPr>
+        <w:ind w:left="3600" w:hanging="360"/>
+      </w:pPr>
+      <w:rPr>
+        <w:rFonts w:ascii="Courier New" w:hAnsi="Courier New" w:cs="Courier New" w:hint="default"/>
+      </w:rPr>
+    </w:lvl>
+    <w:lvl w:ilvl="5" w:tplc="10090005" w:tentative="1">
+      <w:start w:val="1"/>
+      <w:numFmt w:val="bullet"/>
+      <w:lvlText w:val=""/>
+      <w:lvlJc w:val="left"/>
+      <w:pPr>
+        <w:ind w:left="4320" w:hanging="360"/>
+      </w:pPr>
+      <w:rPr>
+        <w:rFonts w:ascii="Wingdings" w:hAnsi="Wingdings" w:hint="default"/>
+      </w:rPr>
+    </w:lvl>
+    <w:lvl w:ilvl="6" w:tplc="10090001" w:tentative="1">
+      <w:start w:val="1"/>
+      <w:numFmt w:val="bullet"/>
+      <w:lvlText w:val=""/>
+      <w:lvlJc w:val="left"/>
+      <w:pPr>
+        <w:ind w:left="5040" w:hanging="360"/>
+      </w:pPr>
+      <w:rPr>
+        <w:rFonts w:ascii="Symbol" w:hAnsi="Symbol" w:hint="default"/>
+      </w:rPr>
+    </w:lvl>
+    <w:lvl w:ilvl="7" w:tplc="10090003" w:tentative="1">
+      <w:start w:val="1"/>
+      <w:numFmt w:val="bullet"/>
+      <w:lvlText w:val="o"/>
+      <w:lvlJc w:val="left"/>
+      <w:pPr>
+        <w:ind w:left="5760" w:hanging="360"/>
+      </w:pPr>
+      <w:rPr>
+        <w:rFonts w:ascii="Courier New" w:hAnsi="Courier New" w:cs="Courier New" w:hint="default"/>
+      </w:rPr>
+    </w:lvl>
+    <w:lvl w:ilvl="8" w:tplc="10090005" w:tentative="1">
+      <w:start w:val="1"/>
+      <w:numFmt w:val="bullet"/>
+      <w:lvlText w:val=""/>
+      <w:lvlJc w:val="left"/>
+      <w:pPr>
+        <w:ind w:left="6480" w:hanging="360"/>
+      </w:pPr>
+      <w:rPr>
+        <w:rFonts w:ascii="Wingdings" w:hAnsi="Wingdings" w:hint="default"/>
+      </w:rPr>
+    </w:lvl>
+  </w:abstractNum>
+  <w:abstractNum w:abstractNumId="6" w15:restartNumberingAfterBreak="0">
     <w:nsid w:val="301E1CF1"/>
     <w:multiLevelType w:val="hybridMultilevel"/>
     <w:tmpl w:val="250A740A"/>
@@ -4500,7 +5579,7 @@
       </w:rPr>
     </w:lvl>
   </w:abstractNum>
-  <w:abstractNum w:abstractNumId="4" w15:restartNumberingAfterBreak="0">
+  <w:abstractNum w:abstractNumId="7" w15:restartNumberingAfterBreak="0">
     <w:nsid w:val="44C16498"/>
     <w:multiLevelType w:val="hybridMultilevel"/>
     <w:tmpl w:val="B902F04E"/>
@@ -4613,7 +5692,120 @@
       </w:rPr>
     </w:lvl>
   </w:abstractNum>
-  <w:abstractNum w:abstractNumId="5" w15:restartNumberingAfterBreak="0">
+  <w:abstractNum w:abstractNumId="8" w15:restartNumberingAfterBreak="0">
+    <w:nsid w:val="4F971494"/>
+    <w:multiLevelType w:val="hybridMultilevel"/>
+    <w:tmpl w:val="7294FCE6"/>
+    <w:lvl w:ilvl="0" w:tplc="10090001">
+      <w:start w:val="1"/>
+      <w:numFmt w:val="bullet"/>
+      <w:lvlText w:val=""/>
+      <w:lvlJc w:val="left"/>
+      <w:pPr>
+        <w:ind w:left="720" w:hanging="360"/>
+      </w:pPr>
+      <w:rPr>
+        <w:rFonts w:ascii="Symbol" w:hAnsi="Symbol" w:hint="default"/>
+      </w:rPr>
+    </w:lvl>
+    <w:lvl w:ilvl="1" w:tplc="10090003" w:tentative="1">
+      <w:start w:val="1"/>
+      <w:numFmt w:val="bullet"/>
+      <w:lvlText w:val="o"/>
+      <w:lvlJc w:val="left"/>
+      <w:pPr>
+        <w:ind w:left="1440" w:hanging="360"/>
+      </w:pPr>
+      <w:rPr>
+        <w:rFonts w:ascii="Courier New" w:hAnsi="Courier New" w:cs="Courier New" w:hint="default"/>
+      </w:rPr>
+    </w:lvl>
+    <w:lvl w:ilvl="2" w:tplc="10090005" w:tentative="1">
+      <w:start w:val="1"/>
+      <w:numFmt w:val="bullet"/>
+      <w:lvlText w:val=""/>
+      <w:lvlJc w:val="left"/>
+      <w:pPr>
+        <w:ind w:left="2160" w:hanging="360"/>
+      </w:pPr>
+      <w:rPr>
+        <w:rFonts w:ascii="Wingdings" w:hAnsi="Wingdings" w:hint="default"/>
+      </w:rPr>
+    </w:lvl>
+    <w:lvl w:ilvl="3" w:tplc="10090001" w:tentative="1">
+      <w:start w:val="1"/>
+      <w:numFmt w:val="bullet"/>
+      <w:lvlText w:val=""/>
+      <w:lvlJc w:val="left"/>
+      <w:pPr>
+        <w:ind w:left="2880" w:hanging="360"/>
+      </w:pPr>
+      <w:rPr>
+        <w:rFonts w:ascii="Symbol" w:hAnsi="Symbol" w:hint="default"/>
+      </w:rPr>
+    </w:lvl>
+    <w:lvl w:ilvl="4" w:tplc="10090003" w:tentative="1">
+      <w:start w:val="1"/>
+      <w:numFmt w:val="bullet"/>
+      <w:lvlText w:val="o"/>
+      <w:lvlJc w:val="left"/>
+      <w:pPr>
+        <w:ind w:left="3600" w:hanging="360"/>
+      </w:pPr>
+      <w:rPr>
+        <w:rFonts w:ascii="Courier New" w:hAnsi="Courier New" w:cs="Courier New" w:hint="default"/>
+      </w:rPr>
+    </w:lvl>
+    <w:lvl w:ilvl="5" w:tplc="10090005" w:tentative="1">
+      <w:start w:val="1"/>
+      <w:numFmt w:val="bullet"/>
+      <w:lvlText w:val=""/>
+      <w:lvlJc w:val="left"/>
+      <w:pPr>
+        <w:ind w:left="4320" w:hanging="360"/>
+      </w:pPr>
+      <w:rPr>
+        <w:rFonts w:ascii="Wingdings" w:hAnsi="Wingdings" w:hint="default"/>
+      </w:rPr>
+    </w:lvl>
+    <w:lvl w:ilvl="6" w:tplc="10090001" w:tentative="1">
+      <w:start w:val="1"/>
+      <w:numFmt w:val="bullet"/>
+      <w:lvlText w:val=""/>
+      <w:lvlJc w:val="left"/>
+      <w:pPr>
+        <w:ind w:left="5040" w:hanging="360"/>
+      </w:pPr>
+      <w:rPr>
+        <w:rFonts w:ascii="Symbol" w:hAnsi="Symbol" w:hint="default"/>
+      </w:rPr>
+    </w:lvl>
+    <w:lvl w:ilvl="7" w:tplc="10090003" w:tentative="1">
+      <w:start w:val="1"/>
+      <w:numFmt w:val="bullet"/>
+      <w:lvlText w:val="o"/>
+      <w:lvlJc w:val="left"/>
+      <w:pPr>
+        <w:ind w:left="5760" w:hanging="360"/>
+      </w:pPr>
+      <w:rPr>
+        <w:rFonts w:ascii="Courier New" w:hAnsi="Courier New" w:cs="Courier New" w:hint="default"/>
+      </w:rPr>
+    </w:lvl>
+    <w:lvl w:ilvl="8" w:tplc="10090005" w:tentative="1">
+      <w:start w:val="1"/>
+      <w:numFmt w:val="bullet"/>
+      <w:lvlText w:val=""/>
+      <w:lvlJc w:val="left"/>
+      <w:pPr>
+        <w:ind w:left="6480" w:hanging="360"/>
+      </w:pPr>
+      <w:rPr>
+        <w:rFonts w:ascii="Wingdings" w:hAnsi="Wingdings" w:hint="default"/>
+      </w:rPr>
+    </w:lvl>
+  </w:abstractNum>
+  <w:abstractNum w:abstractNumId="9" w15:restartNumberingAfterBreak="0">
     <w:nsid w:val="58935272"/>
     <w:multiLevelType w:val="hybridMultilevel"/>
     <w:tmpl w:val="7242EDAE"/>
@@ -4702,7 +5894,7 @@
       </w:pPr>
     </w:lvl>
   </w:abstractNum>
-  <w:abstractNum w:abstractNumId="6" w15:restartNumberingAfterBreak="0">
+  <w:abstractNum w:abstractNumId="10" w15:restartNumberingAfterBreak="0">
     <w:nsid w:val="58ED3D54"/>
     <w:multiLevelType w:val="hybridMultilevel"/>
     <w:tmpl w:val="1402E1B4"/>
@@ -4815,7 +6007,7 @@
       </w:rPr>
     </w:lvl>
   </w:abstractNum>
-  <w:abstractNum w:abstractNumId="7" w15:restartNumberingAfterBreak="0">
+  <w:abstractNum w:abstractNumId="11" w15:restartNumberingAfterBreak="0">
     <w:nsid w:val="5EA2370F"/>
     <w:multiLevelType w:val="hybridMultilevel"/>
     <w:tmpl w:val="DC600B04"/>
@@ -4928,7 +6120,7 @@
       </w:rPr>
     </w:lvl>
   </w:abstractNum>
-  <w:abstractNum w:abstractNumId="8" w15:restartNumberingAfterBreak="0">
+  <w:abstractNum w:abstractNumId="12" w15:restartNumberingAfterBreak="0">
     <w:nsid w:val="62C276B4"/>
     <w:multiLevelType w:val="hybridMultilevel"/>
     <w:tmpl w:val="4FD2B6AC"/>
@@ -5041,7 +6233,120 @@
       </w:rPr>
     </w:lvl>
   </w:abstractNum>
-  <w:abstractNum w:abstractNumId="9" w15:restartNumberingAfterBreak="0">
+  <w:abstractNum w:abstractNumId="13" w15:restartNumberingAfterBreak="0">
+    <w:nsid w:val="64AC55F6"/>
+    <w:multiLevelType w:val="hybridMultilevel"/>
+    <w:tmpl w:val="F7CCD5A0"/>
+    <w:lvl w:ilvl="0" w:tplc="10090001">
+      <w:start w:val="1"/>
+      <w:numFmt w:val="bullet"/>
+      <w:lvlText w:val=""/>
+      <w:lvlJc w:val="left"/>
+      <w:pPr>
+        <w:ind w:left="720" w:hanging="360"/>
+      </w:pPr>
+      <w:rPr>
+        <w:rFonts w:ascii="Symbol" w:hAnsi="Symbol" w:hint="default"/>
+      </w:rPr>
+    </w:lvl>
+    <w:lvl w:ilvl="1" w:tplc="10090003" w:tentative="1">
+      <w:start w:val="1"/>
+      <w:numFmt w:val="bullet"/>
+      <w:lvlText w:val="o"/>
+      <w:lvlJc w:val="left"/>
+      <w:pPr>
+        <w:ind w:left="1440" w:hanging="360"/>
+      </w:pPr>
+      <w:rPr>
+        <w:rFonts w:ascii="Courier New" w:hAnsi="Courier New" w:cs="Courier New" w:hint="default"/>
+      </w:rPr>
+    </w:lvl>
+    <w:lvl w:ilvl="2" w:tplc="10090005" w:tentative="1">
+      <w:start w:val="1"/>
+      <w:numFmt w:val="bullet"/>
+      <w:lvlText w:val=""/>
+      <w:lvlJc w:val="left"/>
+      <w:pPr>
+        <w:ind w:left="2160" w:hanging="360"/>
+      </w:pPr>
+      <w:rPr>
+        <w:rFonts w:ascii="Wingdings" w:hAnsi="Wingdings" w:hint="default"/>
+      </w:rPr>
+    </w:lvl>
+    <w:lvl w:ilvl="3" w:tplc="10090001" w:tentative="1">
+      <w:start w:val="1"/>
+      <w:numFmt w:val="bullet"/>
+      <w:lvlText w:val=""/>
+      <w:lvlJc w:val="left"/>
+      <w:pPr>
+        <w:ind w:left="2880" w:hanging="360"/>
+      </w:pPr>
+      <w:rPr>
+        <w:rFonts w:ascii="Symbol" w:hAnsi="Symbol" w:hint="default"/>
+      </w:rPr>
+    </w:lvl>
+    <w:lvl w:ilvl="4" w:tplc="10090003" w:tentative="1">
+      <w:start w:val="1"/>
+      <w:numFmt w:val="bullet"/>
+      <w:lvlText w:val="o"/>
+      <w:lvlJc w:val="left"/>
+      <w:pPr>
+        <w:ind w:left="3600" w:hanging="360"/>
+      </w:pPr>
+      <w:rPr>
+        <w:rFonts w:ascii="Courier New" w:hAnsi="Courier New" w:cs="Courier New" w:hint="default"/>
+      </w:rPr>
+    </w:lvl>
+    <w:lvl w:ilvl="5" w:tplc="10090005" w:tentative="1">
+      <w:start w:val="1"/>
+      <w:numFmt w:val="bullet"/>
+      <w:lvlText w:val=""/>
+      <w:lvlJc w:val="left"/>
+      <w:pPr>
+        <w:ind w:left="4320" w:hanging="360"/>
+      </w:pPr>
+      <w:rPr>
+        <w:rFonts w:ascii="Wingdings" w:hAnsi="Wingdings" w:hint="default"/>
+      </w:rPr>
+    </w:lvl>
+    <w:lvl w:ilvl="6" w:tplc="10090001" w:tentative="1">
+      <w:start w:val="1"/>
+      <w:numFmt w:val="bullet"/>
+      <w:lvlText w:val=""/>
+      <w:lvlJc w:val="left"/>
+      <w:pPr>
+        <w:ind w:left="5040" w:hanging="360"/>
+      </w:pPr>
+      <w:rPr>
+        <w:rFonts w:ascii="Symbol" w:hAnsi="Symbol" w:hint="default"/>
+      </w:rPr>
+    </w:lvl>
+    <w:lvl w:ilvl="7" w:tplc="10090003" w:tentative="1">
+      <w:start w:val="1"/>
+      <w:numFmt w:val="bullet"/>
+      <w:lvlText w:val="o"/>
+      <w:lvlJc w:val="left"/>
+      <w:pPr>
+        <w:ind w:left="5760" w:hanging="360"/>
+      </w:pPr>
+      <w:rPr>
+        <w:rFonts w:ascii="Courier New" w:hAnsi="Courier New" w:cs="Courier New" w:hint="default"/>
+      </w:rPr>
+    </w:lvl>
+    <w:lvl w:ilvl="8" w:tplc="10090005" w:tentative="1">
+      <w:start w:val="1"/>
+      <w:numFmt w:val="bullet"/>
+      <w:lvlText w:val=""/>
+      <w:lvlJc w:val="left"/>
+      <w:pPr>
+        <w:ind w:left="6480" w:hanging="360"/>
+      </w:pPr>
+      <w:rPr>
+        <w:rFonts w:ascii="Wingdings" w:hAnsi="Wingdings" w:hint="default"/>
+      </w:rPr>
+    </w:lvl>
+  </w:abstractNum>
+  <w:abstractNum w:abstractNumId="14" w15:restartNumberingAfterBreak="0">
     <w:nsid w:val="65763416"/>
     <w:multiLevelType w:val="hybridMultilevel"/>
     <w:tmpl w:val="DA6C1E48"/>
@@ -5154,7 +6459,7 @@
       </w:rPr>
     </w:lvl>
   </w:abstractNum>
-  <w:abstractNum w:abstractNumId="10" w15:restartNumberingAfterBreak="0">
+  <w:abstractNum w:abstractNumId="15" w15:restartNumberingAfterBreak="0">
     <w:nsid w:val="6AF800D6"/>
     <w:multiLevelType w:val="hybridMultilevel"/>
     <w:tmpl w:val="88907234"/>
@@ -5267,7 +6572,120 @@
       </w:rPr>
     </w:lvl>
   </w:abstractNum>
-  <w:abstractNum w:abstractNumId="11" w15:restartNumberingAfterBreak="0">
+  <w:abstractNum w:abstractNumId="16" w15:restartNumberingAfterBreak="0">
+    <w:nsid w:val="6C5C6588"/>
+    <w:multiLevelType w:val="hybridMultilevel"/>
+    <w:tmpl w:val="BE540C94"/>
+    <w:lvl w:ilvl="0" w:tplc="10090001">
+      <w:start w:val="1"/>
+      <w:numFmt w:val="bullet"/>
+      <w:lvlText w:val=""/>
+      <w:lvlJc w:val="left"/>
+      <w:pPr>
+        <w:ind w:left="720" w:hanging="360"/>
+      </w:pPr>
+      <w:rPr>
+        <w:rFonts w:ascii="Symbol" w:hAnsi="Symbol" w:hint="default"/>
+      </w:rPr>
+    </w:lvl>
+    <w:lvl w:ilvl="1" w:tplc="10090003" w:tentative="1">
+      <w:start w:val="1"/>
+      <w:numFmt w:val="bullet"/>
+      <w:lvlText w:val="o"/>
+      <w:lvlJc w:val="left"/>
+      <w:pPr>
+        <w:ind w:left="1440" w:hanging="360"/>
+      </w:pPr>
+      <w:rPr>
+        <w:rFonts w:ascii="Courier New" w:hAnsi="Courier New" w:cs="Courier New" w:hint="default"/>
+      </w:rPr>
+    </w:lvl>
+    <w:lvl w:ilvl="2" w:tplc="10090005" w:tentative="1">
+      <w:start w:val="1"/>
+      <w:numFmt w:val="bullet"/>
+      <w:lvlText w:val=""/>
+      <w:lvlJc w:val="left"/>
+      <w:pPr>
+        <w:ind w:left="2160" w:hanging="360"/>
+      </w:pPr>
+      <w:rPr>
+        <w:rFonts w:ascii="Wingdings" w:hAnsi="Wingdings" w:hint="default"/>
+      </w:rPr>
+    </w:lvl>
+    <w:lvl w:ilvl="3" w:tplc="10090001" w:tentative="1">
+      <w:start w:val="1"/>
+      <w:numFmt w:val="bullet"/>
+      <w:lvlText w:val=""/>
+      <w:lvlJc w:val="left"/>
+      <w:pPr>
+        <w:ind w:left="2880" w:hanging="360"/>
+      </w:pPr>
+      <w:rPr>
+        <w:rFonts w:ascii="Symbol" w:hAnsi="Symbol" w:hint="default"/>
+      </w:rPr>
+    </w:lvl>
+    <w:lvl w:ilvl="4" w:tplc="10090003" w:tentative="1">
+      <w:start w:val="1"/>
+      <w:numFmt w:val="bullet"/>
+      <w:lvlText w:val="o"/>
+      <w:lvlJc w:val="left"/>
+      <w:pPr>
+        <w:ind w:left="3600" w:hanging="360"/>
+      </w:pPr>
+      <w:rPr>
+        <w:rFonts w:ascii="Courier New" w:hAnsi="Courier New" w:cs="Courier New" w:hint="default"/>
+      </w:rPr>
+    </w:lvl>
+    <w:lvl w:ilvl="5" w:tplc="10090005" w:tentative="1">
+      <w:start w:val="1"/>
+      <w:numFmt w:val="bullet"/>
+      <w:lvlText w:val=""/>
+      <w:lvlJc w:val="left"/>
+      <w:pPr>
+        <w:ind w:left="4320" w:hanging="360"/>
+      </w:pPr>
+      <w:rPr>
+        <w:rFonts w:ascii="Wingdings" w:hAnsi="Wingdings" w:hint="default"/>
+      </w:rPr>
+    </w:lvl>
+    <w:lvl w:ilvl="6" w:tplc="10090001" w:tentative="1">
+      <w:start w:val="1"/>
+      <w:numFmt w:val="bullet"/>
+      <w:lvlText w:val=""/>
+      <w:lvlJc w:val="left"/>
+      <w:pPr>
+        <w:ind w:left="5040" w:hanging="360"/>
+      </w:pPr>
+      <w:rPr>
+        <w:rFonts w:ascii="Symbol" w:hAnsi="Symbol" w:hint="default"/>
+      </w:rPr>
+    </w:lvl>
+    <w:lvl w:ilvl="7" w:tplc="10090003" w:tentative="1">
+      <w:start w:val="1"/>
+      <w:numFmt w:val="bullet"/>
+      <w:lvlText w:val="o"/>
+      <w:lvlJc w:val="left"/>
+      <w:pPr>
+        <w:ind w:left="5760" w:hanging="360"/>
+      </w:pPr>
+      <w:rPr>
+        <w:rFonts w:ascii="Courier New" w:hAnsi="Courier New" w:cs="Courier New" w:hint="default"/>
+      </w:rPr>
+    </w:lvl>
+    <w:lvl w:ilvl="8" w:tplc="10090005" w:tentative="1">
+      <w:start w:val="1"/>
+      <w:numFmt w:val="bullet"/>
+      <w:lvlText w:val=""/>
+      <w:lvlJc w:val="left"/>
+      <w:pPr>
+        <w:ind w:left="6480" w:hanging="360"/>
+      </w:pPr>
+      <w:rPr>
+        <w:rFonts w:ascii="Wingdings" w:hAnsi="Wingdings" w:hint="default"/>
+      </w:rPr>
+    </w:lvl>
+  </w:abstractNum>
+  <w:abstractNum w:abstractNumId="17" w15:restartNumberingAfterBreak="0">
     <w:nsid w:val="6D7D1590"/>
     <w:multiLevelType w:val="multilevel"/>
     <w:tmpl w:val="B9881524"/>
@@ -5381,47 +6799,181 @@
       </w:pPr>
     </w:lvl>
   </w:abstractNum>
+  <w:abstractNum w:abstractNumId="18" w15:restartNumberingAfterBreak="0">
+    <w:nsid w:val="70D276FB"/>
+    <w:multiLevelType w:val="hybridMultilevel"/>
+    <w:tmpl w:val="994452B6"/>
+    <w:lvl w:ilvl="0" w:tplc="10090001">
+      <w:start w:val="1"/>
+      <w:numFmt w:val="bullet"/>
+      <w:lvlText w:val=""/>
+      <w:lvlJc w:val="left"/>
+      <w:pPr>
+        <w:ind w:left="720" w:hanging="360"/>
+      </w:pPr>
+      <w:rPr>
+        <w:rFonts w:ascii="Symbol" w:hAnsi="Symbol" w:hint="default"/>
+      </w:rPr>
+    </w:lvl>
+    <w:lvl w:ilvl="1" w:tplc="10090003" w:tentative="1">
+      <w:start w:val="1"/>
+      <w:numFmt w:val="bullet"/>
+      <w:lvlText w:val="o"/>
+      <w:lvlJc w:val="left"/>
+      <w:pPr>
+        <w:ind w:left="1440" w:hanging="360"/>
+      </w:pPr>
+      <w:rPr>
+        <w:rFonts w:ascii="Courier New" w:hAnsi="Courier New" w:cs="Courier New" w:hint="default"/>
+      </w:rPr>
+    </w:lvl>
+    <w:lvl w:ilvl="2" w:tplc="10090005" w:tentative="1">
+      <w:start w:val="1"/>
+      <w:numFmt w:val="bullet"/>
+      <w:lvlText w:val=""/>
+      <w:lvlJc w:val="left"/>
+      <w:pPr>
+        <w:ind w:left="2160" w:hanging="360"/>
+      </w:pPr>
+      <w:rPr>
+        <w:rFonts w:ascii="Wingdings" w:hAnsi="Wingdings" w:hint="default"/>
+      </w:rPr>
+    </w:lvl>
+    <w:lvl w:ilvl="3" w:tplc="10090001" w:tentative="1">
+      <w:start w:val="1"/>
+      <w:numFmt w:val="bullet"/>
+      <w:lvlText w:val=""/>
+      <w:lvlJc w:val="left"/>
+      <w:pPr>
+        <w:ind w:left="2880" w:hanging="360"/>
+      </w:pPr>
+      <w:rPr>
+        <w:rFonts w:ascii="Symbol" w:hAnsi="Symbol" w:hint="default"/>
+      </w:rPr>
+    </w:lvl>
+    <w:lvl w:ilvl="4" w:tplc="10090003" w:tentative="1">
+      <w:start w:val="1"/>
+      <w:numFmt w:val="bullet"/>
+      <w:lvlText w:val="o"/>
+      <w:lvlJc w:val="left"/>
+      <w:pPr>
+        <w:ind w:left="3600" w:hanging="360"/>
+      </w:pPr>
+      <w:rPr>
+        <w:rFonts w:ascii="Courier New" w:hAnsi="Courier New" w:cs="Courier New" w:hint="default"/>
+      </w:rPr>
+    </w:lvl>
+    <w:lvl w:ilvl="5" w:tplc="10090005" w:tentative="1">
+      <w:start w:val="1"/>
+      <w:numFmt w:val="bullet"/>
+      <w:lvlText w:val=""/>
+      <w:lvlJc w:val="left"/>
+      <w:pPr>
+        <w:ind w:left="4320" w:hanging="360"/>
+      </w:pPr>
+      <w:rPr>
+        <w:rFonts w:ascii="Wingdings" w:hAnsi="Wingdings" w:hint="default"/>
+      </w:rPr>
+    </w:lvl>
+    <w:lvl w:ilvl="6" w:tplc="10090001" w:tentative="1">
+      <w:start w:val="1"/>
+      <w:numFmt w:val="bullet"/>
+      <w:lvlText w:val=""/>
+      <w:lvlJc w:val="left"/>
+      <w:pPr>
+        <w:ind w:left="5040" w:hanging="360"/>
+      </w:pPr>
+      <w:rPr>
+        <w:rFonts w:ascii="Symbol" w:hAnsi="Symbol" w:hint="default"/>
+      </w:rPr>
+    </w:lvl>
+    <w:lvl w:ilvl="7" w:tplc="10090003" w:tentative="1">
+      <w:start w:val="1"/>
+      <w:numFmt w:val="bullet"/>
+      <w:lvlText w:val="o"/>
+      <w:lvlJc w:val="left"/>
+      <w:pPr>
+        <w:ind w:left="5760" w:hanging="360"/>
+      </w:pPr>
+      <w:rPr>
+        <w:rFonts w:ascii="Courier New" w:hAnsi="Courier New" w:cs="Courier New" w:hint="default"/>
+      </w:rPr>
+    </w:lvl>
+    <w:lvl w:ilvl="8" w:tplc="10090005" w:tentative="1">
+      <w:start w:val="1"/>
+      <w:numFmt w:val="bullet"/>
+      <w:lvlText w:val=""/>
+      <w:lvlJc w:val="left"/>
+      <w:pPr>
+        <w:ind w:left="6480" w:hanging="360"/>
+      </w:pPr>
+      <w:rPr>
+        <w:rFonts w:ascii="Wingdings" w:hAnsi="Wingdings" w:hint="default"/>
+      </w:rPr>
+    </w:lvl>
+  </w:abstractNum>
   <w:num w:numId="1" w16cid:durableId="672493255">
+    <w:abstractNumId w:val="9"/>
+  </w:num>
+  <w:num w:numId="2" w16cid:durableId="1626812309">
+    <w:abstractNumId w:val="9"/>
+  </w:num>
+  <w:num w:numId="3" w16cid:durableId="716785031">
+    <w:abstractNumId w:val="9"/>
+  </w:num>
+  <w:num w:numId="4" w16cid:durableId="951284882">
+    <w:abstractNumId w:val="17"/>
+  </w:num>
+  <w:num w:numId="5" w16cid:durableId="1950164105">
+    <w:abstractNumId w:val="11"/>
+  </w:num>
+  <w:num w:numId="6" w16cid:durableId="163327631">
+    <w:abstractNumId w:val="14"/>
+  </w:num>
+  <w:num w:numId="7" w16cid:durableId="679087502">
+    <w:abstractNumId w:val="3"/>
+  </w:num>
+  <w:num w:numId="8" w16cid:durableId="1471556523">
+    <w:abstractNumId w:val="15"/>
+  </w:num>
+  <w:num w:numId="9" w16cid:durableId="1565749884">
+    <w:abstractNumId w:val="10"/>
+  </w:num>
+  <w:num w:numId="10" w16cid:durableId="509219453">
+    <w:abstractNumId w:val="1"/>
+  </w:num>
+  <w:num w:numId="11" w16cid:durableId="1143235534">
+    <w:abstractNumId w:val="6"/>
+  </w:num>
+  <w:num w:numId="12" w16cid:durableId="826750393">
+    <w:abstractNumId w:val="7"/>
+  </w:num>
+  <w:num w:numId="13" w16cid:durableId="374358275">
+    <w:abstractNumId w:val="12"/>
+  </w:num>
+  <w:num w:numId="14" w16cid:durableId="744574165">
+    <w:abstractNumId w:val="2"/>
+  </w:num>
+  <w:num w:numId="15" w16cid:durableId="707530471">
+    <w:abstractNumId w:val="13"/>
+  </w:num>
+  <w:num w:numId="16" w16cid:durableId="443689865">
+    <w:abstractNumId w:val="8"/>
+  </w:num>
+  <w:num w:numId="17" w16cid:durableId="1110511163">
     <w:abstractNumId w:val="5"/>
   </w:num>
-  <w:num w:numId="2" w16cid:durableId="1626812309">
-    <w:abstractNumId w:val="5"/>
+  <w:num w:numId="18" w16cid:durableId="889028555">
+    <w:abstractNumId w:val="16"/>
   </w:num>
-  <w:num w:numId="3" w16cid:durableId="716785031">
-    <w:abstractNumId w:val="5"/>
+  <w:num w:numId="19" w16cid:durableId="496968128">
+    <w:abstractNumId w:val="18"/>
   </w:num>
-  <w:num w:numId="4" w16cid:durableId="951284882">
-    <w:abstractNumId w:val="11"/>
-  </w:num>
-  <w:num w:numId="5" w16cid:durableId="1950164105">
-    <w:abstractNumId w:val="7"/>
-  </w:num>
-  <w:num w:numId="6" w16cid:durableId="163327631">
-    <w:abstractNumId w:val="9"/>
-  </w:num>
-  <w:num w:numId="7" w16cid:durableId="679087502">
-    <w:abstractNumId w:val="2"/>
-  </w:num>
-  <w:num w:numId="8" w16cid:durableId="1471556523">
-    <w:abstractNumId w:val="10"/>
-  </w:num>
-  <w:num w:numId="9" w16cid:durableId="1565749884">
-    <w:abstractNumId w:val="6"/>
-  </w:num>
-  <w:num w:numId="10" w16cid:durableId="509219453">
+  <w:num w:numId="20" w16cid:durableId="160125103">
     <w:abstractNumId w:val="0"/>
   </w:num>
-  <w:num w:numId="11" w16cid:durableId="1143235534">
-    <w:abstractNumId w:val="3"/>
-  </w:num>
-  <w:num w:numId="12" w16cid:durableId="826750393">
+  <w:num w:numId="21" w16cid:durableId="1892837033">
     <w:abstractNumId w:val="4"/>
-  </w:num>
-  <w:num w:numId="13" w16cid:durableId="374358275">
-    <w:abstractNumId w:val="8"/>
-  </w:num>
-  <w:num w:numId="14" w16cid:durableId="744574165">
-    <w:abstractNumId w:val="1"/>
   </w:num>
 </w:numbering>
 </file>

</xml_diff>